<commit_message>
Close queryTable9 and end-date issues (confirmed in Excel); PRD v1.8; handover points at UAT
Co-Authored-By: Claude Opus 5.5 <noreply@anthropic.com>
Claude-Session: https://claude.ai/code/session_017h8ADiUSHW7ex1hhB7iQGv
</commit_message>
<xml_diff>
--- a/docs/v0.9_Install_and_User_Guide.docx
+++ b/docs/v0.9_Install_and_User_Guide.docx
@@ -42,13 +42,7 @@
         <w:t xml:space="preserve">Date:</w:t>
       </w:r>
       <w:r>
-        <w:t xml:space="preserve"> </w:t>
-      </w:r>
-      <w:r>
-        <w:t xml:space="preserve">11 October 2026</w:t>
-      </w:r>
-      <w:r>
-        <w:t xml:space="preserve"> </w:t>
+        <w:t xml:space="preserve"> 11 October 2026 </w:t>
       </w:r>
       <w:r>
         <w:rPr>
@@ -58,10 +52,7 @@
         <w:t xml:space="preserve">Status:</w:t>
       </w:r>
       <w:r>
-        <w:t xml:space="preserve"> </w:t>
-      </w:r>
-      <w:r>
-        <w:t xml:space="preserve">working copy for testing (UAT). The stable v0.8 file stays as it is; don’t overwrite it.</w:t>
+        <w:t xml:space="preserve"> working copy for testing (UAT). The stable v0.8 file stays as it is; don’t overwrite it.</w:t>
       </w:r>
     </w:p>
     <w:p>
@@ -280,10 +271,7 @@
               <w:t xml:space="preserve">docs/v0.9_Install_and_User_Guide</w:t>
             </w:r>
             <w:r>
-              <w:t xml:space="preserve"> </w:t>
-            </w:r>
-            <w:r>
-              <w:t xml:space="preserve">(.docx and .md)</w:t>
+              <w:t xml:space="preserve"> (.docx and .md)</w:t>
             </w:r>
           </w:p>
         </w:tc>
@@ -324,7 +312,7 @@
               <w:jc w:val="left"/>
             </w:pPr>
             <w:r>
-              <w:t xml:space="preserve">The 15 acceptance tests, with expected figures.</w:t>
+              <w:t xml:space="preserve">The 16 acceptance tests, with expected figures.</w:t>
             </w:r>
           </w:p>
         </w:tc>
@@ -382,7 +370,7 @@
               <w:jc w:val="left"/>
             </w:pPr>
             <w:r>
-              <w:t xml:space="preserve">Build log, technical specification, PRD v1.7.</w:t>
+              <w:t xml:space="preserve">Build log, technical specification, PRD v1.8, incident logs.</w:t>
             </w:r>
           </w:p>
         </w:tc>
@@ -402,10 +390,7 @@
               <w:t xml:space="preserve">CLAUDE.md</w:t>
             </w:r>
             <w:r>
-              <w:t xml:space="preserve">,</w:t>
-            </w:r>
-            <w:r>
-              <w:t xml:space="preserve"> </w:t>
+              <w:t xml:space="preserve">, </w:t>
             </w:r>
             <w:r>
               <w:rPr>
@@ -448,10 +433,7 @@
         <w:pStyle w:val="Compact"/>
       </w:pPr>
       <w:r>
-        <w:t xml:space="preserve">Use</w:t>
-      </w:r>
-      <w:r>
-        <w:t xml:space="preserve"> </w:t>
+        <w:t xml:space="preserve">Use </w:t>
       </w:r>
       <w:r>
         <w:rPr>
@@ -461,10 +443,7 @@
         <w:t xml:space="preserve">desktop Excel for Windows</w:t>
       </w:r>
       <w:r>
-        <w:t xml:space="preserve"> </w:t>
-      </w:r>
-      <w:r>
-        <w:t xml:space="preserve">(Microsoft 365). The macros don’t run in Excel for the web or in Excel for Mac.</w:t>
+        <w:t xml:space="preserve"> (Microsoft 365). The macros don’t run in Excel for the web or in Excel for Mac.</w:t>
       </w:r>
     </w:p>
     <w:p>
@@ -495,10 +474,7 @@
         <w:t xml:space="preserve">Don’t</w:t>
       </w:r>
       <w:r>
-        <w:t xml:space="preserve"> </w:t>
-      </w:r>
-      <w:r>
-        <w:t xml:space="preserve">open or save the workbook in LibreOffice, Google Sheets, Excel for the web, or Excel on a phone or tablet. Saving it there can remove the Power Query connections.</w:t>
+        <w:t xml:space="preserve"> open or save the workbook in LibreOffice, Google Sheets, Excel for the web, or Excel on a phone or tablet. Saving it there can remove the Power Query connections.</w:t>
       </w:r>
     </w:p>
     <w:p>
@@ -510,10 +486,7 @@
         <w:pStyle w:val="Compact"/>
       </w:pPr>
       <w:r>
-        <w:t xml:space="preserve">Check the file first: its SHA-256 is in</w:t>
-      </w:r>
-      <w:r>
-        <w:t xml:space="preserve"> </w:t>
+        <w:t xml:space="preserve">Check the file first: its SHA-256 is in </w:t>
       </w:r>
       <w:r>
         <w:rPr>
@@ -522,13 +495,7 @@
         <w:t xml:space="preserve">README_FIRST.txt</w:t>
       </w:r>
       <w:r>
-        <w:t xml:space="preserve"> </w:t>
-      </w:r>
-      <w:r>
-        <w:t xml:space="preserve">(PowerShell:</w:t>
-      </w:r>
-      <w:r>
-        <w:t xml:space="preserve"> </w:t>
+        <w:t xml:space="preserve"> (PowerShell: </w:t>
       </w:r>
       <w:r>
         <w:rPr>
@@ -556,10 +523,7 @@
         <w:t xml:space="preserve">If Excel says it found a problem and offers to repair the file, click No and report it.</w:t>
       </w:r>
       <w:r>
-        <w:t xml:space="preserve"> </w:t>
-      </w:r>
-      <w:r>
-        <w:t xml:space="preserve">Don’t save a repaired copy.</w:t>
+        <w:t xml:space="preserve"> Don’t save a repaired copy.</w:t>
       </w:r>
     </w:p>
     <w:p>
@@ -571,10 +535,7 @@
         <w:pStyle w:val="Compact"/>
       </w:pPr>
       <w:r>
-        <w:t xml:space="preserve">Work on a</w:t>
-      </w:r>
-      <w:r>
-        <w:t xml:space="preserve"> </w:t>
+        <w:t xml:space="preserve">Work on a </w:t>
       </w:r>
       <w:r>
         <w:rPr>
@@ -584,10 +545,7 @@
         <w:t xml:space="preserve">local copy</w:t>
       </w:r>
       <w:r>
-        <w:t xml:space="preserve"> </w:t>
-      </w:r>
-      <w:r>
-        <w:t xml:space="preserve">first, for example in Documents. Move it to SharePoint only after testing.</w:t>
+        <w:t xml:space="preserve"> first, for example in Documents. Move it to SharePoint only after testing.</w:t>
       </w:r>
     </w:p>
     <w:bookmarkEnd w:id="21"/>
@@ -639,10 +597,7 @@
         <w:pStyle w:val="Compact"/>
       </w:pPr>
       <w:r>
-        <w:t xml:space="preserve">Right-click</w:t>
-      </w:r>
-      <w:r>
-        <w:t xml:space="preserve"> </w:t>
+        <w:t xml:space="preserve">Right-click </w:t>
       </w:r>
       <w:r>
         <w:rPr>
@@ -651,13 +606,7 @@
         <w:t xml:space="preserve">..._v0.9_working.xlsm</w:t>
       </w:r>
       <w:r>
-        <w:t xml:space="preserve"> </w:t>
-      </w:r>
-      <w:r>
-        <w:t xml:space="preserve">and choose</w:t>
-      </w:r>
-      <w:r>
-        <w:t xml:space="preserve"> </w:t>
+        <w:t xml:space="preserve"> and choose </w:t>
       </w:r>
       <w:r>
         <w:rPr>
@@ -679,37 +628,17 @@
         <w:pStyle w:val="Compact"/>
       </w:pPr>
       <w:r>
-        <w:t xml:space="preserve">If you see</w:t>
-      </w:r>
-      <w:r>
-        <w:t xml:space="preserve"> </w:t>
-      </w:r>
-      <w:r>
-        <w:rPr>
-          <w:bCs/>
-          <w:b/>
-        </w:rPr>
-        <w:t xml:space="preserve">“</w:t>
-      </w:r>
-      <w:r>
-        <w:rPr>
-          <w:bCs/>
-          <w:b/>
-        </w:rPr>
-        <w:t xml:space="preserve">This file came from another computer…</w:t>
-      </w:r>
-      <w:r>
-        <w:rPr>
-          <w:bCs/>
-          <w:b/>
-        </w:rPr>
-        <w:t xml:space="preserve">”</w:t>
-      </w:r>
-      <w:r>
-        <w:t xml:space="preserve">, tick</w:t>
-      </w:r>
-      <w:r>
-        <w:t xml:space="preserve"> </w:t>
+        <w:t xml:space="preserve">If you see </w:t>
+      </w:r>
+      <w:r>
+        <w:rPr>
+          <w:bCs/>
+          <w:b/>
+        </w:rPr>
+        <w:t xml:space="preserve">“This file came from another computer…”</w:t>
+      </w:r>
+      <w:r>
+        <w:t xml:space="preserve">, tick </w:t>
       </w:r>
       <w:r>
         <w:rPr>
@@ -719,13 +648,7 @@
         <w:t xml:space="preserve">Unblock</w:t>
       </w:r>
       <w:r>
-        <w:t xml:space="preserve"> </w:t>
-      </w:r>
-      <w:r>
-        <w:t xml:space="preserve">and click</w:t>
-      </w:r>
-      <w:r>
-        <w:t xml:space="preserve"> </w:t>
+        <w:t xml:space="preserve"> and click </w:t>
       </w:r>
       <w:r>
         <w:rPr>
@@ -757,10 +680,7 @@
         <w:pStyle w:val="Compact"/>
       </w:pPr>
       <w:r>
-        <w:t xml:space="preserve">Double-click the</w:t>
-      </w:r>
-      <w:r>
-        <w:t xml:space="preserve"> </w:t>
+        <w:t xml:space="preserve">Double-click the </w:t>
       </w:r>
       <w:r>
         <w:rPr>
@@ -769,10 +689,7 @@
         <w:t xml:space="preserve">.xlsm</w:t>
       </w:r>
       <w:r>
-        <w:t xml:space="preserve"> </w:t>
-      </w:r>
-      <w:r>
-        <w:t xml:space="preserve">to open it in desktop Excel.</w:t>
+        <w:t xml:space="preserve"> to open it in desktop Excel.</w:t>
       </w:r>
     </w:p>
     <w:p>
@@ -784,10 +701,7 @@
         <w:pStyle w:val="Compact"/>
       </w:pPr>
       <w:r>
-        <w:t xml:space="preserve">If a yellow bar says</w:t>
-      </w:r>
-      <w:r>
-        <w:t xml:space="preserve"> </w:t>
+        <w:t xml:space="preserve">If a yellow bar says </w:t>
       </w:r>
       <w:r>
         <w:rPr>
@@ -831,10 +745,7 @@
         <w:pStyle w:val="Compact"/>
       </w:pPr>
       <w:r>
-        <w:t xml:space="preserve">Press</w:t>
-      </w:r>
-      <w:r>
-        <w:t xml:space="preserve"> </w:t>
+        <w:t xml:space="preserve">Press </w:t>
       </w:r>
       <w:r>
         <w:rPr>
@@ -856,10 +767,7 @@
         <w:pStyle w:val="Compact"/>
       </w:pPr>
       <w:r>
-        <w:t xml:space="preserve">If you can’t see the</w:t>
-      </w:r>
-      <w:r>
-        <w:t xml:space="preserve"> </w:t>
+        <w:t xml:space="preserve">If you can’t see the </w:t>
       </w:r>
       <w:r>
         <w:rPr>
@@ -869,13 +777,7 @@
         <w:t xml:space="preserve">Project</w:t>
       </w:r>
       <w:r>
-        <w:t xml:space="preserve"> </w:t>
-      </w:r>
-      <w:r>
-        <w:t xml:space="preserve">pane on the left, press</w:t>
-      </w:r>
-      <w:r>
-        <w:t xml:space="preserve"> </w:t>
+        <w:t xml:space="preserve"> pane on the left, press </w:t>
       </w:r>
       <w:r>
         <w:rPr>
@@ -907,10 +809,7 @@
         <w:pStyle w:val="Compact"/>
       </w:pPr>
       <w:r>
-        <w:t xml:space="preserve">Click</w:t>
-      </w:r>
-      <w:r>
-        <w:t xml:space="preserve"> </w:t>
+        <w:t xml:space="preserve">Click </w:t>
       </w:r>
       <w:r>
         <w:rPr>
@@ -932,10 +831,7 @@
         <w:pStyle w:val="Compact"/>
       </w:pPr>
       <w:r>
-        <w:t xml:space="preserve">Go to the unzipped</w:t>
-      </w:r>
-      <w:r>
-        <w:t xml:space="preserve"> </w:t>
+        <w:t xml:space="preserve">Go to the unzipped </w:t>
       </w:r>
       <w:r>
         <w:rPr>
@@ -944,13 +840,7 @@
         <w:t xml:space="preserve">vba</w:t>
       </w:r>
       <w:r>
-        <w:t xml:space="preserve"> </w:t>
-      </w:r>
-      <w:r>
-        <w:t xml:space="preserve">folder, choose</w:t>
-      </w:r>
-      <w:r>
-        <w:t xml:space="preserve"> </w:t>
+        <w:t xml:space="preserve"> folder, choose </w:t>
       </w:r>
       <w:r>
         <w:rPr>
@@ -961,13 +851,7 @@
         <w:t xml:space="preserve">modTimeline.bas</w:t>
       </w:r>
       <w:r>
-        <w:t xml:space="preserve"> </w:t>
-      </w:r>
-      <w:r>
-        <w:t xml:space="preserve">and click</w:t>
-      </w:r>
-      <w:r>
-        <w:t xml:space="preserve"> </w:t>
+        <w:t xml:space="preserve"> and click </w:t>
       </w:r>
       <w:r>
         <w:rPr>
@@ -989,10 +873,7 @@
         <w:pStyle w:val="Compact"/>
       </w:pPr>
       <w:r>
-        <w:t xml:space="preserve">Repeat for</w:t>
-      </w:r>
-      <w:r>
-        <w:t xml:space="preserve"> </w:t>
+        <w:t xml:space="preserve">Repeat for </w:t>
       </w:r>
       <w:r>
         <w:rPr>
@@ -1003,13 +884,7 @@
         <w:t xml:space="preserve">modStore.bas</w:t>
       </w:r>
       <w:r>
-        <w:t xml:space="preserve"> </w:t>
-      </w:r>
-      <w:r>
-        <w:t xml:space="preserve">and</w:t>
-      </w:r>
-      <w:r>
-        <w:t xml:space="preserve"> </w:t>
+        <w:t xml:space="preserve"> and </w:t>
       </w:r>
       <w:r>
         <w:rPr>
@@ -1032,10 +907,7 @@
         <w:pStyle w:val="Compact"/>
       </w:pPr>
       <w:r>
-        <w:t xml:space="preserve">In the Project pane, under</w:t>
-      </w:r>
-      <w:r>
-        <w:t xml:space="preserve"> </w:t>
+        <w:t xml:space="preserve">In the Project pane, under </w:t>
       </w:r>
       <w:r>
         <w:rPr>
@@ -1045,10 +917,7 @@
         <w:t xml:space="preserve">Modules</w:t>
       </w:r>
       <w:r>
-        <w:t xml:space="preserve">, you should now see</w:t>
-      </w:r>
-      <w:r>
-        <w:t xml:space="preserve"> </w:t>
+        <w:t xml:space="preserve">, you should now see </w:t>
       </w:r>
       <w:r>
         <w:rPr>
@@ -1057,13 +926,7 @@
         <w:t xml:space="preserve">Module1</w:t>
       </w:r>
       <w:r>
-        <w:t xml:space="preserve"> </w:t>
-      </w:r>
-      <w:r>
-        <w:t xml:space="preserve">(already there),</w:t>
-      </w:r>
-      <w:r>
-        <w:t xml:space="preserve"> </w:t>
+        <w:t xml:space="preserve"> (already there), </w:t>
       </w:r>
       <w:r>
         <w:rPr>
@@ -1072,10 +935,7 @@
         <w:t xml:space="preserve">modTimeline</w:t>
       </w:r>
       <w:r>
-        <w:t xml:space="preserve">,</w:t>
-      </w:r>
-      <w:r>
-        <w:t xml:space="preserve"> </w:t>
+        <w:t xml:space="preserve">, </w:t>
       </w:r>
       <w:r>
         <w:rPr>
@@ -1084,13 +944,7 @@
         <w:t xml:space="preserve">modStore</w:t>
       </w:r>
       <w:r>
-        <w:t xml:space="preserve"> </w:t>
-      </w:r>
-      <w:r>
-        <w:t xml:space="preserve">and</w:t>
-      </w:r>
-      <w:r>
-        <w:t xml:space="preserve"> </w:t>
+        <w:t xml:space="preserve"> and </w:t>
       </w:r>
       <w:r>
         <w:rPr>
@@ -1107,10 +961,7 @@
         <w:pStyle w:val="BlockText"/>
       </w:pPr>
       <w:r>
-        <w:t xml:space="preserve">Don’t double-click the</w:t>
-      </w:r>
-      <w:r>
-        <w:t xml:space="preserve"> </w:t>
+        <w:t xml:space="preserve">Don’t double-click the </w:t>
       </w:r>
       <w:r>
         <w:rPr>
@@ -1119,13 +970,7 @@
         <w:t xml:space="preserve">.bas</w:t>
       </w:r>
       <w:r>
-        <w:t xml:space="preserve"> </w:t>
-      </w:r>
-      <w:r>
-        <w:t xml:space="preserve">files in Windows, and don’t copy and paste them. Use</w:t>
-      </w:r>
-      <w:r>
-        <w:t xml:space="preserve"> </w:t>
+        <w:t xml:space="preserve"> files in Windows, and don’t copy and paste them. Use </w:t>
       </w:r>
       <w:r>
         <w:rPr>
@@ -1157,10 +1002,7 @@
         <w:pStyle w:val="Compact"/>
       </w:pPr>
       <w:r>
-        <w:t xml:space="preserve">In the Project pane, open</w:t>
-      </w:r>
-      <w:r>
-        <w:t xml:space="preserve"> </w:t>
+        <w:t xml:space="preserve">In the Project pane, open </w:t>
       </w:r>
       <w:r>
         <w:rPr>
@@ -1170,13 +1012,7 @@
         <w:t xml:space="preserve">Microsoft Excel Objects</w:t>
       </w:r>
       <w:r>
-        <w:t xml:space="preserve"> </w:t>
-      </w:r>
-      <w:r>
-        <w:t xml:space="preserve">and double-click</w:t>
-      </w:r>
-      <w:r>
-        <w:t xml:space="preserve"> </w:t>
+        <w:t xml:space="preserve"> and double-click </w:t>
       </w:r>
       <w:r>
         <w:rPr>
@@ -1198,10 +1034,7 @@
         <w:pStyle w:val="Compact"/>
       </w:pPr>
       <w:r>
-        <w:t xml:space="preserve">Open</w:t>
-      </w:r>
-      <w:r>
-        <w:t xml:space="preserve"> </w:t>
+        <w:t xml:space="preserve">Open </w:t>
       </w:r>
       <w:r>
         <w:rPr>
@@ -1210,13 +1043,7 @@
         <w:t xml:space="preserve">vba/ThisWorkbook_code.txt</w:t>
       </w:r>
       <w:r>
-        <w:t xml:space="preserve"> </w:t>
-      </w:r>
-      <w:r>
-        <w:t xml:space="preserve">in Notepad. Copy the three lines from</w:t>
-      </w:r>
-      <w:r>
-        <w:t xml:space="preserve"> </w:t>
+        <w:t xml:space="preserve"> in Notepad. Copy the three lines from </w:t>
       </w:r>
       <w:r>
         <w:rPr>
@@ -1225,13 +1052,7 @@
         <w:t xml:space="preserve">Private Sub Workbook_Open()</w:t>
       </w:r>
       <w:r>
-        <w:t xml:space="preserve"> </w:t>
-      </w:r>
-      <w:r>
-        <w:t xml:space="preserve">to</w:t>
-      </w:r>
-      <w:r>
-        <w:t xml:space="preserve"> </w:t>
+        <w:t xml:space="preserve"> to </w:t>
       </w:r>
       <w:r>
         <w:rPr>
@@ -1282,10 +1103,7 @@
         <w:pStyle w:val="Compact"/>
       </w:pPr>
       <w:r>
-        <w:t xml:space="preserve">In the VBA editor, click</w:t>
-      </w:r>
-      <w:r>
-        <w:t xml:space="preserve"> </w:t>
+        <w:t xml:space="preserve">In the VBA editor, click </w:t>
       </w:r>
       <w:r>
         <w:rPr>
@@ -1360,10 +1178,7 @@
         <w:pStyle w:val="Compact"/>
       </w:pPr>
       <w:r>
-        <w:t xml:space="preserve">In Excel, press</w:t>
-      </w:r>
-      <w:r>
-        <w:t xml:space="preserve"> </w:t>
+        <w:t xml:space="preserve">In Excel, press </w:t>
       </w:r>
       <w:r>
         <w:rPr>
@@ -1373,10 +1188,7 @@
         <w:t xml:space="preserve">Alt + F8</w:t>
       </w:r>
       <w:r>
-        <w:t xml:space="preserve">, choose</w:t>
-      </w:r>
-      <w:r>
-        <w:t xml:space="preserve"> </w:t>
+        <w:t xml:space="preserve">, choose </w:t>
       </w:r>
       <w:r>
         <w:rPr>
@@ -1387,13 +1199,7 @@
         <w:t xml:space="preserve">Setup_Dashboard_v09</w:t>
       </w:r>
       <w:r>
-        <w:t xml:space="preserve"> </w:t>
-      </w:r>
-      <w:r>
-        <w:t xml:space="preserve">and click</w:t>
-      </w:r>
-      <w:r>
-        <w:t xml:space="preserve"> </w:t>
+        <w:t xml:space="preserve"> and click </w:t>
       </w:r>
       <w:r>
         <w:rPr>
@@ -1415,31 +1221,14 @@
         <w:pStyle w:val="Compact"/>
       </w:pPr>
       <w:r>
-        <w:t xml:space="preserve">You should see</w:t>
-      </w:r>
-      <w:r>
-        <w:t xml:space="preserve"> </w:t>
-      </w:r>
-      <w:r>
-        <w:rPr>
-          <w:bCs/>
-          <w:b/>
-        </w:rPr>
-        <w:t xml:space="preserve">“</w:t>
-      </w:r>
-      <w:r>
-        <w:rPr>
-          <w:bCs/>
-          <w:b/>
-        </w:rPr>
-        <w:t xml:space="preserve">Setup complete.</w:t>
-      </w:r>
-      <w:r>
-        <w:rPr>
-          <w:bCs/>
-          <w:b/>
-        </w:rPr>
-        <w:t xml:space="preserve">”</w:t>
+        <w:t xml:space="preserve">You should see </w:t>
+      </w:r>
+      <w:r>
+        <w:rPr>
+          <w:bCs/>
+          <w:b/>
+        </w:rPr>
+        <w:t xml:space="preserve">“Setup complete.”</w:t>
       </w:r>
     </w:p>
     <w:p>
@@ -1451,10 +1240,7 @@
         <w:pStyle w:val="Compact"/>
       </w:pPr>
       <w:r>
-        <w:t xml:space="preserve">Four buttons now sit on</w:t>
-      </w:r>
-      <w:r>
-        <w:t xml:space="preserve"> </w:t>
+        <w:t xml:space="preserve">Four buttons now sit on </w:t>
       </w:r>
       <w:r>
         <w:rPr>
@@ -1463,13 +1249,7 @@
         <w:t xml:space="preserve">Main_Dashboard</w:t>
       </w:r>
       <w:r>
-        <w:t xml:space="preserve"> </w:t>
-      </w:r>
-      <w:r>
-        <w:t xml:space="preserve">at E8:F11:</w:t>
-      </w:r>
-      <w:r>
-        <w:t xml:space="preserve"> </w:t>
+        <w:t xml:space="preserve"> at E8:F11: </w:t>
       </w:r>
       <w:r>
         <w:rPr>
@@ -1479,10 +1259,7 @@
         <w:t xml:space="preserve">Load Project</w:t>
       </w:r>
       <w:r>
-        <w:t xml:space="preserve">,</w:t>
-      </w:r>
-      <w:r>
-        <w:t xml:space="preserve"> </w:t>
+        <w:t xml:space="preserve">, </w:t>
       </w:r>
       <w:r>
         <w:rPr>
@@ -1492,10 +1269,7 @@
         <w:t xml:space="preserve">Save Projections</w:t>
       </w:r>
       <w:r>
-        <w:t xml:space="preserve">,</w:t>
-      </w:r>
-      <w:r>
-        <w:t xml:space="preserve"> </w:t>
+        <w:t xml:space="preserve">, </w:t>
       </w:r>
       <w:r>
         <w:rPr>
@@ -1505,13 +1279,7 @@
         <w:t xml:space="preserve">Re-assign unmatched</w:t>
       </w:r>
       <w:r>
-        <w:t xml:space="preserve"> </w:t>
-      </w:r>
-      <w:r>
-        <w:t xml:space="preserve">and</w:t>
-      </w:r>
-      <w:r>
-        <w:t xml:space="preserve"> </w:t>
+        <w:t xml:space="preserve"> and </w:t>
       </w:r>
       <w:r>
         <w:rPr>
@@ -1543,10 +1311,7 @@
         <w:pStyle w:val="Compact"/>
       </w:pPr>
       <w:r>
-        <w:t xml:space="preserve">Click</w:t>
-      </w:r>
-      <w:r>
-        <w:t xml:space="preserve"> </w:t>
+        <w:t xml:space="preserve">Click </w:t>
       </w:r>
       <w:r>
         <w:rPr>
@@ -1556,10 +1321,7 @@
         <w:t xml:space="preserve">File → Save</w:t>
       </w:r>
       <w:r>
-        <w:t xml:space="preserve">. Keep the</w:t>
-      </w:r>
-      <w:r>
-        <w:t xml:space="preserve"> </w:t>
+        <w:t xml:space="preserve">. Keep the </w:t>
       </w:r>
       <w:r>
         <w:rPr>
@@ -1569,13 +1331,7 @@
         <w:t xml:space="preserve">.xlsm</w:t>
       </w:r>
       <w:r>
-        <w:t xml:space="preserve"> </w:t>
-      </w:r>
-      <w:r>
-        <w:t xml:space="preserve">format; if Excel asks about the macro-free format, choose</w:t>
-      </w:r>
-      <w:r>
-        <w:t xml:space="preserve"> </w:t>
+        <w:t xml:space="preserve"> format; if Excel asks about the macro-free format, choose </w:t>
       </w:r>
       <w:r>
         <w:rPr>
@@ -1637,10 +1393,7 @@
         <w:pStyle w:val="Compact"/>
       </w:pPr>
       <w:r>
-        <w:t xml:space="preserve">On</w:t>
-      </w:r>
-      <w:r>
-        <w:t xml:space="preserve"> </w:t>
+        <w:t xml:space="preserve">On </w:t>
       </w:r>
       <w:r>
         <w:rPr>
@@ -1661,10 +1414,7 @@
         <w:pStyle w:val="Compact"/>
       </w:pPr>
       <w:r>
-        <w:t xml:space="preserve">set</w:t>
-      </w:r>
-      <w:r>
-        <w:t xml:space="preserve"> </w:t>
+        <w:t xml:space="preserve">set </w:t>
       </w:r>
       <w:r>
         <w:rPr>
@@ -1674,13 +1424,7 @@
         <w:t xml:space="preserve">C6</w:t>
       </w:r>
       <w:r>
-        <w:t xml:space="preserve"> </w:t>
-      </w:r>
-      <w:r>
-        <w:t xml:space="preserve">to</w:t>
-      </w:r>
-      <w:r>
-        <w:t xml:space="preserve"> </w:t>
+        <w:t xml:space="preserve"> to </w:t>
       </w:r>
       <w:r>
         <w:rPr>
@@ -1690,13 +1434,7 @@
         <w:t xml:space="preserve">Financial Year</w:t>
       </w:r>
       <w:r>
-        <w:t xml:space="preserve"> </w:t>
-      </w:r>
-      <w:r>
-        <w:t xml:space="preserve">or</w:t>
-      </w:r>
-      <w:r>
-        <w:t xml:space="preserve"> </w:t>
+        <w:t xml:space="preserve"> or </w:t>
       </w:r>
       <w:r>
         <w:rPr>
@@ -1718,10 +1456,7 @@
         <w:pStyle w:val="Compact"/>
       </w:pPr>
       <w:r>
-        <w:t xml:space="preserve">pick the</w:t>
-      </w:r>
-      <w:r>
-        <w:t xml:space="preserve"> </w:t>
+        <w:t xml:space="preserve">pick the </w:t>
       </w:r>
       <w:r>
         <w:rPr>
@@ -1731,13 +1466,7 @@
         <w:t xml:space="preserve">Source Project</w:t>
       </w:r>
       <w:r>
-        <w:t xml:space="preserve"> </w:t>
-      </w:r>
-      <w:r>
-        <w:t xml:space="preserve">in</w:t>
-      </w:r>
-      <w:r>
-        <w:t xml:space="preserve"> </w:t>
+        <w:t xml:space="preserve"> in </w:t>
       </w:r>
       <w:r>
         <w:rPr>
@@ -1759,10 +1488,7 @@
         <w:pStyle w:val="Compact"/>
       </w:pPr>
       <w:r>
-        <w:t xml:space="preserve">pick the</w:t>
-      </w:r>
-      <w:r>
-        <w:t xml:space="preserve"> </w:t>
+        <w:t xml:space="preserve">pick the </w:t>
       </w:r>
       <w:r>
         <w:rPr>
@@ -1772,13 +1498,7 @@
         <w:t xml:space="preserve">Main IO</w:t>
       </w:r>
       <w:r>
-        <w:t xml:space="preserve"> </w:t>
-      </w:r>
-      <w:r>
-        <w:t xml:space="preserve">in</w:t>
-      </w:r>
-      <w:r>
-        <w:t xml:space="preserve"> </w:t>
+        <w:t xml:space="preserve"> in </w:t>
       </w:r>
       <w:r>
         <w:rPr>
@@ -1800,10 +1520,7 @@
         <w:pStyle w:val="Compact"/>
       </w:pPr>
       <w:r>
-        <w:t xml:space="preserve">Check that</w:t>
-      </w:r>
-      <w:r>
-        <w:t xml:space="preserve"> </w:t>
+        <w:t xml:space="preserve">Check that </w:t>
       </w:r>
       <w:r>
         <w:rPr>
@@ -1813,13 +1530,7 @@
         <w:t xml:space="preserve">G6</w:t>
       </w:r>
       <w:r>
-        <w:t xml:space="preserve"> </w:t>
-      </w:r>
-      <w:r>
-        <w:t xml:space="preserve">says</w:t>
-      </w:r>
-      <w:r>
-        <w:t xml:space="preserve"> </w:t>
+        <w:t xml:space="preserve"> says </w:t>
       </w:r>
       <w:r>
         <w:rPr>
@@ -1841,10 +1552,7 @@
         <w:pStyle w:val="Compact"/>
       </w:pPr>
       <w:r>
-        <w:t xml:space="preserve">Click</w:t>
-      </w:r>
-      <w:r>
-        <w:t xml:space="preserve"> </w:t>
+        <w:t xml:space="preserve">Click </w:t>
       </w:r>
       <w:r>
         <w:rPr>
@@ -1873,37 +1581,7 @@
         <w:t xml:space="preserve">E7</w:t>
       </w:r>
       <w:r>
-        <w:t xml:space="preserve"> </w:t>
-      </w:r>
-      <w:r>
-        <w:t xml:space="preserve">shows</w:t>
-      </w:r>
-      <w:r>
-        <w:t xml:space="preserve"> </w:t>
-      </w:r>
-      <w:r>
-        <w:t xml:space="preserve">“</w:t>
-      </w:r>
-      <w:r>
-        <w:t xml:space="preserve">Dashboard loaded by</w:t>
-      </w:r>
-      <w:r>
-        <w:t xml:space="preserve"> </w:t>
-      </w:r>
-      <w:r>
-        <w:t xml:space="preserve"> </w:t>
-      </w:r>
-      <w:r>
-        <w:t xml:space="preserve">at</w:t>
-      </w:r>
-      <w:r>
-        <w:t xml:space="preserve"> </w:t>
-      </w:r>
-      <w:r>
-        <w:t xml:space="preserve">”</w:t>
-      </w:r>
-      <w:r>
-        <w:t xml:space="preserve">. The KPI cards (Budget, Actual to Date, Projected Total, Utilisation) now fill in.</w:t>
+        <w:t xml:space="preserve"> shows “Dashboard loaded by  at ”. The KPI cards (Budget, Actual to Date, Projected Total, Utilisation) now fill in.</w:t>
       </w:r>
     </w:p>
     <w:bookmarkEnd w:id="31"/>
@@ -1953,10 +1631,7 @@
         <w:pStyle w:val="Compact"/>
       </w:pPr>
       <w:r>
-        <w:t xml:space="preserve">then each month, with a</w:t>
-      </w:r>
-      <w:r>
-        <w:t xml:space="preserve"> </w:t>
+        <w:t xml:space="preserve">then each month, with a </w:t>
       </w:r>
       <w:r>
         <w:rPr>
@@ -1966,10 +1641,7 @@
         <w:t xml:space="preserve">quarter total</w:t>
       </w:r>
       <w:r>
-        <w:t xml:space="preserve"> </w:t>
-      </w:r>
-      <w:r>
-        <w:t xml:space="preserve">after each quarter;</w:t>
+        <w:t xml:space="preserve"> after each quarter;</w:t>
       </w:r>
     </w:p>
     <w:p>
@@ -1981,10 +1653,7 @@
         <w:pStyle w:val="Compact"/>
       </w:pPr>
       <w:r>
-        <w:t xml:space="preserve">then the</w:t>
-      </w:r>
-      <w:r>
-        <w:t xml:space="preserve"> </w:t>
+        <w:t xml:space="preserve">then the </w:t>
       </w:r>
       <w:r>
         <w:rPr>
@@ -1994,13 +1663,7 @@
         <w:t xml:space="preserve">FY totals</w:t>
       </w:r>
       <w:r>
-        <w:t xml:space="preserve"> </w:t>
-      </w:r>
-      <w:r>
-        <w:t xml:space="preserve">(or CY totals), then</w:t>
-      </w:r>
-      <w:r>
-        <w:t xml:space="preserve"> </w:t>
+        <w:t xml:space="preserve"> (or CY totals), then </w:t>
       </w:r>
       <w:r>
         <w:rPr>
@@ -2029,13 +1692,7 @@
         <w:t xml:space="preserve">Collapse a quarter:</w:t>
       </w:r>
       <w:r>
-        <w:t xml:space="preserve"> </w:t>
-      </w:r>
-      <w:r>
-        <w:t xml:space="preserve">use the</w:t>
-      </w:r>
-      <w:r>
-        <w:t xml:space="preserve"> </w:t>
+        <w:t xml:space="preserve"> use the </w:t>
       </w:r>
       <w:r>
         <w:rPr>
@@ -2045,13 +1702,7 @@
         <w:t xml:space="preserve">−</w:t>
       </w:r>
       <w:r>
-        <w:t xml:space="preserve"> </w:t>
-      </w:r>
-      <w:r>
-        <w:t xml:space="preserve">/</w:t>
-      </w:r>
-      <w:r>
-        <w:t xml:space="preserve"> </w:t>
+        <w:t xml:space="preserve"> / </w:t>
       </w:r>
       <w:r>
         <w:rPr>
@@ -2061,13 +1712,7 @@
         <w:t xml:space="preserve">+</w:t>
       </w:r>
       <w:r>
-        <w:t xml:space="preserve"> </w:t>
-      </w:r>
-      <w:r>
-        <w:t xml:space="preserve">above the column letters. You can also use the</w:t>
-      </w:r>
-      <w:r>
-        <w:t xml:space="preserve"> </w:t>
+        <w:t xml:space="preserve"> above the column letters. You can also use the </w:t>
       </w:r>
       <w:r>
         <w:rPr>
@@ -2077,13 +1722,7 @@
         <w:t xml:space="preserve">1</w:t>
       </w:r>
       <w:r>
-        <w:t xml:space="preserve"> </w:t>
-      </w:r>
-      <w:r>
-        <w:t xml:space="preserve">/</w:t>
-      </w:r>
-      <w:r>
-        <w:t xml:space="preserve"> </w:t>
+        <w:t xml:space="preserve"> / </w:t>
       </w:r>
       <w:r>
         <w:rPr>
@@ -2093,10 +1732,7 @@
         <w:t xml:space="preserve">2</w:t>
       </w:r>
       <w:r>
-        <w:t xml:space="preserve"> </w:t>
-      </w:r>
-      <w:r>
-        <w:t xml:space="preserve">buttons at the top left to collapse or expand every quarter.</w:t>
+        <w:t xml:space="preserve"> buttons at the top left to collapse or expand every quarter.</w:t>
       </w:r>
     </w:p>
     <w:p>
@@ -2115,13 +1751,7 @@
         <w:t xml:space="preserve">Blocks:</w:t>
       </w:r>
       <w:r>
-        <w:t xml:space="preserve"> </w:t>
-      </w:r>
-      <w:r>
-        <w:t xml:space="preserve">MP, OM, EQ, CO and OTHER. Each block ends with</w:t>
-      </w:r>
-      <w:r>
-        <w:t xml:space="preserve"> </w:t>
+        <w:t xml:space="preserve"> MP, OM, EQ, CO and OTHER. Each block ends with </w:t>
       </w:r>
       <w:r>
         <w:rPr>
@@ -2131,10 +1761,7 @@
         <w:t xml:space="preserve">Projected</w:t>
       </w:r>
       <w:r>
-        <w:t xml:space="preserve">,</w:t>
-      </w:r>
-      <w:r>
-        <w:t xml:space="preserve"> </w:t>
+        <w:t xml:space="preserve">, </w:t>
       </w:r>
       <w:r>
         <w:rPr>
@@ -2144,10 +1771,7 @@
         <w:t xml:space="preserve">Actual</w:t>
       </w:r>
       <w:r>
-        <w:t xml:space="preserve">,</w:t>
-      </w:r>
-      <w:r>
-        <w:t xml:space="preserve"> </w:t>
+        <w:t xml:space="preserve">, </w:t>
       </w:r>
       <w:r>
         <w:rPr>
@@ -2157,13 +1781,7 @@
         <w:t xml:space="preserve">Variance ($)</w:t>
       </w:r>
       <w:r>
-        <w:t xml:space="preserve"> </w:t>
-      </w:r>
-      <w:r>
-        <w:t xml:space="preserve">and</w:t>
-      </w:r>
-      <w:r>
-        <w:t xml:space="preserve"> </w:t>
+        <w:t xml:space="preserve"> and </w:t>
       </w:r>
       <w:r>
         <w:rPr>
@@ -2173,10 +1791,7 @@
         <w:t xml:space="preserve">Variance (%)</w:t>
       </w:r>
       <w:r>
-        <w:t xml:space="preserve">. The</w:t>
-      </w:r>
-      <w:r>
-        <w:t xml:space="preserve"> </w:t>
+        <w:t xml:space="preserve">. The </w:t>
       </w:r>
       <w:r>
         <w:rPr>
@@ -2186,10 +1801,7 @@
         <w:t xml:space="preserve">PROJECT TOTAL</w:t>
       </w:r>
       <w:r>
-        <w:t xml:space="preserve"> </w:t>
-      </w:r>
-      <w:r>
-        <w:t xml:space="preserve">rows are at the bottom.</w:t>
+        <w:t xml:space="preserve"> rows are at the bottom.</w:t>
       </w:r>
     </w:p>
     <w:p>
@@ -2208,13 +1820,7 @@
         <w:t xml:space="preserve">Variance</w:t>
       </w:r>
       <w:r>
-        <w:t xml:space="preserve"> </w:t>
-      </w:r>
-      <w:r>
-        <w:t xml:space="preserve">= Actual − Projected; a positive figure means overspend. It’s shown only up to the</w:t>
-      </w:r>
-      <w:r>
-        <w:t xml:space="preserve"> </w:t>
+        <w:t xml:space="preserve"> = Actual − Projected; a positive figure means overspend. It’s shown only up to the </w:t>
       </w:r>
       <w:r>
         <w:rPr>
@@ -2224,10 +1830,7 @@
         <w:t xml:space="preserve">Latest SOA Month</w:t>
       </w:r>
       <w:r>
-        <w:t xml:space="preserve"> </w:t>
-      </w:r>
-      <w:r>
-        <w:t xml:space="preserve">(C9), so future plans don’t look like underspend.</w:t>
+        <w:t xml:space="preserve"> (C9), so future plans don’t look like underspend.</w:t>
       </w:r>
     </w:p>
     <w:p>
@@ -2246,10 +1849,7 @@
         <w:t xml:space="preserve">Grey MP rows,</w:t>
       </w:r>
       <w:r>
-        <w:t xml:space="preserve"> </w:t>
-      </w:r>
-      <w:r>
-        <w:t xml:space="preserve">e.g. </w:t>
+        <w:t xml:space="preserve"> e.g. </w:t>
       </w:r>
       <w:r>
         <w:rPr>
@@ -2258,10 +1858,7 @@
         <w:t xml:space="preserve">RA (Projected)</w:t>
       </w:r>
       <w:r>
-        <w:t xml:space="preserve">, are manpower projections (FTE × rate). They come from the manpower sheet and</w:t>
-      </w:r>
-      <w:r>
-        <w:t xml:space="preserve"> </w:t>
+        <w:t xml:space="preserve">, are manpower projections (FTE × rate). They come from the manpower sheet and </w:t>
       </w:r>
       <w:r>
         <w:rPr>
@@ -2293,10 +1890,7 @@
         <w:pStyle w:val="Compact"/>
       </w:pPr>
       <w:r>
-        <w:t xml:space="preserve">Type monthly amounts in the</w:t>
-      </w:r>
-      <w:r>
-        <w:t xml:space="preserve"> </w:t>
+        <w:t xml:space="preserve">Type monthly amounts in the </w:t>
       </w:r>
       <w:r>
         <w:rPr>
@@ -2318,10 +1912,7 @@
         <w:pStyle w:val="Compact"/>
       </w:pPr>
       <w:r>
-        <w:t xml:space="preserve">A</w:t>
-      </w:r>
-      <w:r>
-        <w:t xml:space="preserve"> </w:t>
+        <w:t xml:space="preserve">A </w:t>
       </w:r>
       <w:r>
         <w:rPr>
@@ -2331,13 +1922,7 @@
         <w:t xml:space="preserve">blank</w:t>
       </w:r>
       <w:r>
-        <w:t xml:space="preserve"> </w:t>
-      </w:r>
-      <w:r>
-        <w:t xml:space="preserve">cell means no projection.</w:t>
-      </w:r>
-      <w:r>
-        <w:t xml:space="preserve"> </w:t>
+        <w:t xml:space="preserve"> cell means no projection. </w:t>
       </w:r>
       <w:r>
         <w:rPr>
@@ -2347,10 +1932,7 @@
         <w:t xml:space="preserve">0</w:t>
       </w:r>
       <w:r>
-        <w:t xml:space="preserve"> </w:t>
-      </w:r>
-      <w:r>
-        <w:t xml:space="preserve">is saved as 0.</w:t>
+        <w:t xml:space="preserve"> is saved as 0.</w:t>
       </w:r>
     </w:p>
     <w:p>
@@ -2384,10 +1966,7 @@
         <w:pStyle w:val="Compact"/>
       </w:pPr>
       <w:r>
-        <w:t xml:space="preserve">Click</w:t>
-      </w:r>
-      <w:r>
-        <w:t xml:space="preserve"> </w:t>
+        <w:t xml:space="preserve">Click </w:t>
       </w:r>
       <w:r>
         <w:rPr>
@@ -2409,31 +1988,14 @@
         <w:pStyle w:val="Compact"/>
       </w:pPr>
       <w:r>
-        <w:t xml:space="preserve">If you switch project with unsaved changes, Excel asks</w:t>
-      </w:r>
-      <w:r>
-        <w:t xml:space="preserve"> </w:t>
-      </w:r>
-      <w:r>
-        <w:rPr>
-          <w:bCs/>
-          <w:b/>
-        </w:rPr>
-        <w:t xml:space="preserve">“</w:t>
-      </w:r>
-      <w:r>
-        <w:rPr>
-          <w:bCs/>
-          <w:b/>
-        </w:rPr>
-        <w:t xml:space="preserve">Save changes to … first?</w:t>
-      </w:r>
-      <w:r>
-        <w:rPr>
-          <w:bCs/>
-          <w:b/>
-        </w:rPr>
-        <w:t xml:space="preserve">”</w:t>
+        <w:t xml:space="preserve">If you switch project with unsaved changes, Excel asks </w:t>
+      </w:r>
+      <w:r>
+        <w:rPr>
+          <w:bCs/>
+          <w:b/>
+        </w:rPr>
+        <w:t xml:space="preserve">“Save changes to … first?”</w:t>
       </w:r>
       <w:r>
         <w:t xml:space="preserve">:</w:t>
@@ -2455,10 +2017,7 @@
         <w:t xml:space="preserve">Yes</w:t>
       </w:r>
       <w:r>
-        <w:t xml:space="preserve"> </w:t>
-      </w:r>
-      <w:r>
-        <w:t xml:space="preserve">saves;</w:t>
+        <w:t xml:space="preserve"> saves;</w:t>
       </w:r>
     </w:p>
     <w:p>
@@ -2477,10 +2036,7 @@
         <w:t xml:space="preserve">No</w:t>
       </w:r>
       <w:r>
-        <w:t xml:space="preserve"> </w:t>
-      </w:r>
-      <w:r>
-        <w:t xml:space="preserve">discards the changes;</w:t>
+        <w:t xml:space="preserve"> discards the changes;</w:t>
       </w:r>
     </w:p>
     <w:p>
@@ -2499,10 +2055,7 @@
         <w:t xml:space="preserve">Cancel</w:t>
       </w:r>
       <w:r>
-        <w:t xml:space="preserve"> </w:t>
-      </w:r>
-      <w:r>
-        <w:t xml:space="preserve">stays on the current project.</w:t>
+        <w:t xml:space="preserve"> stays on the current project.</w:t>
       </w:r>
     </w:p>
     <w:p>
@@ -2514,10 +2067,7 @@
         <w:pStyle w:val="Compact"/>
       </w:pPr>
       <w:r>
-        <w:t xml:space="preserve">If someone else saved this project after you loaded it, you’re asked whether to</w:t>
-      </w:r>
-      <w:r>
-        <w:t xml:space="preserve"> </w:t>
+        <w:t xml:space="preserve">If someone else saved this project after you loaded it, you’re asked whether to </w:t>
       </w:r>
       <w:r>
         <w:rPr>
@@ -2527,10 +2077,7 @@
         <w:t xml:space="preserve">overwrite</w:t>
       </w:r>
       <w:r>
-        <w:t xml:space="preserve"> </w:t>
-      </w:r>
-      <w:r>
-        <w:t xml:space="preserve">their save.</w:t>
+        <w:t xml:space="preserve"> their save.</w:t>
       </w:r>
     </w:p>
     <w:p>
@@ -2542,31 +2089,14 @@
         <w:pStyle w:val="Compact"/>
       </w:pPr>
       <w:r>
-        <w:t xml:space="preserve">If you changed E6/F6 without clicking Load Project, saving is blocked with</w:t>
-      </w:r>
-      <w:r>
-        <w:t xml:space="preserve"> </w:t>
-      </w:r>
-      <w:r>
-        <w:rPr>
-          <w:bCs/>
-          <w:b/>
-        </w:rPr>
-        <w:t xml:space="preserve">“</w:t>
-      </w:r>
-      <w:r>
-        <w:rPr>
-          <w:bCs/>
-          <w:b/>
-        </w:rPr>
-        <w:t xml:space="preserve">Selection changed — reload first</w:t>
-      </w:r>
-      <w:r>
-        <w:rPr>
-          <w:bCs/>
-          <w:b/>
-        </w:rPr>
-        <w:t xml:space="preserve">”</w:t>
+        <w:t xml:space="preserve">If you changed E6/F6 without clicking Load Project, saving is blocked with </w:t>
+      </w:r>
+      <w:r>
+        <w:rPr>
+          <w:bCs/>
+          <w:b/>
+        </w:rPr>
+        <w:t xml:space="preserve">“Selection changed — reload first”</w:t>
       </w:r>
       <w:r>
         <w:t xml:space="preserve">.</w:t>
@@ -2587,55 +2117,17 @@
         <w:pStyle w:val="FirstParagraph"/>
       </w:pPr>
       <w:r>
-        <w:t xml:space="preserve">Italic rows starting</w:t>
-      </w:r>
-      <w:r>
-        <w:t xml:space="preserve"> </w:t>
-      </w:r>
-      <w:r>
-        <w:rPr>
-          <w:bCs/>
-          <w:b/>
-        </w:rPr>
-        <w:t xml:space="preserve">“</w:t>
-      </w:r>
-      <w:r>
-        <w:rPr>
-          <w:bCs/>
-          <w:b/>
-        </w:rPr>
-        <w:t xml:space="preserve">Unmatched:</w:t>
-      </w:r>
-      <w:r>
-        <w:rPr>
-          <w:bCs/>
-          <w:b/>
-        </w:rPr>
-        <w:t xml:space="preserve">”</w:t>
-      </w:r>
-      <w:r>
-        <w:t xml:space="preserve"> </w:t>
-      </w:r>
-      <w:r>
-        <w:t xml:space="preserve">hold saved amounts that no longer fit the grid. This happens when:</w:t>
-      </w:r>
-      <w:r>
-        <w:t xml:space="preserve"> </w:t>
-      </w:r>
-      <w:r>
-        <w:t xml:space="preserve">- a budget line was renamed or removed in SOA;</w:t>
-      </w:r>
-      <w:r>
-        <w:t xml:space="preserve"> </w:t>
-      </w:r>
-      <w:r>
-        <w:t xml:space="preserve">- a line now nets to $0; or</w:t>
-      </w:r>
-      <w:r>
-        <w:t xml:space="preserve"> </w:t>
-      </w:r>
-      <w:r>
-        <w:t xml:space="preserve">- a month falls outside the project dates.</w:t>
+        <w:t xml:space="preserve">Italic rows starting </w:t>
+      </w:r>
+      <w:r>
+        <w:rPr>
+          <w:bCs/>
+          <w:b/>
+        </w:rPr>
+        <w:t xml:space="preserve">“Unmatched:”</w:t>
+      </w:r>
+      <w:r>
+        <w:t xml:space="preserve"> hold saved amounts that no longer fit the grid. This happens when: - a budget line was renamed or removed in SOA; - a line now nets to $0; or - a month falls outside the project dates.</w:t>
       </w:r>
     </w:p>
     <w:p>
@@ -2643,10 +2135,7 @@
         <w:pStyle w:val="BodyText"/>
       </w:pPr>
       <w:r>
-        <w:t xml:space="preserve">These amounts still</w:t>
-      </w:r>
-      <w:r>
-        <w:t xml:space="preserve"> </w:t>
+        <w:t xml:space="preserve">These amounts still </w:t>
       </w:r>
       <w:r>
         <w:rPr>
@@ -2656,16 +2145,7 @@
         <w:t xml:space="preserve">count in the totals</w:t>
       </w:r>
       <w:r>
-        <w:t xml:space="preserve">.</w:t>
-      </w:r>
-      <w:r>
-        <w:t xml:space="preserve"> </w:t>
-      </w:r>
-      <w:r>
-        <w:t xml:space="preserve">-</w:t>
-      </w:r>
-      <w:r>
-        <w:t xml:space="preserve"> </w:t>
+        <w:t xml:space="preserve">. - </w:t>
       </w:r>
       <w:r>
         <w:rPr>
@@ -2675,13 +2155,7 @@
         <w:t xml:space="preserve">Re-assign:</w:t>
       </w:r>
       <w:r>
-        <w:t xml:space="preserve"> </w:t>
-      </w:r>
-      <w:r>
-        <w:t xml:space="preserve">click a cell in the Unmatched row, click</w:t>
-      </w:r>
-      <w:r>
-        <w:t xml:space="preserve"> </w:t>
+        <w:t xml:space="preserve"> click a cell in the Unmatched row, click </w:t>
       </w:r>
       <w:r>
         <w:rPr>
@@ -2691,16 +2165,7 @@
         <w:t xml:space="preserve">Re-assign unmatched</w:t>
       </w:r>
       <w:r>
-        <w:t xml:space="preserve">, then click any cell in the budget line that should get the amounts.</w:t>
-      </w:r>
-      <w:r>
-        <w:t xml:space="preserve"> </w:t>
-      </w:r>
-      <w:r>
-        <w:t xml:space="preserve">-</w:t>
-      </w:r>
-      <w:r>
-        <w:t xml:space="preserve"> </w:t>
+        <w:t xml:space="preserve">, then click any cell in the budget line that should get the amounts. - </w:t>
       </w:r>
       <w:r>
         <w:rPr>
@@ -2710,13 +2175,7 @@
         <w:t xml:space="preserve">Delete:</w:t>
       </w:r>
       <w:r>
-        <w:t xml:space="preserve"> </w:t>
-      </w:r>
-      <w:r>
-        <w:t xml:space="preserve">click a cell in the Unmatched row, then click</w:t>
-      </w:r>
-      <w:r>
-        <w:t xml:space="preserve"> </w:t>
+        <w:t xml:space="preserve"> click a cell in the Unmatched row, then click </w:t>
       </w:r>
       <w:r>
         <w:rPr>
@@ -2726,10 +2185,7 @@
         <w:t xml:space="preserve">Delete unmatched</w:t>
       </w:r>
       <w:r>
-        <w:t xml:space="preserve"> </w:t>
-      </w:r>
-      <w:r>
-        <w:t xml:space="preserve">and confirm.</w:t>
+        <w:t xml:space="preserve"> and confirm.</w:t>
       </w:r>
     </w:p>
     <w:bookmarkEnd w:id="35"/>
@@ -2751,10 +2207,7 @@
         <w:pStyle w:val="Compact"/>
       </w:pPr>
       <w:r>
-        <w:t xml:space="preserve">On the</w:t>
-      </w:r>
-      <w:r>
-        <w:t xml:space="preserve"> </w:t>
+        <w:t xml:space="preserve">On the </w:t>
       </w:r>
       <w:r>
         <w:rPr>
@@ -2764,10 +2217,7 @@
         <w:t xml:space="preserve">Dashboard_Settings</w:t>
       </w:r>
       <w:r>
-        <w:t xml:space="preserve"> </w:t>
-      </w:r>
-      <w:r>
-        <w:t xml:space="preserve">sheet, add a row to the table with:</w:t>
+        <w:t xml:space="preserve"> sheet, add a row to the table with:</w:t>
       </w:r>
     </w:p>
     <w:p>
@@ -2840,10 +2290,7 @@
         <w:t xml:space="preserve">Charge To</w:t>
       </w:r>
       <w:r>
-        <w:t xml:space="preserve"> </w:t>
-      </w:r>
-      <w:r>
-        <w:t xml:space="preserve">(MP, OM, EQ, CO or OTHER).</w:t>
+        <w:t xml:space="preserve"> (MP, OM, EQ, CO or OTHER).</w:t>
       </w:r>
     </w:p>
     <w:p>
@@ -2890,10 +2337,7 @@
         <w:pStyle w:val="Compact"/>
       </w:pPr>
       <w:r>
-        <w:t xml:space="preserve">A full copy of the v0.8 dashboard is kept on a hidden sheet,</w:t>
-      </w:r>
-      <w:r>
-        <w:t xml:space="preserve"> </w:t>
+        <w:t xml:space="preserve">A full copy of the v0.8 dashboard is kept on a hidden sheet, </w:t>
       </w:r>
       <w:r>
         <w:rPr>
@@ -2903,10 +2347,7 @@
         <w:t xml:space="preserve">Legacy_Timeline</w:t>
       </w:r>
       <w:r>
-        <w:t xml:space="preserve">, for comparison during testing. To view it: right-click any sheet tab →</w:t>
-      </w:r>
-      <w:r>
-        <w:t xml:space="preserve"> </w:t>
+        <w:t xml:space="preserve">, for comparison during testing. To view it: right-click any sheet tab → </w:t>
       </w:r>
       <w:r>
         <w:rPr>
@@ -2916,10 +2357,7 @@
         <w:t xml:space="preserve">Unhide</w:t>
       </w:r>
       <w:r>
-        <w:t xml:space="preserve"> </w:t>
-      </w:r>
-      <w:r>
-        <w:t xml:space="preserve">→ Legacy_Timeline.</w:t>
+        <w:t xml:space="preserve"> → Legacy_Timeline.</w:t>
       </w:r>
     </w:p>
     <w:p>
@@ -2943,10 +2381,7 @@
         <w:pStyle w:val="Compact"/>
       </w:pPr>
       <w:r>
-        <w:t xml:space="preserve">The manpower table and sheet keep their v0.8 names,</w:t>
-      </w:r>
-      <w:r>
-        <w:t xml:space="preserve"> </w:t>
+        <w:t xml:space="preserve">The manpower table and sheet keep their v0.8 names, </w:t>
       </w:r>
       <w:r>
         <w:rPr>
@@ -2957,13 +2392,7 @@
         <w:t xml:space="preserve">qManpower_SelectedTest</w:t>
       </w:r>
       <w:r>
-        <w:t xml:space="preserve"> </w:t>
-      </w:r>
-      <w:r>
-        <w:t xml:space="preserve">/</w:t>
-      </w:r>
-      <w:r>
-        <w:t xml:space="preserve"> </w:t>
+        <w:t xml:space="preserve"> / </w:t>
       </w:r>
       <w:r>
         <w:rPr>
@@ -2974,10 +2403,7 @@
         <w:t xml:space="preserve">PQManpower_SelectedTest</w:t>
       </w:r>
       <w:r>
-        <w:t xml:space="preserve">. If you want them renamed to match the other selected-test tables, do it in Excel (Table Design → Table Name; right-click the sheet tab → Rename), never by editing the file, and ask for the VBA constant</w:t>
-      </w:r>
-      <w:r>
-        <w:t xml:space="preserve"> </w:t>
+        <w:t xml:space="preserve">. If you want them renamed to match the other selected-test tables, do it in Excel (Table Design → Table Name; right-click the sheet tab → Rename), never by editing the file, and ask for the VBA constant </w:t>
       </w:r>
       <w:r>
         <w:rPr>
@@ -2986,10 +2412,7 @@
         <w:t xml:space="preserve">MANPOWER_TABLE</w:t>
       </w:r>
       <w:r>
-        <w:t xml:space="preserve"> </w:t>
-      </w:r>
-      <w:r>
-        <w:t xml:space="preserve">to be updated.</w:t>
+        <w:t xml:space="preserve"> to be updated.</w:t>
       </w:r>
     </w:p>
     <w:p>
@@ -3001,10 +2424,7 @@
         <w:pStyle w:val="Compact"/>
       </w:pPr>
       <w:r>
-        <w:t xml:space="preserve">New sheets:</w:t>
-      </w:r>
-      <w:r>
-        <w:t xml:space="preserve"> </w:t>
+        <w:t xml:space="preserve">New sheets: </w:t>
       </w:r>
       <w:r>
         <w:rPr>
@@ -3014,10 +2434,7 @@
         <w:t xml:space="preserve">Dashboard_Settings</w:t>
       </w:r>
       <w:r>
-        <w:t xml:space="preserve">, and the hidden</w:t>
-      </w:r>
-      <w:r>
-        <w:t xml:space="preserve"> </w:t>
+        <w:t xml:space="preserve">, and the hidden </w:t>
       </w:r>
       <w:r>
         <w:rPr>
@@ -3127,13 +2544,7 @@
               <w:jc w:val="left"/>
             </w:pPr>
             <w:r>
-              <w:t xml:space="preserve">“</w:t>
-            </w:r>
-            <w:r>
-              <w:t xml:space="preserve">Setup Status is …</w:t>
-            </w:r>
-            <w:r>
-              <w:t xml:space="preserve">”</w:t>
+              <w:t xml:space="preserve">“Setup Status is …”</w:t>
             </w:r>
           </w:p>
         </w:tc>
@@ -3159,13 +2570,7 @@
               <w:jc w:val="left"/>
             </w:pPr>
             <w:r>
-              <w:t xml:space="preserve">“</w:t>
-            </w:r>
-            <w:r>
-              <w:t xml:space="preserve">Refreshing … failed</w:t>
-            </w:r>
-            <w:r>
-              <w:t xml:space="preserve">”</w:t>
+              <w:t xml:space="preserve">“Refreshing … failed”</w:t>
             </w:r>
           </w:p>
         </w:tc>
@@ -3191,13 +2596,7 @@
               <w:jc w:val="left"/>
             </w:pPr>
             <w:r>
-              <w:t xml:space="preserve">“</w:t>
-            </w:r>
-            <w:r>
-              <w:t xml:space="preserve">… shows X, not Y</w:t>
-            </w:r>
-            <w:r>
-              <w:t xml:space="preserve">”</w:t>
+              <w:t xml:space="preserve">“… shows X, not Y”</w:t>
             </w:r>
           </w:p>
         </w:tc>
@@ -3308,10 +2707,7 @@
         <w:pStyle w:val="FirstParagraph"/>
       </w:pPr>
       <w:r>
-        <w:t xml:space="preserve">Work through</w:t>
-      </w:r>
-      <w:r>
-        <w:t xml:space="preserve"> </w:t>
+        <w:t xml:space="preserve">Work through </w:t>
       </w:r>
       <w:r>
         <w:rPr>
@@ -3320,28 +2716,7 @@
         <w:t xml:space="preserve">tests/UAT_test_script.md</w:t>
       </w:r>
       <w:r>
-        <w:t xml:space="preserve"> </w:t>
-      </w:r>
-      <w:r>
-        <w:t xml:space="preserve">(tests 1–15). Send me:</w:t>
-      </w:r>
-      <w:r>
-        <w:t xml:space="preserve"> </w:t>
-      </w:r>
-      <w:r>
-        <w:t xml:space="preserve">- each test number with Pass or Fail;</w:t>
-      </w:r>
-      <w:r>
-        <w:t xml:space="preserve"> </w:t>
-      </w:r>
-      <w:r>
-        <w:t xml:space="preserve">- a screenshot and the message for any failure;</w:t>
-      </w:r>
-      <w:r>
-        <w:t xml:space="preserve"> </w:t>
-      </w:r>
-      <w:r>
-        <w:t xml:space="preserve">- the saved workbook, so I can confirm Power Query is untouched (test 13).</w:t>
+        <w:t xml:space="preserve"> (tests 1–16). Send me: - each test number with Pass or Fail; - a screenshot and the message for any failure; - the saved workbook, so I can confirm Power Query is untouched (test 13).</w:t>
       </w:r>
     </w:p>
     <w:bookmarkEnd w:id="40"/>

</xml_diff>

<commit_message>
Record UAT 17-18 pass (row group, Remarks); install guide covers Remarks and top-row collapse
Co-Authored-By: Claude Opus 5.5 <noreply@anthropic.com>
Claude-Session: https://claude.ai/code/session_017h8ADiUSHW7ex1hhB7iQGv
</commit_message>
<xml_diff>
--- a/docs/v0.9_Install_and_User_Guide.docx
+++ b/docs/v0.9_Install_and_User_Guide.docx
@@ -2,7 +2,7 @@
 <file path=word/document.xml><?xml version="1.0" encoding="utf-8"?>
 <w:document xmlns:w="http://schemas.openxmlformats.org/wordprocessingml/2006/main" xmlns:m="http://schemas.openxmlformats.org/officeDocument/2006/math" xmlns:r="http://schemas.openxmlformats.org/officeDocument/2006/relationships" xmlns:o="urn:schemas-microsoft-com:office:office" xmlns:v="urn:schemas-microsoft-com:vml" xmlns:w10="urn:schemas-microsoft-com:office:word" xmlns:a="http://schemas.openxmlformats.org/drawingml/2006/main" xmlns:pic="http://schemas.openxmlformats.org/drawingml/2006/picture" xmlns:wp="http://schemas.openxmlformats.org/drawingml/2006/wordprocessingDrawing">
   <w:body>
-    <w:bookmarkStart w:id="41" w:name="Xad89226ec27011cac3cbb2b15a1e4653c453aef"/>
+    <w:bookmarkStart w:id="42" w:name="Xad89226ec27011cac3cbb2b15a1e4653c453aef"/>
     <w:p>
       <w:pPr>
         <w:pStyle w:val="Heading1"/>
@@ -42,7 +42,13 @@
         <w:t xml:space="preserve">Date:</w:t>
       </w:r>
       <w:r>
-        <w:t xml:space="preserve"> 11 October 2026 </w:t>
+        <w:t xml:space="preserve"> </w:t>
+      </w:r>
+      <w:r>
+        <w:t xml:space="preserve">11 October 2026</w:t>
+      </w:r>
+      <w:r>
+        <w:t xml:space="preserve"> </w:t>
       </w:r>
       <w:r>
         <w:rPr>
@@ -52,7 +58,10 @@
         <w:t xml:space="preserve">Status:</w:t>
       </w:r>
       <w:r>
-        <w:t xml:space="preserve"> working copy for testing (UAT). The stable v0.8 file stays as it is; don’t overwrite it.</w:t>
+        <w:t xml:space="preserve"> </w:t>
+      </w:r>
+      <w:r>
+        <w:t xml:space="preserve">working copy for testing (UAT). The stable v0.8 file stays as it is; don’t overwrite it.</w:t>
       </w:r>
     </w:p>
     <w:p>
@@ -271,7 +280,10 @@
               <w:t xml:space="preserve">docs/v0.9_Install_and_User_Guide</w:t>
             </w:r>
             <w:r>
-              <w:t xml:space="preserve"> (.docx and .md)</w:t>
+              <w:t xml:space="preserve"> </w:t>
+            </w:r>
+            <w:r>
+              <w:t xml:space="preserve">(.docx and .md)</w:t>
             </w:r>
           </w:p>
         </w:tc>
@@ -312,7 +324,7 @@
               <w:jc w:val="left"/>
             </w:pPr>
             <w:r>
-              <w:t xml:space="preserve">The 16 acceptance tests, with expected figures.</w:t>
+              <w:t xml:space="preserve">The 18 acceptance tests, with expected figures.</w:t>
             </w:r>
           </w:p>
         </w:tc>
@@ -390,13 +402,28 @@
               <w:t xml:space="preserve">CLAUDE.md</w:t>
             </w:r>
             <w:r>
-              <w:t xml:space="preserve">, </w:t>
+              <w:t xml:space="preserve">,</w:t>
+            </w:r>
+            <w:r>
+              <w:t xml:space="preserve"> </w:t>
             </w:r>
             <w:r>
               <w:rPr>
                 <w:rStyle w:val="VerbatimChar"/>
               </w:rPr>
               <w:t xml:space="preserve">handovers/</w:t>
+            </w:r>
+            <w:r>
+              <w:t xml:space="preserve">,</w:t>
+            </w:r>
+            <w:r>
+              <w:t xml:space="preserve"> </w:t>
+            </w:r>
+            <w:r>
+              <w:rPr>
+                <w:rStyle w:val="VerbatimChar"/>
+              </w:rPr>
+              <w:t xml:space="preserve">docs/PROJECT_REFERENCE.md</w:t>
             </w:r>
           </w:p>
         </w:tc>
@@ -433,7 +460,10 @@
         <w:pStyle w:val="Compact"/>
       </w:pPr>
       <w:r>
-        <w:t xml:space="preserve">Use </w:t>
+        <w:t xml:space="preserve">Use</w:t>
+      </w:r>
+      <w:r>
+        <w:t xml:space="preserve"> </w:t>
       </w:r>
       <w:r>
         <w:rPr>
@@ -443,7 +473,10 @@
         <w:t xml:space="preserve">desktop Excel for Windows</w:t>
       </w:r>
       <w:r>
-        <w:t xml:space="preserve"> (Microsoft 365). The macros don’t run in Excel for the web or in Excel for Mac.</w:t>
+        <w:t xml:space="preserve"> </w:t>
+      </w:r>
+      <w:r>
+        <w:t xml:space="preserve">(Microsoft 365). The macros don’t run in Excel for the web or in Excel for Mac.</w:t>
       </w:r>
     </w:p>
     <w:p>
@@ -474,7 +507,10 @@
         <w:t xml:space="preserve">Don’t</w:t>
       </w:r>
       <w:r>
-        <w:t xml:space="preserve"> open or save the workbook in LibreOffice, Google Sheets, Excel for the web, or Excel on a phone or tablet. Saving it there can remove the Power Query connections.</w:t>
+        <w:t xml:space="preserve"> </w:t>
+      </w:r>
+      <w:r>
+        <w:t xml:space="preserve">open or save the workbook in LibreOffice, Google Sheets, Excel for the web, or Excel on a phone or tablet. Saving it there can remove the Power Query connections.</w:t>
       </w:r>
     </w:p>
     <w:p>
@@ -486,7 +522,10 @@
         <w:pStyle w:val="Compact"/>
       </w:pPr>
       <w:r>
-        <w:t xml:space="preserve">Check the file first: its SHA-256 is in </w:t>
+        <w:t xml:space="preserve">Check the file first: its SHA-256 is in</w:t>
+      </w:r>
+      <w:r>
+        <w:t xml:space="preserve"> </w:t>
       </w:r>
       <w:r>
         <w:rPr>
@@ -495,7 +534,13 @@
         <w:t xml:space="preserve">README_FIRST.txt</w:t>
       </w:r>
       <w:r>
-        <w:t xml:space="preserve"> (PowerShell: </w:t>
+        <w:t xml:space="preserve"> </w:t>
+      </w:r>
+      <w:r>
+        <w:t xml:space="preserve">(PowerShell:</w:t>
+      </w:r>
+      <w:r>
+        <w:t xml:space="preserve"> </w:t>
       </w:r>
       <w:r>
         <w:rPr>
@@ -523,7 +568,10 @@
         <w:t xml:space="preserve">If Excel says it found a problem and offers to repair the file, click No and report it.</w:t>
       </w:r>
       <w:r>
-        <w:t xml:space="preserve"> Don’t save a repaired copy.</w:t>
+        <w:t xml:space="preserve"> </w:t>
+      </w:r>
+      <w:r>
+        <w:t xml:space="preserve">Don’t save a repaired copy.</w:t>
       </w:r>
     </w:p>
     <w:p>
@@ -535,7 +583,10 @@
         <w:pStyle w:val="Compact"/>
       </w:pPr>
       <w:r>
-        <w:t xml:space="preserve">Work on a </w:t>
+        <w:t xml:space="preserve">Work on a</w:t>
+      </w:r>
+      <w:r>
+        <w:t xml:space="preserve"> </w:t>
       </w:r>
       <w:r>
         <w:rPr>
@@ -545,7 +596,10 @@
         <w:t xml:space="preserve">local copy</w:t>
       </w:r>
       <w:r>
-        <w:t xml:space="preserve"> first, for example in Documents. Move it to SharePoint only after testing.</w:t>
+        <w:t xml:space="preserve"> </w:t>
+      </w:r>
+      <w:r>
+        <w:t xml:space="preserve">first, for example in Documents. Move it to SharePoint only after testing.</w:t>
       </w:r>
     </w:p>
     <w:bookmarkEnd w:id="21"/>
@@ -597,7 +651,10 @@
         <w:pStyle w:val="Compact"/>
       </w:pPr>
       <w:r>
-        <w:t xml:space="preserve">Right-click </w:t>
+        <w:t xml:space="preserve">Right-click</w:t>
+      </w:r>
+      <w:r>
+        <w:t xml:space="preserve"> </w:t>
       </w:r>
       <w:r>
         <w:rPr>
@@ -606,7 +663,13 @@
         <w:t xml:space="preserve">..._v0.9_working.xlsm</w:t>
       </w:r>
       <w:r>
-        <w:t xml:space="preserve"> and choose </w:t>
+        <w:t xml:space="preserve"> </w:t>
+      </w:r>
+      <w:r>
+        <w:t xml:space="preserve">and choose</w:t>
+      </w:r>
+      <w:r>
+        <w:t xml:space="preserve"> </w:t>
       </w:r>
       <w:r>
         <w:rPr>
@@ -628,17 +691,37 @@
         <w:pStyle w:val="Compact"/>
       </w:pPr>
       <w:r>
-        <w:t xml:space="preserve">If you see </w:t>
-      </w:r>
-      <w:r>
-        <w:rPr>
-          <w:bCs/>
-          <w:b/>
-        </w:rPr>
-        <w:t xml:space="preserve">“This file came from another computer…”</w:t>
-      </w:r>
-      <w:r>
-        <w:t xml:space="preserve">, tick </w:t>
+        <w:t xml:space="preserve">If you see</w:t>
+      </w:r>
+      <w:r>
+        <w:t xml:space="preserve"> </w:t>
+      </w:r>
+      <w:r>
+        <w:rPr>
+          <w:bCs/>
+          <w:b/>
+        </w:rPr>
+        <w:t xml:space="preserve">“</w:t>
+      </w:r>
+      <w:r>
+        <w:rPr>
+          <w:bCs/>
+          <w:b/>
+        </w:rPr>
+        <w:t xml:space="preserve">This file came from another computer…</w:t>
+      </w:r>
+      <w:r>
+        <w:rPr>
+          <w:bCs/>
+          <w:b/>
+        </w:rPr>
+        <w:t xml:space="preserve">”</w:t>
+      </w:r>
+      <w:r>
+        <w:t xml:space="preserve">, tick</w:t>
+      </w:r>
+      <w:r>
+        <w:t xml:space="preserve"> </w:t>
       </w:r>
       <w:r>
         <w:rPr>
@@ -648,7 +731,13 @@
         <w:t xml:space="preserve">Unblock</w:t>
       </w:r>
       <w:r>
-        <w:t xml:space="preserve"> and click </w:t>
+        <w:t xml:space="preserve"> </w:t>
+      </w:r>
+      <w:r>
+        <w:t xml:space="preserve">and click</w:t>
+      </w:r>
+      <w:r>
+        <w:t xml:space="preserve"> </w:t>
       </w:r>
       <w:r>
         <w:rPr>
@@ -680,7 +769,10 @@
         <w:pStyle w:val="Compact"/>
       </w:pPr>
       <w:r>
-        <w:t xml:space="preserve">Double-click the </w:t>
+        <w:t xml:space="preserve">Double-click the</w:t>
+      </w:r>
+      <w:r>
+        <w:t xml:space="preserve"> </w:t>
       </w:r>
       <w:r>
         <w:rPr>
@@ -689,7 +781,10 @@
         <w:t xml:space="preserve">.xlsm</w:t>
       </w:r>
       <w:r>
-        <w:t xml:space="preserve"> to open it in desktop Excel.</w:t>
+        <w:t xml:space="preserve"> </w:t>
+      </w:r>
+      <w:r>
+        <w:t xml:space="preserve">to open it in desktop Excel.</w:t>
       </w:r>
     </w:p>
     <w:p>
@@ -701,7 +796,10 @@
         <w:pStyle w:val="Compact"/>
       </w:pPr>
       <w:r>
-        <w:t xml:space="preserve">If a yellow bar says </w:t>
+        <w:t xml:space="preserve">If a yellow bar says</w:t>
+      </w:r>
+      <w:r>
+        <w:t xml:space="preserve"> </w:t>
       </w:r>
       <w:r>
         <w:rPr>
@@ -745,7 +843,10 @@
         <w:pStyle w:val="Compact"/>
       </w:pPr>
       <w:r>
-        <w:t xml:space="preserve">Press </w:t>
+        <w:t xml:space="preserve">Press</w:t>
+      </w:r>
+      <w:r>
+        <w:t xml:space="preserve"> </w:t>
       </w:r>
       <w:r>
         <w:rPr>
@@ -767,7 +868,10 @@
         <w:pStyle w:val="Compact"/>
       </w:pPr>
       <w:r>
-        <w:t xml:space="preserve">If you can’t see the </w:t>
+        <w:t xml:space="preserve">If you can’t see the</w:t>
+      </w:r>
+      <w:r>
+        <w:t xml:space="preserve"> </w:t>
       </w:r>
       <w:r>
         <w:rPr>
@@ -777,7 +881,13 @@
         <w:t xml:space="preserve">Project</w:t>
       </w:r>
       <w:r>
-        <w:t xml:space="preserve"> pane on the left, press </w:t>
+        <w:t xml:space="preserve"> </w:t>
+      </w:r>
+      <w:r>
+        <w:t xml:space="preserve">pane on the left, press</w:t>
+      </w:r>
+      <w:r>
+        <w:t xml:space="preserve"> </w:t>
       </w:r>
       <w:r>
         <w:rPr>
@@ -809,7 +919,10 @@
         <w:pStyle w:val="Compact"/>
       </w:pPr>
       <w:r>
-        <w:t xml:space="preserve">Click </w:t>
+        <w:t xml:space="preserve">Click</w:t>
+      </w:r>
+      <w:r>
+        <w:t xml:space="preserve"> </w:t>
       </w:r>
       <w:r>
         <w:rPr>
@@ -831,7 +944,10 @@
         <w:pStyle w:val="Compact"/>
       </w:pPr>
       <w:r>
-        <w:t xml:space="preserve">Go to the unzipped </w:t>
+        <w:t xml:space="preserve">Go to the unzipped</w:t>
+      </w:r>
+      <w:r>
+        <w:t xml:space="preserve"> </w:t>
       </w:r>
       <w:r>
         <w:rPr>
@@ -840,7 +956,13 @@
         <w:t xml:space="preserve">vba</w:t>
       </w:r>
       <w:r>
-        <w:t xml:space="preserve"> folder, choose </w:t>
+        <w:t xml:space="preserve"> </w:t>
+      </w:r>
+      <w:r>
+        <w:t xml:space="preserve">folder, choose</w:t>
+      </w:r>
+      <w:r>
+        <w:t xml:space="preserve"> </w:t>
       </w:r>
       <w:r>
         <w:rPr>
@@ -851,7 +973,13 @@
         <w:t xml:space="preserve">modTimeline.bas</w:t>
       </w:r>
       <w:r>
-        <w:t xml:space="preserve"> and click </w:t>
+        <w:t xml:space="preserve"> </w:t>
+      </w:r>
+      <w:r>
+        <w:t xml:space="preserve">and click</w:t>
+      </w:r>
+      <w:r>
+        <w:t xml:space="preserve"> </w:t>
       </w:r>
       <w:r>
         <w:rPr>
@@ -873,7 +1001,10 @@
         <w:pStyle w:val="Compact"/>
       </w:pPr>
       <w:r>
-        <w:t xml:space="preserve">Repeat for </w:t>
+        <w:t xml:space="preserve">Repeat for</w:t>
+      </w:r>
+      <w:r>
+        <w:t xml:space="preserve"> </w:t>
       </w:r>
       <w:r>
         <w:rPr>
@@ -884,7 +1015,13 @@
         <w:t xml:space="preserve">modStore.bas</w:t>
       </w:r>
       <w:r>
-        <w:t xml:space="preserve"> and </w:t>
+        <w:t xml:space="preserve"> </w:t>
+      </w:r>
+      <w:r>
+        <w:t xml:space="preserve">and</w:t>
+      </w:r>
+      <w:r>
+        <w:t xml:space="preserve"> </w:t>
       </w:r>
       <w:r>
         <w:rPr>
@@ -907,7 +1044,10 @@
         <w:pStyle w:val="Compact"/>
       </w:pPr>
       <w:r>
-        <w:t xml:space="preserve">In the Project pane, under </w:t>
+        <w:t xml:space="preserve">In the Project pane, under</w:t>
+      </w:r>
+      <w:r>
+        <w:t xml:space="preserve"> </w:t>
       </w:r>
       <w:r>
         <w:rPr>
@@ -917,7 +1057,10 @@
         <w:t xml:space="preserve">Modules</w:t>
       </w:r>
       <w:r>
-        <w:t xml:space="preserve">, you should now see </w:t>
+        <w:t xml:space="preserve">, you should now see</w:t>
+      </w:r>
+      <w:r>
+        <w:t xml:space="preserve"> </w:t>
       </w:r>
       <w:r>
         <w:rPr>
@@ -926,7 +1069,13 @@
         <w:t xml:space="preserve">Module1</w:t>
       </w:r>
       <w:r>
-        <w:t xml:space="preserve"> (already there), </w:t>
+        <w:t xml:space="preserve"> </w:t>
+      </w:r>
+      <w:r>
+        <w:t xml:space="preserve">(already there),</w:t>
+      </w:r>
+      <w:r>
+        <w:t xml:space="preserve"> </w:t>
       </w:r>
       <w:r>
         <w:rPr>
@@ -935,7 +1084,10 @@
         <w:t xml:space="preserve">modTimeline</w:t>
       </w:r>
       <w:r>
-        <w:t xml:space="preserve">, </w:t>
+        <w:t xml:space="preserve">,</w:t>
+      </w:r>
+      <w:r>
+        <w:t xml:space="preserve"> </w:t>
       </w:r>
       <w:r>
         <w:rPr>
@@ -944,7 +1096,13 @@
         <w:t xml:space="preserve">modStore</w:t>
       </w:r>
       <w:r>
-        <w:t xml:space="preserve"> and </w:t>
+        <w:t xml:space="preserve"> </w:t>
+      </w:r>
+      <w:r>
+        <w:t xml:space="preserve">and</w:t>
+      </w:r>
+      <w:r>
+        <w:t xml:space="preserve"> </w:t>
       </w:r>
       <w:r>
         <w:rPr>
@@ -961,7 +1119,10 @@
         <w:pStyle w:val="BlockText"/>
       </w:pPr>
       <w:r>
-        <w:t xml:space="preserve">Don’t double-click the </w:t>
+        <w:t xml:space="preserve">Don’t double-click the</w:t>
+      </w:r>
+      <w:r>
+        <w:t xml:space="preserve"> </w:t>
       </w:r>
       <w:r>
         <w:rPr>
@@ -970,7 +1131,13 @@
         <w:t xml:space="preserve">.bas</w:t>
       </w:r>
       <w:r>
-        <w:t xml:space="preserve"> files in Windows, and don’t copy and paste them. Use </w:t>
+        <w:t xml:space="preserve"> </w:t>
+      </w:r>
+      <w:r>
+        <w:t xml:space="preserve">files in Windows, and don’t copy and paste them. Use</w:t>
+      </w:r>
+      <w:r>
+        <w:t xml:space="preserve"> </w:t>
       </w:r>
       <w:r>
         <w:rPr>
@@ -1002,7 +1169,10 @@
         <w:pStyle w:val="Compact"/>
       </w:pPr>
       <w:r>
-        <w:t xml:space="preserve">In the Project pane, open </w:t>
+        <w:t xml:space="preserve">In the Project pane, open</w:t>
+      </w:r>
+      <w:r>
+        <w:t xml:space="preserve"> </w:t>
       </w:r>
       <w:r>
         <w:rPr>
@@ -1012,7 +1182,13 @@
         <w:t xml:space="preserve">Microsoft Excel Objects</w:t>
       </w:r>
       <w:r>
-        <w:t xml:space="preserve"> and double-click </w:t>
+        <w:t xml:space="preserve"> </w:t>
+      </w:r>
+      <w:r>
+        <w:t xml:space="preserve">and double-click</w:t>
+      </w:r>
+      <w:r>
+        <w:t xml:space="preserve"> </w:t>
       </w:r>
       <w:r>
         <w:rPr>
@@ -1034,7 +1210,10 @@
         <w:pStyle w:val="Compact"/>
       </w:pPr>
       <w:r>
-        <w:t xml:space="preserve">Open </w:t>
+        <w:t xml:space="preserve">Open</w:t>
+      </w:r>
+      <w:r>
+        <w:t xml:space="preserve"> </w:t>
       </w:r>
       <w:r>
         <w:rPr>
@@ -1043,7 +1222,13 @@
         <w:t xml:space="preserve">vba/ThisWorkbook_code.txt</w:t>
       </w:r>
       <w:r>
-        <w:t xml:space="preserve"> in Notepad. Copy the three lines from </w:t>
+        <w:t xml:space="preserve"> </w:t>
+      </w:r>
+      <w:r>
+        <w:t xml:space="preserve">in Notepad. Copy the three lines from</w:t>
+      </w:r>
+      <w:r>
+        <w:t xml:space="preserve"> </w:t>
       </w:r>
       <w:r>
         <w:rPr>
@@ -1052,7 +1237,13 @@
         <w:t xml:space="preserve">Private Sub Workbook_Open()</w:t>
       </w:r>
       <w:r>
-        <w:t xml:space="preserve"> to </w:t>
+        <w:t xml:space="preserve"> </w:t>
+      </w:r>
+      <w:r>
+        <w:t xml:space="preserve">to</w:t>
+      </w:r>
+      <w:r>
+        <w:t xml:space="preserve"> </w:t>
       </w:r>
       <w:r>
         <w:rPr>
@@ -1103,7 +1294,10 @@
         <w:pStyle w:val="Compact"/>
       </w:pPr>
       <w:r>
-        <w:t xml:space="preserve">In the VBA editor, click </w:t>
+        <w:t xml:space="preserve">In the VBA editor, click</w:t>
+      </w:r>
+      <w:r>
+        <w:t xml:space="preserve"> </w:t>
       </w:r>
       <w:r>
         <w:rPr>
@@ -1178,7 +1372,10 @@
         <w:pStyle w:val="Compact"/>
       </w:pPr>
       <w:r>
-        <w:t xml:space="preserve">In Excel, press </w:t>
+        <w:t xml:space="preserve">In Excel, press</w:t>
+      </w:r>
+      <w:r>
+        <w:t xml:space="preserve"> </w:t>
       </w:r>
       <w:r>
         <w:rPr>
@@ -1188,7 +1385,10 @@
         <w:t xml:space="preserve">Alt + F8</w:t>
       </w:r>
       <w:r>
-        <w:t xml:space="preserve">, choose </w:t>
+        <w:t xml:space="preserve">, choose</w:t>
+      </w:r>
+      <w:r>
+        <w:t xml:space="preserve"> </w:t>
       </w:r>
       <w:r>
         <w:rPr>
@@ -1199,7 +1399,13 @@
         <w:t xml:space="preserve">Setup_Dashboard_v09</w:t>
       </w:r>
       <w:r>
-        <w:t xml:space="preserve"> and click </w:t>
+        <w:t xml:space="preserve"> </w:t>
+      </w:r>
+      <w:r>
+        <w:t xml:space="preserve">and click</w:t>
+      </w:r>
+      <w:r>
+        <w:t xml:space="preserve"> </w:t>
       </w:r>
       <w:r>
         <w:rPr>
@@ -1221,14 +1427,31 @@
         <w:pStyle w:val="Compact"/>
       </w:pPr>
       <w:r>
-        <w:t xml:space="preserve">You should see </w:t>
-      </w:r>
-      <w:r>
-        <w:rPr>
-          <w:bCs/>
-          <w:b/>
-        </w:rPr>
-        <w:t xml:space="preserve">“Setup complete.”</w:t>
+        <w:t xml:space="preserve">You should see</w:t>
+      </w:r>
+      <w:r>
+        <w:t xml:space="preserve"> </w:t>
+      </w:r>
+      <w:r>
+        <w:rPr>
+          <w:bCs/>
+          <w:b/>
+        </w:rPr>
+        <w:t xml:space="preserve">“</w:t>
+      </w:r>
+      <w:r>
+        <w:rPr>
+          <w:bCs/>
+          <w:b/>
+        </w:rPr>
+        <w:t xml:space="preserve">Setup complete.</w:t>
+      </w:r>
+      <w:r>
+        <w:rPr>
+          <w:bCs/>
+          <w:b/>
+        </w:rPr>
+        <w:t xml:space="preserve">”</w:t>
       </w:r>
     </w:p>
     <w:p>
@@ -1240,7 +1463,10 @@
         <w:pStyle w:val="Compact"/>
       </w:pPr>
       <w:r>
-        <w:t xml:space="preserve">Four buttons now sit on </w:t>
+        <w:t xml:space="preserve">Four buttons now sit on</w:t>
+      </w:r>
+      <w:r>
+        <w:t xml:space="preserve"> </w:t>
       </w:r>
       <w:r>
         <w:rPr>
@@ -1249,7 +1475,13 @@
         <w:t xml:space="preserve">Main_Dashboard</w:t>
       </w:r>
       <w:r>
-        <w:t xml:space="preserve"> at E8:F11: </w:t>
+        <w:t xml:space="preserve"> </w:t>
+      </w:r>
+      <w:r>
+        <w:t xml:space="preserve">at E8:F11:</w:t>
+      </w:r>
+      <w:r>
+        <w:t xml:space="preserve"> </w:t>
       </w:r>
       <w:r>
         <w:rPr>
@@ -1259,7 +1491,10 @@
         <w:t xml:space="preserve">Load Project</w:t>
       </w:r>
       <w:r>
-        <w:t xml:space="preserve">, </w:t>
+        <w:t xml:space="preserve">,</w:t>
+      </w:r>
+      <w:r>
+        <w:t xml:space="preserve"> </w:t>
       </w:r>
       <w:r>
         <w:rPr>
@@ -1269,7 +1504,10 @@
         <w:t xml:space="preserve">Save Projections</w:t>
       </w:r>
       <w:r>
-        <w:t xml:space="preserve">, </w:t>
+        <w:t xml:space="preserve">,</w:t>
+      </w:r>
+      <w:r>
+        <w:t xml:space="preserve"> </w:t>
       </w:r>
       <w:r>
         <w:rPr>
@@ -1279,7 +1517,13 @@
         <w:t xml:space="preserve">Re-assign unmatched</w:t>
       </w:r>
       <w:r>
-        <w:t xml:space="preserve"> and </w:t>
+        <w:t xml:space="preserve"> </w:t>
+      </w:r>
+      <w:r>
+        <w:t xml:space="preserve">and</w:t>
+      </w:r>
+      <w:r>
+        <w:t xml:space="preserve"> </w:t>
       </w:r>
       <w:r>
         <w:rPr>
@@ -1311,7 +1555,10 @@
         <w:pStyle w:val="Compact"/>
       </w:pPr>
       <w:r>
-        <w:t xml:space="preserve">Click </w:t>
+        <w:t xml:space="preserve">Click</w:t>
+      </w:r>
+      <w:r>
+        <w:t xml:space="preserve"> </w:t>
       </w:r>
       <w:r>
         <w:rPr>
@@ -1321,7 +1568,10 @@
         <w:t xml:space="preserve">File → Save</w:t>
       </w:r>
       <w:r>
-        <w:t xml:space="preserve">. Keep the </w:t>
+        <w:t xml:space="preserve">. Keep the</w:t>
+      </w:r>
+      <w:r>
+        <w:t xml:space="preserve"> </w:t>
       </w:r>
       <w:r>
         <w:rPr>
@@ -1331,7 +1581,13 @@
         <w:t xml:space="preserve">.xlsm</w:t>
       </w:r>
       <w:r>
-        <w:t xml:space="preserve"> format; if Excel asks about the macro-free format, choose </w:t>
+        <w:t xml:space="preserve"> </w:t>
+      </w:r>
+      <w:r>
+        <w:t xml:space="preserve">format; if Excel asks about the macro-free format, choose</w:t>
+      </w:r>
+      <w:r>
+        <w:t xml:space="preserve"> </w:t>
       </w:r>
       <w:r>
         <w:rPr>
@@ -1366,7 +1622,7 @@
     </w:p>
     <w:bookmarkEnd w:id="29"/>
     <w:bookmarkEnd w:id="30"/>
-    <w:bookmarkStart w:id="37" w:name="using-the-dashboard"/>
+    <w:bookmarkStart w:id="38" w:name="using-the-dashboard"/>
     <w:p>
       <w:pPr>
         <w:pStyle w:val="Heading2"/>
@@ -1393,7 +1649,10 @@
         <w:pStyle w:val="Compact"/>
       </w:pPr>
       <w:r>
-        <w:t xml:space="preserve">On </w:t>
+        <w:t xml:space="preserve">On</w:t>
+      </w:r>
+      <w:r>
+        <w:t xml:space="preserve"> </w:t>
       </w:r>
       <w:r>
         <w:rPr>
@@ -1414,7 +1673,10 @@
         <w:pStyle w:val="Compact"/>
       </w:pPr>
       <w:r>
-        <w:t xml:space="preserve">set </w:t>
+        <w:t xml:space="preserve">set</w:t>
+      </w:r>
+      <w:r>
+        <w:t xml:space="preserve"> </w:t>
       </w:r>
       <w:r>
         <w:rPr>
@@ -1424,7 +1686,13 @@
         <w:t xml:space="preserve">C6</w:t>
       </w:r>
       <w:r>
-        <w:t xml:space="preserve"> to </w:t>
+        <w:t xml:space="preserve"> </w:t>
+      </w:r>
+      <w:r>
+        <w:t xml:space="preserve">to</w:t>
+      </w:r>
+      <w:r>
+        <w:t xml:space="preserve"> </w:t>
       </w:r>
       <w:r>
         <w:rPr>
@@ -1434,7 +1702,13 @@
         <w:t xml:space="preserve">Financial Year</w:t>
       </w:r>
       <w:r>
-        <w:t xml:space="preserve"> or </w:t>
+        <w:t xml:space="preserve"> </w:t>
+      </w:r>
+      <w:r>
+        <w:t xml:space="preserve">or</w:t>
+      </w:r>
+      <w:r>
+        <w:t xml:space="preserve"> </w:t>
       </w:r>
       <w:r>
         <w:rPr>
@@ -1456,7 +1730,10 @@
         <w:pStyle w:val="Compact"/>
       </w:pPr>
       <w:r>
-        <w:t xml:space="preserve">pick the </w:t>
+        <w:t xml:space="preserve">pick the</w:t>
+      </w:r>
+      <w:r>
+        <w:t xml:space="preserve"> </w:t>
       </w:r>
       <w:r>
         <w:rPr>
@@ -1466,7 +1743,13 @@
         <w:t xml:space="preserve">Source Project</w:t>
       </w:r>
       <w:r>
-        <w:t xml:space="preserve"> in </w:t>
+        <w:t xml:space="preserve"> </w:t>
+      </w:r>
+      <w:r>
+        <w:t xml:space="preserve">in</w:t>
+      </w:r>
+      <w:r>
+        <w:t xml:space="preserve"> </w:t>
       </w:r>
       <w:r>
         <w:rPr>
@@ -1488,7 +1771,10 @@
         <w:pStyle w:val="Compact"/>
       </w:pPr>
       <w:r>
-        <w:t xml:space="preserve">pick the </w:t>
+        <w:t xml:space="preserve">pick the</w:t>
+      </w:r>
+      <w:r>
+        <w:t xml:space="preserve"> </w:t>
       </w:r>
       <w:r>
         <w:rPr>
@@ -1498,7 +1784,13 @@
         <w:t xml:space="preserve">Main IO</w:t>
       </w:r>
       <w:r>
-        <w:t xml:space="preserve"> in </w:t>
+        <w:t xml:space="preserve"> </w:t>
+      </w:r>
+      <w:r>
+        <w:t xml:space="preserve">in</w:t>
+      </w:r>
+      <w:r>
+        <w:t xml:space="preserve"> </w:t>
       </w:r>
       <w:r>
         <w:rPr>
@@ -1520,7 +1812,10 @@
         <w:pStyle w:val="Compact"/>
       </w:pPr>
       <w:r>
-        <w:t xml:space="preserve">Check that </w:t>
+        <w:t xml:space="preserve">Check that</w:t>
+      </w:r>
+      <w:r>
+        <w:t xml:space="preserve"> </w:t>
       </w:r>
       <w:r>
         <w:rPr>
@@ -1530,7 +1825,13 @@
         <w:t xml:space="preserve">G6</w:t>
       </w:r>
       <w:r>
-        <w:t xml:space="preserve"> says </w:t>
+        <w:t xml:space="preserve"> </w:t>
+      </w:r>
+      <w:r>
+        <w:t xml:space="preserve">says</w:t>
+      </w:r>
+      <w:r>
+        <w:t xml:space="preserve"> </w:t>
       </w:r>
       <w:r>
         <w:rPr>
@@ -1552,7 +1853,10 @@
         <w:pStyle w:val="Compact"/>
       </w:pPr>
       <w:r>
-        <w:t xml:space="preserve">Click </w:t>
+        <w:t xml:space="preserve">Click</w:t>
+      </w:r>
+      <w:r>
+        <w:t xml:space="preserve"> </w:t>
       </w:r>
       <w:r>
         <w:rPr>
@@ -1581,7 +1885,37 @@
         <w:t xml:space="preserve">E7</w:t>
       </w:r>
       <w:r>
-        <w:t xml:space="preserve"> shows “Dashboard loaded by  at ”. The KPI cards (Budget, Actual to Date, Projected Total, Utilisation) now fill in.</w:t>
+        <w:t xml:space="preserve"> </w:t>
+      </w:r>
+      <w:r>
+        <w:t xml:space="preserve">shows</w:t>
+      </w:r>
+      <w:r>
+        <w:t xml:space="preserve"> </w:t>
+      </w:r>
+      <w:r>
+        <w:t xml:space="preserve">“</w:t>
+      </w:r>
+      <w:r>
+        <w:t xml:space="preserve">Dashboard loaded by</w:t>
+      </w:r>
+      <w:r>
+        <w:t xml:space="preserve"> </w:t>
+      </w:r>
+      <w:r>
+        <w:t xml:space="preserve"> </w:t>
+      </w:r>
+      <w:r>
+        <w:t xml:space="preserve">at</w:t>
+      </w:r>
+      <w:r>
+        <w:t xml:space="preserve"> </w:t>
+      </w:r>
+      <w:r>
+        <w:t xml:space="preserve">”</w:t>
+      </w:r>
+      <w:r>
+        <w:t xml:space="preserve">. The KPI cards (Budget, Actual to Date, Projected Total, Utilisation) now fill in.</w:t>
       </w:r>
     </w:p>
     <w:bookmarkEnd w:id="31"/>
@@ -1631,7 +1965,10 @@
         <w:pStyle w:val="Compact"/>
       </w:pPr>
       <w:r>
-        <w:t xml:space="preserve">then each month, with a </w:t>
+        <w:t xml:space="preserve">then each month, with a</w:t>
+      </w:r>
+      <w:r>
+        <w:t xml:space="preserve"> </w:t>
       </w:r>
       <w:r>
         <w:rPr>
@@ -1641,7 +1978,10 @@
         <w:t xml:space="preserve">quarter total</w:t>
       </w:r>
       <w:r>
-        <w:t xml:space="preserve"> after each quarter;</w:t>
+        <w:t xml:space="preserve"> </w:t>
+      </w:r>
+      <w:r>
+        <w:t xml:space="preserve">after each quarter;</w:t>
       </w:r>
     </w:p>
     <w:p>
@@ -1653,7 +1993,10 @@
         <w:pStyle w:val="Compact"/>
       </w:pPr>
       <w:r>
-        <w:t xml:space="preserve">then the </w:t>
+        <w:t xml:space="preserve">then the</w:t>
+      </w:r>
+      <w:r>
+        <w:t xml:space="preserve"> </w:t>
       </w:r>
       <w:r>
         <w:rPr>
@@ -1663,7 +2006,13 @@
         <w:t xml:space="preserve">FY totals</w:t>
       </w:r>
       <w:r>
-        <w:t xml:space="preserve"> (or CY totals), then </w:t>
+        <w:t xml:space="preserve"> </w:t>
+      </w:r>
+      <w:r>
+        <w:t xml:space="preserve">(or CY totals), then</w:t>
+      </w:r>
+      <w:r>
+        <w:t xml:space="preserve"> </w:t>
       </w:r>
       <w:r>
         <w:rPr>
@@ -1673,6 +2022,19 @@
         <w:t xml:space="preserve">Project Total</w:t>
       </w:r>
       <w:r>
+        <w:t xml:space="preserve">, then</w:t>
+      </w:r>
+      <w:r>
+        <w:t xml:space="preserve"> </w:t>
+      </w:r>
+      <w:r>
+        <w:rPr>
+          <w:bCs/>
+          <w:b/>
+        </w:rPr>
+        <w:t xml:space="preserve">Remarks</w:t>
+      </w:r>
+      <w:r>
         <w:t xml:space="preserve">.</w:t>
       </w:r>
     </w:p>
@@ -1689,10 +2051,70 @@
           <w:bCs/>
           <w:b/>
         </w:rPr>
+        <w:t xml:space="preserve">Collapse the top section:</w:t>
+      </w:r>
+      <w:r>
+        <w:t xml:space="preserve"> </w:t>
+      </w:r>
+      <w:r>
+        <w:t xml:space="preserve">use the</w:t>
+      </w:r>
+      <w:r>
+        <w:t xml:space="preserve"> </w:t>
+      </w:r>
+      <w:r>
+        <w:rPr>
+          <w:bCs/>
+          <w:b/>
+        </w:rPr>
+        <w:t xml:space="preserve">−</w:t>
+      </w:r>
+      <w:r>
+        <w:t xml:space="preserve"> </w:t>
+      </w:r>
+      <w:r>
+        <w:t xml:space="preserve">/</w:t>
+      </w:r>
+      <w:r>
+        <w:t xml:space="preserve"> </w:t>
+      </w:r>
+      <w:r>
+        <w:rPr>
+          <w:bCs/>
+          <w:b/>
+        </w:rPr>
+        <w:t xml:space="preserve">+</w:t>
+      </w:r>
+      <w:r>
+        <w:t xml:space="preserve"> </w:t>
+      </w:r>
+      <w:r>
+        <w:t xml:space="preserve">beside row 1 (left of the row numbers) to hide or show rows 2–19 (selector, KPI cards, buttons) and give the timeline more room. Load Project sets this up every time and leaves it expanded. Your frozen panes are kept.</w:t>
+      </w:r>
+    </w:p>
+    <w:p>
+      <w:pPr>
+        <w:numPr>
+          <w:ilvl w:val="0"/>
+          <w:numId w:val="1012"/>
+        </w:numPr>
+        <w:pStyle w:val="Compact"/>
+      </w:pPr>
+      <w:r>
+        <w:rPr>
+          <w:bCs/>
+          <w:b/>
+        </w:rPr>
         <w:t xml:space="preserve">Collapse a quarter:</w:t>
       </w:r>
       <w:r>
-        <w:t xml:space="preserve"> use the </w:t>
+        <w:t xml:space="preserve"> </w:t>
+      </w:r>
+      <w:r>
+        <w:t xml:space="preserve">use the</w:t>
+      </w:r>
+      <w:r>
+        <w:t xml:space="preserve"> </w:t>
       </w:r>
       <w:r>
         <w:rPr>
@@ -1702,7 +2124,13 @@
         <w:t xml:space="preserve">−</w:t>
       </w:r>
       <w:r>
-        <w:t xml:space="preserve"> / </w:t>
+        <w:t xml:space="preserve"> </w:t>
+      </w:r>
+      <w:r>
+        <w:t xml:space="preserve">/</w:t>
+      </w:r>
+      <w:r>
+        <w:t xml:space="preserve"> </w:t>
       </w:r>
       <w:r>
         <w:rPr>
@@ -1712,7 +2140,13 @@
         <w:t xml:space="preserve">+</w:t>
       </w:r>
       <w:r>
-        <w:t xml:space="preserve"> above the column letters. You can also use the </w:t>
+        <w:t xml:space="preserve"> </w:t>
+      </w:r>
+      <w:r>
+        <w:t xml:space="preserve">above the column letters. You can also use the</w:t>
+      </w:r>
+      <w:r>
+        <w:t xml:space="preserve"> </w:t>
       </w:r>
       <w:r>
         <w:rPr>
@@ -1722,7 +2156,13 @@
         <w:t xml:space="preserve">1</w:t>
       </w:r>
       <w:r>
-        <w:t xml:space="preserve"> / </w:t>
+        <w:t xml:space="preserve"> </w:t>
+      </w:r>
+      <w:r>
+        <w:t xml:space="preserve">/</w:t>
+      </w:r>
+      <w:r>
+        <w:t xml:space="preserve"> </w:t>
       </w:r>
       <w:r>
         <w:rPr>
@@ -1732,7 +2172,10 @@
         <w:t xml:space="preserve">2</w:t>
       </w:r>
       <w:r>
-        <w:t xml:space="preserve"> buttons at the top left to collapse or expand every quarter.</w:t>
+        <w:t xml:space="preserve"> </w:t>
+      </w:r>
+      <w:r>
+        <w:t xml:space="preserve">buttons at the top left to collapse or expand every quarter.</w:t>
       </w:r>
     </w:p>
     <w:p>
@@ -1751,7 +2194,13 @@
         <w:t xml:space="preserve">Blocks:</w:t>
       </w:r>
       <w:r>
-        <w:t xml:space="preserve"> MP, OM, EQ, CO and OTHER. Each block ends with </w:t>
+        <w:t xml:space="preserve"> </w:t>
+      </w:r>
+      <w:r>
+        <w:t xml:space="preserve">MP, OM, EQ, CO and OTHER. Each block ends with</w:t>
+      </w:r>
+      <w:r>
+        <w:t xml:space="preserve"> </w:t>
       </w:r>
       <w:r>
         <w:rPr>
@@ -1761,7 +2210,10 @@
         <w:t xml:space="preserve">Projected</w:t>
       </w:r>
       <w:r>
-        <w:t xml:space="preserve">, </w:t>
+        <w:t xml:space="preserve">,</w:t>
+      </w:r>
+      <w:r>
+        <w:t xml:space="preserve"> </w:t>
       </w:r>
       <w:r>
         <w:rPr>
@@ -1771,7 +2223,10 @@
         <w:t xml:space="preserve">Actual</w:t>
       </w:r>
       <w:r>
-        <w:t xml:space="preserve">, </w:t>
+        <w:t xml:space="preserve">,</w:t>
+      </w:r>
+      <w:r>
+        <w:t xml:space="preserve"> </w:t>
       </w:r>
       <w:r>
         <w:rPr>
@@ -1781,7 +2236,13 @@
         <w:t xml:space="preserve">Variance ($)</w:t>
       </w:r>
       <w:r>
-        <w:t xml:space="preserve"> and </w:t>
+        <w:t xml:space="preserve"> </w:t>
+      </w:r>
+      <w:r>
+        <w:t xml:space="preserve">and</w:t>
+      </w:r>
+      <w:r>
+        <w:t xml:space="preserve"> </w:t>
       </w:r>
       <w:r>
         <w:rPr>
@@ -1791,7 +2252,10 @@
         <w:t xml:space="preserve">Variance (%)</w:t>
       </w:r>
       <w:r>
-        <w:t xml:space="preserve">. The </w:t>
+        <w:t xml:space="preserve">. The</w:t>
+      </w:r>
+      <w:r>
+        <w:t xml:space="preserve"> </w:t>
       </w:r>
       <w:r>
         <w:rPr>
@@ -1801,7 +2265,10 @@
         <w:t xml:space="preserve">PROJECT TOTAL</w:t>
       </w:r>
       <w:r>
-        <w:t xml:space="preserve"> rows are at the bottom.</w:t>
+        <w:t xml:space="preserve"> </w:t>
+      </w:r>
+      <w:r>
+        <w:t xml:space="preserve">rows are at the bottom.</w:t>
       </w:r>
     </w:p>
     <w:p>
@@ -1820,7 +2287,13 @@
         <w:t xml:space="preserve">Variance</w:t>
       </w:r>
       <w:r>
-        <w:t xml:space="preserve"> = Actual − Projected; a positive figure means overspend. It’s shown only up to the </w:t>
+        <w:t xml:space="preserve"> </w:t>
+      </w:r>
+      <w:r>
+        <w:t xml:space="preserve">= Actual − Projected; a positive figure means overspend. It’s shown only up to the</w:t>
+      </w:r>
+      <w:r>
+        <w:t xml:space="preserve"> </w:t>
       </w:r>
       <w:r>
         <w:rPr>
@@ -1830,7 +2303,10 @@
         <w:t xml:space="preserve">Latest SOA Month</w:t>
       </w:r>
       <w:r>
-        <w:t xml:space="preserve"> (C9), so future plans don’t look like underspend.</w:t>
+        <w:t xml:space="preserve"> </w:t>
+      </w:r>
+      <w:r>
+        <w:t xml:space="preserve">(C9), so future plans don’t look like underspend.</w:t>
       </w:r>
     </w:p>
     <w:p>
@@ -1849,7 +2325,10 @@
         <w:t xml:space="preserve">Grey MP rows,</w:t>
       </w:r>
       <w:r>
-        <w:t xml:space="preserve"> e.g. </w:t>
+        <w:t xml:space="preserve"> </w:t>
+      </w:r>
+      <w:r>
+        <w:t xml:space="preserve">e.g. </w:t>
       </w:r>
       <w:r>
         <w:rPr>
@@ -1858,7 +2337,10 @@
         <w:t xml:space="preserve">RA (Projected)</w:t>
       </w:r>
       <w:r>
-        <w:t xml:space="preserve">, are manpower projections (FTE × rate). They come from the manpower sheet and </w:t>
+        <w:t xml:space="preserve">, are manpower projections (FTE × rate). They come from the manpower sheet and</w:t>
+      </w:r>
+      <w:r>
+        <w:t xml:space="preserve"> </w:t>
       </w:r>
       <w:r>
         <w:rPr>
@@ -1890,7 +2372,10 @@
         <w:pStyle w:val="Compact"/>
       </w:pPr>
       <w:r>
-        <w:t xml:space="preserve">Type monthly amounts in the </w:t>
+        <w:t xml:space="preserve">Type monthly amounts in the</w:t>
+      </w:r>
+      <w:r>
+        <w:t xml:space="preserve"> </w:t>
       </w:r>
       <w:r>
         <w:rPr>
@@ -1912,7 +2397,10 @@
         <w:pStyle w:val="Compact"/>
       </w:pPr>
       <w:r>
-        <w:t xml:space="preserve">A </w:t>
+        <w:t xml:space="preserve">A</w:t>
+      </w:r>
+      <w:r>
+        <w:t xml:space="preserve"> </w:t>
       </w:r>
       <w:r>
         <w:rPr>
@@ -1922,7 +2410,13 @@
         <w:t xml:space="preserve">blank</w:t>
       </w:r>
       <w:r>
-        <w:t xml:space="preserve"> cell means no projection. </w:t>
+        <w:t xml:space="preserve"> </w:t>
+      </w:r>
+      <w:r>
+        <w:t xml:space="preserve">cell means no projection.</w:t>
+      </w:r>
+      <w:r>
+        <w:t xml:space="preserve"> </w:t>
       </w:r>
       <w:r>
         <w:rPr>
@@ -1932,7 +2426,10 @@
         <w:t xml:space="preserve">0</w:t>
       </w:r>
       <w:r>
-        <w:t xml:space="preserve"> is saved as 0.</w:t>
+        <w:t xml:space="preserve"> </w:t>
+      </w:r>
+      <w:r>
+        <w:t xml:space="preserve">is saved as 0.</w:t>
       </w:r>
     </w:p>
     <w:p>
@@ -1948,12 +2445,75 @@
       </w:r>
     </w:p>
     <w:bookmarkEnd w:id="33"/>
-    <w:bookmarkStart w:id="34" w:name="save"/>
+    <w:bookmarkStart w:id="34" w:name="remarks"/>
     <w:p>
       <w:pPr>
         <w:pStyle w:val="Heading3"/>
       </w:pPr>
       <w:r>
+        <w:t xml:space="preserve">Remarks</w:t>
+      </w:r>
+    </w:p>
+    <w:p>
+      <w:pPr>
+        <w:numPr>
+          <w:ilvl w:val="0"/>
+          <w:numId w:val="1015"/>
+        </w:numPr>
+        <w:pStyle w:val="Compact"/>
+      </w:pPr>
+      <w:r>
+        <w:t xml:space="preserve">Type a note in the yellow</w:t>
+      </w:r>
+      <w:r>
+        <w:t xml:space="preserve"> </w:t>
+      </w:r>
+      <w:r>
+        <w:rPr>
+          <w:bCs/>
+          <w:b/>
+        </w:rPr>
+        <w:t xml:space="preserve">Remarks</w:t>
+      </w:r>
+      <w:r>
+        <w:t xml:space="preserve"> </w:t>
+      </w:r>
+      <w:r>
+        <w:t xml:space="preserve">cell at the end of any line row, after Project Total. Long remarks wrap and the row grows.</w:t>
+      </w:r>
+    </w:p>
+    <w:p>
+      <w:pPr>
+        <w:numPr>
+          <w:ilvl w:val="0"/>
+          <w:numId w:val="1015"/>
+        </w:numPr>
+        <w:pStyle w:val="Compact"/>
+      </w:pPr>
+      <w:r>
+        <w:t xml:space="preserve">Remarks are saved with</w:t>
+      </w:r>
+      <w:r>
+        <w:t xml:space="preserve"> </w:t>
+      </w:r>
+      <w:r>
+        <w:rPr>
+          <w:bCs/>
+          <w:b/>
+        </w:rPr>
+        <w:t xml:space="preserve">Save Projections</w:t>
+      </w:r>
+      <w:r>
+        <w:t xml:space="preserve">, separately for each project, and come back when you load the project again. An edited remark counts as an unsaved change.</w:t>
+      </w:r>
+    </w:p>
+    <w:bookmarkEnd w:id="34"/>
+    <w:bookmarkStart w:id="35" w:name="save"/>
+    <w:p>
+      <w:pPr>
+        <w:pStyle w:val="Heading3"/>
+      </w:pPr>
+      <w:r>
         <w:t xml:space="preserve">Save</w:t>
       </w:r>
     </w:p>
@@ -1961,12 +2521,15 @@
       <w:pPr>
         <w:numPr>
           <w:ilvl w:val="0"/>
-          <w:numId w:val="1015"/>
-        </w:numPr>
-        <w:pStyle w:val="Compact"/>
-      </w:pPr>
-      <w:r>
-        <w:t xml:space="preserve">Click </w:t>
+          <w:numId w:val="1016"/>
+        </w:numPr>
+        <w:pStyle w:val="Compact"/>
+      </w:pPr>
+      <w:r>
+        <w:t xml:space="preserve">Click</w:t>
+      </w:r>
+      <w:r>
+        <w:t xml:space="preserve"> </w:t>
       </w:r>
       <w:r>
         <w:rPr>
@@ -1976,26 +2539,43 @@
         <w:t xml:space="preserve">Save Projections</w:t>
       </w:r>
       <w:r>
-        <w:t xml:space="preserve">. Only this project’s saved amounts are replaced.</w:t>
-      </w:r>
-    </w:p>
-    <w:p>
-      <w:pPr>
-        <w:numPr>
-          <w:ilvl w:val="0"/>
-          <w:numId w:val="1015"/>
-        </w:numPr>
-        <w:pStyle w:val="Compact"/>
-      </w:pPr>
-      <w:r>
-        <w:t xml:space="preserve">If you switch project with unsaved changes, Excel asks </w:t>
-      </w:r>
-      <w:r>
-        <w:rPr>
-          <w:bCs/>
-          <w:b/>
-        </w:rPr>
-        <w:t xml:space="preserve">“Save changes to … first?”</w:t>
+        <w:t xml:space="preserve">. Only this project’s saved amounts and remarks are replaced.</w:t>
+      </w:r>
+    </w:p>
+    <w:p>
+      <w:pPr>
+        <w:numPr>
+          <w:ilvl w:val="0"/>
+          <w:numId w:val="1016"/>
+        </w:numPr>
+        <w:pStyle w:val="Compact"/>
+      </w:pPr>
+      <w:r>
+        <w:t xml:space="preserve">If you switch project with unsaved changes, Excel asks</w:t>
+      </w:r>
+      <w:r>
+        <w:t xml:space="preserve"> </w:t>
+      </w:r>
+      <w:r>
+        <w:rPr>
+          <w:bCs/>
+          <w:b/>
+        </w:rPr>
+        <w:t xml:space="preserve">“</w:t>
+      </w:r>
+      <w:r>
+        <w:rPr>
+          <w:bCs/>
+          <w:b/>
+        </w:rPr>
+        <w:t xml:space="preserve">Save changes to … first?</w:t>
+      </w:r>
+      <w:r>
+        <w:rPr>
+          <w:bCs/>
+          <w:b/>
+        </w:rPr>
+        <w:t xml:space="preserve">”</w:t>
       </w:r>
       <w:r>
         <w:t xml:space="preserve">:</w:t>
@@ -2005,209 +2585,605 @@
       <w:pPr>
         <w:numPr>
           <w:ilvl w:val="1"/>
+          <w:numId w:val="1017"/>
+        </w:numPr>
+        <w:pStyle w:val="Compact"/>
+      </w:pPr>
+      <w:r>
+        <w:rPr>
+          <w:bCs/>
+          <w:b/>
+        </w:rPr>
+        <w:t xml:space="preserve">Yes</w:t>
+      </w:r>
+      <w:r>
+        <w:t xml:space="preserve"> </w:t>
+      </w:r>
+      <w:r>
+        <w:t xml:space="preserve">saves;</w:t>
+      </w:r>
+    </w:p>
+    <w:p>
+      <w:pPr>
+        <w:numPr>
+          <w:ilvl w:val="1"/>
+          <w:numId w:val="1017"/>
+        </w:numPr>
+        <w:pStyle w:val="Compact"/>
+      </w:pPr>
+      <w:r>
+        <w:rPr>
+          <w:bCs/>
+          <w:b/>
+        </w:rPr>
+        <w:t xml:space="preserve">No</w:t>
+      </w:r>
+      <w:r>
+        <w:t xml:space="preserve"> </w:t>
+      </w:r>
+      <w:r>
+        <w:t xml:space="preserve">discards the changes;</w:t>
+      </w:r>
+    </w:p>
+    <w:p>
+      <w:pPr>
+        <w:numPr>
+          <w:ilvl w:val="1"/>
+          <w:numId w:val="1017"/>
+        </w:numPr>
+        <w:pStyle w:val="Compact"/>
+      </w:pPr>
+      <w:r>
+        <w:rPr>
+          <w:bCs/>
+          <w:b/>
+        </w:rPr>
+        <w:t xml:space="preserve">Cancel</w:t>
+      </w:r>
+      <w:r>
+        <w:t xml:space="preserve"> </w:t>
+      </w:r>
+      <w:r>
+        <w:t xml:space="preserve">stays on the current project.</w:t>
+      </w:r>
+    </w:p>
+    <w:p>
+      <w:pPr>
+        <w:numPr>
+          <w:ilvl w:val="0"/>
           <w:numId w:val="1016"/>
         </w:numPr>
         <w:pStyle w:val="Compact"/>
       </w:pPr>
       <w:r>
-        <w:rPr>
-          <w:bCs/>
-          <w:b/>
-        </w:rPr>
-        <w:t xml:space="preserve">Yes</w:t>
-      </w:r>
-      <w:r>
-        <w:t xml:space="preserve"> saves;</w:t>
+        <w:t xml:space="preserve">If someone else saved this project after you loaded it, you’re asked whether to</w:t>
+      </w:r>
+      <w:r>
+        <w:t xml:space="preserve"> </w:t>
+      </w:r>
+      <w:r>
+        <w:rPr>
+          <w:bCs/>
+          <w:b/>
+        </w:rPr>
+        <w:t xml:space="preserve">overwrite</w:t>
+      </w:r>
+      <w:r>
+        <w:t xml:space="preserve"> </w:t>
+      </w:r>
+      <w:r>
+        <w:t xml:space="preserve">their save.</w:t>
+      </w:r>
+    </w:p>
+    <w:p>
+      <w:pPr>
+        <w:numPr>
+          <w:ilvl w:val="0"/>
+          <w:numId w:val="1016"/>
+        </w:numPr>
+        <w:pStyle w:val="Compact"/>
+      </w:pPr>
+      <w:r>
+        <w:t xml:space="preserve">If you changed E6/F6 without clicking Load Project, saving is blocked with</w:t>
+      </w:r>
+      <w:r>
+        <w:t xml:space="preserve"> </w:t>
+      </w:r>
+      <w:r>
+        <w:rPr>
+          <w:bCs/>
+          <w:b/>
+        </w:rPr>
+        <w:t xml:space="preserve">“</w:t>
+      </w:r>
+      <w:r>
+        <w:rPr>
+          <w:bCs/>
+          <w:b/>
+        </w:rPr>
+        <w:t xml:space="preserve">Selection changed — reload first</w:t>
+      </w:r>
+      <w:r>
+        <w:rPr>
+          <w:bCs/>
+          <w:b/>
+        </w:rPr>
+        <w:t xml:space="preserve">”</w:t>
+      </w:r>
+      <w:r>
+        <w:t xml:space="preserve">.</w:t>
+      </w:r>
+    </w:p>
+    <w:bookmarkEnd w:id="35"/>
+    <w:bookmarkStart w:id="36" w:name="unmatched-rows"/>
+    <w:p>
+      <w:pPr>
+        <w:pStyle w:val="Heading3"/>
+      </w:pPr>
+      <w:r>
+        <w:t xml:space="preserve">Unmatched rows</w:t>
+      </w:r>
+    </w:p>
+    <w:p>
+      <w:pPr>
+        <w:pStyle w:val="FirstParagraph"/>
+      </w:pPr>
+      <w:r>
+        <w:t xml:space="preserve">Italic rows starting</w:t>
+      </w:r>
+      <w:r>
+        <w:t xml:space="preserve"> </w:t>
+      </w:r>
+      <w:r>
+        <w:rPr>
+          <w:bCs/>
+          <w:b/>
+        </w:rPr>
+        <w:t xml:space="preserve">“</w:t>
+      </w:r>
+      <w:r>
+        <w:rPr>
+          <w:bCs/>
+          <w:b/>
+        </w:rPr>
+        <w:t xml:space="preserve">Unmatched:</w:t>
+      </w:r>
+      <w:r>
+        <w:rPr>
+          <w:bCs/>
+          <w:b/>
+        </w:rPr>
+        <w:t xml:space="preserve">”</w:t>
+      </w:r>
+      <w:r>
+        <w:t xml:space="preserve"> </w:t>
+      </w:r>
+      <w:r>
+        <w:t xml:space="preserve">hold saved amounts, or a saved remark, that no longer fit the grid. This happens when:</w:t>
+      </w:r>
+      <w:r>
+        <w:t xml:space="preserve"> </w:t>
+      </w:r>
+      <w:r>
+        <w:t xml:space="preserve">- a budget line was renamed or removed in SOA;</w:t>
+      </w:r>
+      <w:r>
+        <w:t xml:space="preserve"> </w:t>
+      </w:r>
+      <w:r>
+        <w:t xml:space="preserve">- a line now nets to $0; or</w:t>
+      </w:r>
+      <w:r>
+        <w:t xml:space="preserve"> </w:t>
+      </w:r>
+      <w:r>
+        <w:t xml:space="preserve">- a month falls outside the project dates.</w:t>
+      </w:r>
+    </w:p>
+    <w:p>
+      <w:pPr>
+        <w:pStyle w:val="BodyText"/>
+      </w:pPr>
+      <w:r>
+        <w:t xml:space="preserve">These amounts still</w:t>
+      </w:r>
+      <w:r>
+        <w:t xml:space="preserve"> </w:t>
+      </w:r>
+      <w:r>
+        <w:rPr>
+          <w:bCs/>
+          <w:b/>
+        </w:rPr>
+        <w:t xml:space="preserve">count in the totals</w:t>
+      </w:r>
+      <w:r>
+        <w:t xml:space="preserve">. A line’s remark follows it to its Unmatched row; a row that holds only a remark says</w:t>
+      </w:r>
+      <w:r>
+        <w:t xml:space="preserve"> </w:t>
+      </w:r>
+      <w:r>
+        <w:t xml:space="preserve">“</w:t>
+      </w:r>
+      <w:r>
+        <w:t xml:space="preserve">remark only</w:t>
+      </w:r>
+      <w:r>
+        <w:t xml:space="preserve">”</w:t>
+      </w:r>
+      <w:r>
+        <w:t xml:space="preserve">.</w:t>
+      </w:r>
+      <w:r>
+        <w:t xml:space="preserve"> </w:t>
+      </w:r>
+      <w:r>
+        <w:t xml:space="preserve">-</w:t>
+      </w:r>
+      <w:r>
+        <w:t xml:space="preserve"> </w:t>
+      </w:r>
+      <w:r>
+        <w:rPr>
+          <w:bCs/>
+          <w:b/>
+        </w:rPr>
+        <w:t xml:space="preserve">Re-assign:</w:t>
+      </w:r>
+      <w:r>
+        <w:t xml:space="preserve"> </w:t>
+      </w:r>
+      <w:r>
+        <w:t xml:space="preserve">click a cell in the Unmatched row, click</w:t>
+      </w:r>
+      <w:r>
+        <w:t xml:space="preserve"> </w:t>
+      </w:r>
+      <w:r>
+        <w:rPr>
+          <w:bCs/>
+          <w:b/>
+        </w:rPr>
+        <w:t xml:space="preserve">Re-assign unmatched</w:t>
+      </w:r>
+      <w:r>
+        <w:t xml:space="preserve">, then click any cell in the budget line that should get the amounts. The remark moves too and is added after any remark already on that line.</w:t>
+      </w:r>
+      <w:r>
+        <w:t xml:space="preserve"> </w:t>
+      </w:r>
+      <w:r>
+        <w:t xml:space="preserve">-</w:t>
+      </w:r>
+      <w:r>
+        <w:t xml:space="preserve"> </w:t>
+      </w:r>
+      <w:r>
+        <w:rPr>
+          <w:bCs/>
+          <w:b/>
+        </w:rPr>
+        <w:t xml:space="preserve">Delete:</w:t>
+      </w:r>
+      <w:r>
+        <w:t xml:space="preserve"> </w:t>
+      </w:r>
+      <w:r>
+        <w:t xml:space="preserve">click a cell in the Unmatched row, then click</w:t>
+      </w:r>
+      <w:r>
+        <w:t xml:space="preserve"> </w:t>
+      </w:r>
+      <w:r>
+        <w:rPr>
+          <w:bCs/>
+          <w:b/>
+        </w:rPr>
+        <w:t xml:space="preserve">Delete unmatched</w:t>
+      </w:r>
+      <w:r>
+        <w:t xml:space="preserve"> </w:t>
+      </w:r>
+      <w:r>
+        <w:t xml:space="preserve">and confirm. The remark is deleted too.</w:t>
+      </w:r>
+      <w:r>
+        <w:t xml:space="preserve"> </w:t>
+      </w:r>
+      <w:r>
+        <w:t xml:space="preserve">- In the</w:t>
+      </w:r>
+      <w:r>
+        <w:t xml:space="preserve"> </w:t>
+      </w:r>
+      <w:r>
+        <w:rPr>
+          <w:bCs/>
+          <w:b/>
+        </w:rPr>
+        <w:t xml:space="preserve">MP</w:t>
+      </w:r>
+      <w:r>
+        <w:t xml:space="preserve"> </w:t>
+      </w:r>
+      <w:r>
+        <w:t xml:space="preserve">block there are no typed lines, so an Unmatched row there can only be deleted. Copy its remark first if you still need it.</w:t>
+      </w:r>
+    </w:p>
+    <w:bookmarkEnd w:id="36"/>
+    <w:bookmarkStart w:id="37" w:name="X123e25bff91fc87ad52e6c819a310f4f949830c"/>
+    <w:p>
+      <w:pPr>
+        <w:pStyle w:val="Heading3"/>
+      </w:pPr>
+      <w:r>
+        <w:t xml:space="preserve">Charge a manpower line to another category (admin)</w:t>
+      </w:r>
+    </w:p>
+    <w:p>
+      <w:pPr>
+        <w:numPr>
+          <w:ilvl w:val="0"/>
+          <w:numId w:val="1018"/>
+        </w:numPr>
+        <w:pStyle w:val="Compact"/>
+      </w:pPr>
+      <w:r>
+        <w:t xml:space="preserve">On the</w:t>
+      </w:r>
+      <w:r>
+        <w:t xml:space="preserve"> </w:t>
+      </w:r>
+      <w:r>
+        <w:rPr>
+          <w:bCs/>
+          <w:b/>
+        </w:rPr>
+        <w:t xml:space="preserve">Dashboard_Settings</w:t>
+      </w:r>
+      <w:r>
+        <w:t xml:space="preserve"> </w:t>
+      </w:r>
+      <w:r>
+        <w:t xml:space="preserve">sheet, add a row to the table with:</w:t>
       </w:r>
     </w:p>
     <w:p>
       <w:pPr>
         <w:numPr>
           <w:ilvl w:val="1"/>
-          <w:numId w:val="1016"/>
-        </w:numPr>
-        <w:pStyle w:val="Compact"/>
-      </w:pPr>
-      <w:r>
-        <w:rPr>
-          <w:bCs/>
-          <w:b/>
-        </w:rPr>
-        <w:t xml:space="preserve">No</w:t>
-      </w:r>
-      <w:r>
-        <w:t xml:space="preserve"> discards the changes;</w:t>
+          <w:numId w:val="1019"/>
+        </w:numPr>
+        <w:pStyle w:val="Compact"/>
+      </w:pPr>
+      <w:r>
+        <w:t xml:space="preserve">Source Project, Main IO;</w:t>
       </w:r>
     </w:p>
     <w:p>
       <w:pPr>
         <w:numPr>
           <w:ilvl w:val="1"/>
-          <w:numId w:val="1016"/>
-        </w:numPr>
-        <w:pStyle w:val="Compact"/>
-      </w:pPr>
-      <w:r>
-        <w:rPr>
-          <w:bCs/>
-          <w:b/>
-        </w:rPr>
-        <w:t xml:space="preserve">Cancel</w:t>
-      </w:r>
-      <w:r>
-        <w:t xml:space="preserve"> stays on the current project.</w:t>
-      </w:r>
-    </w:p>
-    <w:p>
-      <w:pPr>
-        <w:numPr>
-          <w:ilvl w:val="0"/>
-          <w:numId w:val="1015"/>
-        </w:numPr>
-        <w:pStyle w:val="Compact"/>
-      </w:pPr>
-      <w:r>
-        <w:t xml:space="preserve">If someone else saved this project after you loaded it, you’re asked whether to </w:t>
-      </w:r>
-      <w:r>
-        <w:rPr>
-          <w:bCs/>
-          <w:b/>
-        </w:rPr>
-        <w:t xml:space="preserve">overwrite</w:t>
-      </w:r>
-      <w:r>
-        <w:t xml:space="preserve"> their save.</w:t>
-      </w:r>
-    </w:p>
-    <w:p>
-      <w:pPr>
-        <w:numPr>
-          <w:ilvl w:val="0"/>
-          <w:numId w:val="1015"/>
-        </w:numPr>
-        <w:pStyle w:val="Compact"/>
-      </w:pPr>
-      <w:r>
-        <w:t xml:space="preserve">If you changed E6/F6 without clicking Load Project, saving is blocked with </w:t>
-      </w:r>
-      <w:r>
-        <w:rPr>
-          <w:bCs/>
-          <w:b/>
-        </w:rPr>
-        <w:t xml:space="preserve">“Selection changed — reload first”</w:t>
-      </w:r>
-      <w:r>
-        <w:t xml:space="preserve">.</w:t>
-      </w:r>
-    </w:p>
-    <w:bookmarkEnd w:id="34"/>
-    <w:bookmarkStart w:id="35" w:name="unmatched-rows"/>
-    <w:p>
-      <w:pPr>
-        <w:pStyle w:val="Heading3"/>
-      </w:pPr>
-      <w:r>
-        <w:t xml:space="preserve">Unmatched rows</w:t>
-      </w:r>
-    </w:p>
-    <w:p>
-      <w:pPr>
-        <w:pStyle w:val="FirstParagraph"/>
-      </w:pPr>
-      <w:r>
-        <w:t xml:space="preserve">Italic rows starting </w:t>
-      </w:r>
-      <w:r>
-        <w:rPr>
-          <w:bCs/>
-          <w:b/>
-        </w:rPr>
-        <w:t xml:space="preserve">“Unmatched:”</w:t>
-      </w:r>
-      <w:r>
-        <w:t xml:space="preserve"> hold saved amounts that no longer fit the grid. This happens when: - a budget line was renamed or removed in SOA; - a line now nets to $0; or - a month falls outside the project dates.</w:t>
-      </w:r>
-    </w:p>
-    <w:p>
-      <w:pPr>
-        <w:pStyle w:val="BodyText"/>
-      </w:pPr>
-      <w:r>
-        <w:t xml:space="preserve">These amounts still </w:t>
-      </w:r>
-      <w:r>
-        <w:rPr>
-          <w:bCs/>
-          <w:b/>
-        </w:rPr>
-        <w:t xml:space="preserve">count in the totals</w:t>
-      </w:r>
-      <w:r>
-        <w:t xml:space="preserve">. - </w:t>
-      </w:r>
-      <w:r>
-        <w:rPr>
-          <w:bCs/>
-          <w:b/>
-        </w:rPr>
-        <w:t xml:space="preserve">Re-assign:</w:t>
-      </w:r>
-      <w:r>
-        <w:t xml:space="preserve"> click a cell in the Unmatched row, click </w:t>
-      </w:r>
-      <w:r>
-        <w:rPr>
-          <w:bCs/>
-          <w:b/>
-        </w:rPr>
-        <w:t xml:space="preserve">Re-assign unmatched</w:t>
-      </w:r>
-      <w:r>
-        <w:t xml:space="preserve">, then click any cell in the budget line that should get the amounts. - </w:t>
-      </w:r>
-      <w:r>
-        <w:rPr>
-          <w:bCs/>
-          <w:b/>
-        </w:rPr>
-        <w:t xml:space="preserve">Delete:</w:t>
-      </w:r>
-      <w:r>
-        <w:t xml:space="preserve"> click a cell in the Unmatched row, then click </w:t>
-      </w:r>
-      <w:r>
-        <w:rPr>
-          <w:bCs/>
-          <w:b/>
-        </w:rPr>
-        <w:t xml:space="preserve">Delete unmatched</w:t>
-      </w:r>
-      <w:r>
-        <w:t xml:space="preserve"> and confirm.</w:t>
-      </w:r>
-    </w:p>
-    <w:bookmarkEnd w:id="35"/>
-    <w:bookmarkStart w:id="36" w:name="X123e25bff91fc87ad52e6c819a310f4f949830c"/>
-    <w:p>
-      <w:pPr>
-        <w:pStyle w:val="Heading3"/>
-      </w:pPr>
-      <w:r>
-        <w:t xml:space="preserve">Charge a manpower line to another category (admin)</w:t>
-      </w:r>
-    </w:p>
-    <w:p>
-      <w:pPr>
-        <w:numPr>
-          <w:ilvl w:val="0"/>
-          <w:numId w:val="1017"/>
-        </w:numPr>
-        <w:pStyle w:val="Compact"/>
-      </w:pPr>
-      <w:r>
-        <w:t xml:space="preserve">On the </w:t>
+          <w:numId w:val="1019"/>
+        </w:numPr>
+        <w:pStyle w:val="Compact"/>
+      </w:pPr>
+      <w:r>
+        <w:t xml:space="preserve">Rate Category, e.g. </w:t>
+      </w:r>
+      <w:r>
+        <w:rPr>
+          <w:rStyle w:val="VerbatimChar"/>
+        </w:rPr>
+        <w:t xml:space="preserve">AHS</w:t>
+      </w:r>
+      <w:r>
+        <w:t xml:space="preserve">;</w:t>
+      </w:r>
+    </w:p>
+    <w:p>
+      <w:pPr>
+        <w:numPr>
+          <w:ilvl w:val="1"/>
+          <w:numId w:val="1019"/>
+        </w:numPr>
+        <w:pStyle w:val="Compact"/>
+      </w:pPr>
+      <w:r>
+        <w:t xml:space="preserve">the manpower IO Code, e.g. </w:t>
+      </w:r>
+      <w:r>
+        <w:rPr>
+          <w:rStyle w:val="VerbatimChar"/>
+        </w:rPr>
+        <w:t xml:space="preserve">TF25HIP136MP</w:t>
+      </w:r>
+      <w:r>
+        <w:t xml:space="preserve">;</w:t>
+      </w:r>
+    </w:p>
+    <w:p>
+      <w:pPr>
+        <w:numPr>
+          <w:ilvl w:val="1"/>
+          <w:numId w:val="1019"/>
+        </w:numPr>
+        <w:pStyle w:val="Compact"/>
+      </w:pPr>
+      <w:r>
+        <w:rPr>
+          <w:bCs/>
+          <w:b/>
+        </w:rPr>
+        <w:t xml:space="preserve">Charge To</w:t>
+      </w:r>
+      <w:r>
+        <w:t xml:space="preserve"> </w:t>
+      </w:r>
+      <w:r>
+        <w:t xml:space="preserve">(MP, OM, EQ, CO or OTHER).</w:t>
+      </w:r>
+    </w:p>
+    <w:p>
+      <w:pPr>
+        <w:numPr>
+          <w:ilvl w:val="0"/>
+          <w:numId w:val="1018"/>
+        </w:numPr>
+        <w:pStyle w:val="Compact"/>
+      </w:pPr>
+      <w:r>
+        <w:t xml:space="preserve">The next Load moves that line into that block as a locked row.</w:t>
+      </w:r>
+    </w:p>
+    <w:bookmarkEnd w:id="37"/>
+    <w:bookmarkEnd w:id="38"/>
+    <w:bookmarkStart w:id="39" w:name="what-changed-from-v0.8"/>
+    <w:p>
+      <w:pPr>
+        <w:pStyle w:val="Heading2"/>
+      </w:pPr>
+      <w:r>
+        <w:t xml:space="preserve">5. What changed from v0.8</w:t>
+      </w:r>
+    </w:p>
+    <w:p>
+      <w:pPr>
+        <w:numPr>
+          <w:ilvl w:val="0"/>
+          <w:numId w:val="1020"/>
+        </w:numPr>
+        <w:pStyle w:val="Compact"/>
+      </w:pPr>
+      <w:r>
+        <w:t xml:space="preserve">The old fixed timeline, the Manual Projection table, the Patient Reimbursement table and the C5 Project Display Name selector are retired.</w:t>
+      </w:r>
+    </w:p>
+    <w:p>
+      <w:pPr>
+        <w:numPr>
+          <w:ilvl w:val="1"/>
+          <w:numId w:val="1021"/>
+        </w:numPr>
+        <w:pStyle w:val="Compact"/>
+      </w:pPr>
+      <w:r>
+        <w:t xml:space="preserve">A full copy of the v0.8 dashboard is kept on a hidden sheet,</w:t>
+      </w:r>
+      <w:r>
+        <w:t xml:space="preserve"> </w:t>
+      </w:r>
+      <w:r>
+        <w:rPr>
+          <w:bCs/>
+          <w:b/>
+        </w:rPr>
+        <w:t xml:space="preserve">Legacy_Timeline</w:t>
+      </w:r>
+      <w:r>
+        <w:t xml:space="preserve">, for comparison during testing. To view it: right-click any sheet tab →</w:t>
+      </w:r>
+      <w:r>
+        <w:t xml:space="preserve"> </w:t>
+      </w:r>
+      <w:r>
+        <w:rPr>
+          <w:bCs/>
+          <w:b/>
+        </w:rPr>
+        <w:t xml:space="preserve">Unhide</w:t>
+      </w:r>
+      <w:r>
+        <w:t xml:space="preserve"> </w:t>
+      </w:r>
+      <w:r>
+        <w:t xml:space="preserve">→ Legacy_Timeline.</w:t>
+      </w:r>
+    </w:p>
+    <w:p>
+      <w:pPr>
+        <w:numPr>
+          <w:ilvl w:val="0"/>
+          <w:numId w:val="1020"/>
+        </w:numPr>
+        <w:pStyle w:val="Compact"/>
+      </w:pPr>
+      <w:r>
+        <w:t xml:space="preserve">The KPI cards now read the new timeline totals.</w:t>
+      </w:r>
+    </w:p>
+    <w:p>
+      <w:pPr>
+        <w:numPr>
+          <w:ilvl w:val="0"/>
+          <w:numId w:val="1020"/>
+        </w:numPr>
+        <w:pStyle w:val="Compact"/>
+      </w:pPr>
+      <w:r>
+        <w:t xml:space="preserve">The manpower table and sheet keep their v0.8 names,</w:t>
+      </w:r>
+      <w:r>
+        <w:t xml:space="preserve"> </w:t>
+      </w:r>
+      <w:r>
+        <w:rPr>
+          <w:rStyle w:val="VerbatimChar"/>
+          <w:bCs/>
+          <w:b/>
+        </w:rPr>
+        <w:t xml:space="preserve">qManpower_SelectedTest</w:t>
+      </w:r>
+      <w:r>
+        <w:t xml:space="preserve"> </w:t>
+      </w:r>
+      <w:r>
+        <w:t xml:space="preserve">/</w:t>
+      </w:r>
+      <w:r>
+        <w:t xml:space="preserve"> </w:t>
+      </w:r>
+      <w:r>
+        <w:rPr>
+          <w:rStyle w:val="VerbatimChar"/>
+          <w:bCs/>
+          <w:b/>
+        </w:rPr>
+        <w:t xml:space="preserve">PQManpower_SelectedTest</w:t>
+      </w:r>
+      <w:r>
+        <w:t xml:space="preserve">. If you want them renamed to match the other selected-test tables, do it in Excel (Table Design → Table Name; right-click the sheet tab → Rename), never by editing the file, and ask for the VBA constant</w:t>
+      </w:r>
+      <w:r>
+        <w:t xml:space="preserve"> </w:t>
+      </w:r>
+      <w:r>
+        <w:rPr>
+          <w:rStyle w:val="VerbatimChar"/>
+        </w:rPr>
+        <w:t xml:space="preserve">MANPOWER_TABLE</w:t>
+      </w:r>
+      <w:r>
+        <w:t xml:space="preserve"> </w:t>
+      </w:r>
+      <w:r>
+        <w:t xml:space="preserve">to be updated.</w:t>
+      </w:r>
+    </w:p>
+    <w:p>
+      <w:pPr>
+        <w:numPr>
+          <w:ilvl w:val="0"/>
+          <w:numId w:val="1020"/>
+        </w:numPr>
+        <w:pStyle w:val="Compact"/>
+      </w:pPr>
+      <w:r>
+        <w:t xml:space="preserve">New sheets:</w:t>
+      </w:r>
+      <w:r>
+        <w:t xml:space="preserve"> </w:t>
       </w:r>
       <w:r>
         <w:rPr>
@@ -2217,250 +3193,36 @@
         <w:t xml:space="preserve">Dashboard_Settings</w:t>
       </w:r>
       <w:r>
-        <w:t xml:space="preserve"> sheet, add a row to the table with:</w:t>
-      </w:r>
-    </w:p>
-    <w:p>
-      <w:pPr>
-        <w:numPr>
-          <w:ilvl w:val="1"/>
-          <w:numId w:val="1018"/>
-        </w:numPr>
-        <w:pStyle w:val="Compact"/>
-      </w:pPr>
-      <w:r>
-        <w:t xml:space="preserve">Source Project, Main IO;</w:t>
-      </w:r>
-    </w:p>
-    <w:p>
-      <w:pPr>
-        <w:numPr>
-          <w:ilvl w:val="1"/>
-          <w:numId w:val="1018"/>
-        </w:numPr>
-        <w:pStyle w:val="Compact"/>
-      </w:pPr>
-      <w:r>
-        <w:t xml:space="preserve">Rate Category, e.g. </w:t>
-      </w:r>
-      <w:r>
-        <w:rPr>
-          <w:rStyle w:val="VerbatimChar"/>
-        </w:rPr>
-        <w:t xml:space="preserve">AHS</w:t>
-      </w:r>
-      <w:r>
-        <w:t xml:space="preserve">;</w:t>
-      </w:r>
-    </w:p>
-    <w:p>
-      <w:pPr>
-        <w:numPr>
-          <w:ilvl w:val="1"/>
-          <w:numId w:val="1018"/>
-        </w:numPr>
-        <w:pStyle w:val="Compact"/>
-      </w:pPr>
-      <w:r>
-        <w:t xml:space="preserve">the manpower IO Code, e.g. </w:t>
-      </w:r>
-      <w:r>
-        <w:rPr>
-          <w:rStyle w:val="VerbatimChar"/>
-        </w:rPr>
-        <w:t xml:space="preserve">TF25HIP136MP</w:t>
-      </w:r>
-      <w:r>
-        <w:t xml:space="preserve">;</w:t>
-      </w:r>
-    </w:p>
-    <w:p>
-      <w:pPr>
-        <w:numPr>
-          <w:ilvl w:val="1"/>
-          <w:numId w:val="1018"/>
-        </w:numPr>
-        <w:pStyle w:val="Compact"/>
-      </w:pPr>
-      <w:r>
-        <w:rPr>
-          <w:bCs/>
-          <w:b/>
-        </w:rPr>
-        <w:t xml:space="preserve">Charge To</w:t>
-      </w:r>
-      <w:r>
-        <w:t xml:space="preserve"> (MP, OM, EQ, CO or OTHER).</w:t>
-      </w:r>
-    </w:p>
-    <w:p>
-      <w:pPr>
-        <w:numPr>
-          <w:ilvl w:val="0"/>
-          <w:numId w:val="1017"/>
-        </w:numPr>
-        <w:pStyle w:val="Compact"/>
-      </w:pPr>
-      <w:r>
-        <w:t xml:space="preserve">The next Load moves that line into that block as a locked row.</w:t>
-      </w:r>
-    </w:p>
-    <w:bookmarkEnd w:id="36"/>
-    <w:bookmarkEnd w:id="37"/>
-    <w:bookmarkStart w:id="38" w:name="what-changed-from-v0.8"/>
-    <w:p>
-      <w:pPr>
-        <w:pStyle w:val="Heading2"/>
-      </w:pPr>
-      <w:r>
-        <w:t xml:space="preserve">5. What changed from v0.8</w:t>
-      </w:r>
-    </w:p>
-    <w:p>
-      <w:pPr>
-        <w:numPr>
-          <w:ilvl w:val="0"/>
-          <w:numId w:val="1019"/>
-        </w:numPr>
-        <w:pStyle w:val="Compact"/>
-      </w:pPr>
-      <w:r>
-        <w:t xml:space="preserve">The old fixed timeline, the Manual Projection table, the Patient Reimbursement table and the C5 Project Display Name selector are retired.</w:t>
-      </w:r>
-    </w:p>
-    <w:p>
-      <w:pPr>
-        <w:numPr>
-          <w:ilvl w:val="1"/>
+        <w:t xml:space="preserve">, and the hidden</w:t>
+      </w:r>
+      <w:r>
+        <w:t xml:space="preserve"> </w:t>
+      </w:r>
+      <w:r>
+        <w:rPr>
+          <w:bCs/>
+          <w:b/>
+        </w:rPr>
+        <w:t xml:space="preserve">ProjectionStore</w:t>
+      </w:r>
+      <w:r>
+        <w:t xml:space="preserve">, which holds the saved projections and remarks.</w:t>
+      </w:r>
+    </w:p>
+    <w:p>
+      <w:pPr>
+        <w:numPr>
+          <w:ilvl w:val="0"/>
           <w:numId w:val="1020"/>
         </w:numPr>
         <w:pStyle w:val="Compact"/>
       </w:pPr>
       <w:r>
-        <w:t xml:space="preserve">A full copy of the v0.8 dashboard is kept on a hidden sheet, </w:t>
-      </w:r>
-      <w:r>
-        <w:rPr>
-          <w:bCs/>
-          <w:b/>
-        </w:rPr>
-        <w:t xml:space="preserve">Legacy_Timeline</w:t>
-      </w:r>
-      <w:r>
-        <w:t xml:space="preserve">, for comparison during testing. To view it: right-click any sheet tab → </w:t>
-      </w:r>
-      <w:r>
-        <w:rPr>
-          <w:bCs/>
-          <w:b/>
-        </w:rPr>
-        <w:t xml:space="preserve">Unhide</w:t>
-      </w:r>
-      <w:r>
-        <w:t xml:space="preserve"> → Legacy_Timeline.</w:t>
-      </w:r>
-    </w:p>
-    <w:p>
-      <w:pPr>
-        <w:numPr>
-          <w:ilvl w:val="0"/>
-          <w:numId w:val="1019"/>
-        </w:numPr>
-        <w:pStyle w:val="Compact"/>
-      </w:pPr>
-      <w:r>
-        <w:t xml:space="preserve">The KPI cards now read the new timeline totals.</w:t>
-      </w:r>
-    </w:p>
-    <w:p>
-      <w:pPr>
-        <w:numPr>
-          <w:ilvl w:val="0"/>
-          <w:numId w:val="1019"/>
-        </w:numPr>
-        <w:pStyle w:val="Compact"/>
-      </w:pPr>
-      <w:r>
-        <w:t xml:space="preserve">The manpower table and sheet keep their v0.8 names, </w:t>
-      </w:r>
-      <w:r>
-        <w:rPr>
-          <w:rStyle w:val="VerbatimChar"/>
-          <w:bCs/>
-          <w:b/>
-        </w:rPr>
-        <w:t xml:space="preserve">qManpower_SelectedTest</w:t>
-      </w:r>
-      <w:r>
-        <w:t xml:space="preserve"> / </w:t>
-      </w:r>
-      <w:r>
-        <w:rPr>
-          <w:rStyle w:val="VerbatimChar"/>
-          <w:bCs/>
-          <w:b/>
-        </w:rPr>
-        <w:t xml:space="preserve">PQManpower_SelectedTest</w:t>
-      </w:r>
-      <w:r>
-        <w:t xml:space="preserve">. If you want them renamed to match the other selected-test tables, do it in Excel (Table Design → Table Name; right-click the sheet tab → Rename), never by editing the file, and ask for the VBA constant </w:t>
-      </w:r>
-      <w:r>
-        <w:rPr>
-          <w:rStyle w:val="VerbatimChar"/>
-        </w:rPr>
-        <w:t xml:space="preserve">MANPOWER_TABLE</w:t>
-      </w:r>
-      <w:r>
-        <w:t xml:space="preserve"> to be updated.</w:t>
-      </w:r>
-    </w:p>
-    <w:p>
-      <w:pPr>
-        <w:numPr>
-          <w:ilvl w:val="0"/>
-          <w:numId w:val="1019"/>
-        </w:numPr>
-        <w:pStyle w:val="Compact"/>
-      </w:pPr>
-      <w:r>
-        <w:t xml:space="preserve">New sheets: </w:t>
-      </w:r>
-      <w:r>
-        <w:rPr>
-          <w:bCs/>
-          <w:b/>
-        </w:rPr>
-        <w:t xml:space="preserve">Dashboard_Settings</w:t>
-      </w:r>
-      <w:r>
-        <w:t xml:space="preserve">, and the hidden </w:t>
-      </w:r>
-      <w:r>
-        <w:rPr>
-          <w:bCs/>
-          <w:b/>
-        </w:rPr>
-        <w:t xml:space="preserve">ProjectionStore</w:t>
-      </w:r>
-      <w:r>
-        <w:t xml:space="preserve">, which holds the saved projections.</w:t>
-      </w:r>
-    </w:p>
-    <w:p>
-      <w:pPr>
-        <w:numPr>
-          <w:ilvl w:val="0"/>
-          <w:numId w:val="1019"/>
-        </w:numPr>
-        <w:pStyle w:val="Compact"/>
-      </w:pPr>
-      <w:r>
         <w:t xml:space="preserve">No Power Query query or connection was changed.</w:t>
       </w:r>
     </w:p>
-    <w:bookmarkEnd w:id="38"/>
-    <w:bookmarkStart w:id="39" w:name="troubleshooting"/>
+    <w:bookmarkEnd w:id="39"/>
+    <w:bookmarkStart w:id="40" w:name="troubleshooting"/>
     <w:p>
       <w:pPr>
         <w:pStyle w:val="Heading2"/>
@@ -2544,7 +3306,13 @@
               <w:jc w:val="left"/>
             </w:pPr>
             <w:r>
-              <w:t xml:space="preserve">“Setup Status is …”</w:t>
+              <w:t xml:space="preserve">“</w:t>
+            </w:r>
+            <w:r>
+              <w:t xml:space="preserve">Setup Status is …</w:t>
+            </w:r>
+            <w:r>
+              <w:t xml:space="preserve">”</w:t>
             </w:r>
           </w:p>
         </w:tc>
@@ -2570,7 +3338,13 @@
               <w:jc w:val="left"/>
             </w:pPr>
             <w:r>
-              <w:t xml:space="preserve">“Refreshing … failed”</w:t>
+              <w:t xml:space="preserve">“</w:t>
+            </w:r>
+            <w:r>
+              <w:t xml:space="preserve">Refreshing … failed</w:t>
+            </w:r>
+            <w:r>
+              <w:t xml:space="preserve">”</w:t>
             </w:r>
           </w:p>
         </w:tc>
@@ -2596,7 +3370,13 @@
               <w:jc w:val="left"/>
             </w:pPr>
             <w:r>
-              <w:t xml:space="preserve">“… shows X, not Y”</w:t>
+              <w:t xml:space="preserve">“</w:t>
+            </w:r>
+            <w:r>
+              <w:t xml:space="preserve">… shows X, not Y</w:t>
+            </w:r>
+            <w:r>
+              <w:t xml:space="preserve">”</w:t>
             </w:r>
           </w:p>
         </w:tc>
@@ -2692,8 +3472,8 @@
         </w:tc>
       </w:tr>
     </w:tbl>
-    <w:bookmarkEnd w:id="39"/>
-    <w:bookmarkStart w:id="40" w:name="testing"/>
+    <w:bookmarkEnd w:id="40"/>
+    <w:bookmarkStart w:id="41" w:name="testing"/>
     <w:p>
       <w:pPr>
         <w:pStyle w:val="Heading2"/>
@@ -2707,7 +3487,10 @@
         <w:pStyle w:val="FirstParagraph"/>
       </w:pPr>
       <w:r>
-        <w:t xml:space="preserve">Work through </w:t>
+        <w:t xml:space="preserve">Work through</w:t>
+      </w:r>
+      <w:r>
+        <w:t xml:space="preserve"> </w:t>
       </w:r>
       <w:r>
         <w:rPr>
@@ -2716,11 +3499,32 @@
         <w:t xml:space="preserve">tests/UAT_test_script.md</w:t>
       </w:r>
       <w:r>
-        <w:t xml:space="preserve"> (tests 1–16). Send me: - each test number with Pass or Fail; - a screenshot and the message for any failure; - the saved workbook, so I can confirm Power Query is untouched (test 13).</w:t>
-      </w:r>
-    </w:p>
-    <w:bookmarkEnd w:id="40"/>
+        <w:t xml:space="preserve"> </w:t>
+      </w:r>
+      <w:r>
+        <w:t xml:space="preserve">(tests 1–18). Send me:</w:t>
+      </w:r>
+      <w:r>
+        <w:t xml:space="preserve"> </w:t>
+      </w:r>
+      <w:r>
+        <w:t xml:space="preserve">- each test number with Pass or Fail;</w:t>
+      </w:r>
+      <w:r>
+        <w:t xml:space="preserve"> </w:t>
+      </w:r>
+      <w:r>
+        <w:t xml:space="preserve">- a screenshot and the message for any failure;</w:t>
+      </w:r>
+      <w:r>
+        <w:t xml:space="preserve"> </w:t>
+      </w:r>
+      <w:r>
+        <w:t xml:space="preserve">- the saved workbook, so I can confirm Power Query is untouched (test 13).</w:t>
+      </w:r>
+    </w:p>
     <w:bookmarkEnd w:id="41"/>
+    <w:bookmarkEnd w:id="42"/>
     <w:sectPr/>
   </w:body>
 </w:document>
@@ -3292,6 +4096,9 @@
     <w:abstractNumId w:val="991"/>
   </w:num>
   <w:num w:numId="1020">
+    <w:abstractNumId w:val="991"/>
+  </w:num>
+  <w:num w:numId="1021">
     <w:abstractNumId w:val="991"/>
   </w:num>
 </w:numbering>

</xml_diff>

<commit_message>
Record UAT 17-18 pass (row group, Remarks); install guide covers Remarks and top-row collapse (#17)
Claude-Session: https://claude.ai/code/session_017h8ADiUSHW7ex1hhB7iQGv

Co-authored-by: Claude <noreply@anthropic.com>
</commit_message>
<xml_diff>
--- a/docs/v0.9_Install_and_User_Guide.docx
+++ b/docs/v0.9_Install_and_User_Guide.docx
@@ -2,7 +2,7 @@
 <file path=word/document.xml><?xml version="1.0" encoding="utf-8"?>
 <w:document xmlns:w="http://schemas.openxmlformats.org/wordprocessingml/2006/main" xmlns:m="http://schemas.openxmlformats.org/officeDocument/2006/math" xmlns:r="http://schemas.openxmlformats.org/officeDocument/2006/relationships" xmlns:o="urn:schemas-microsoft-com:office:office" xmlns:v="urn:schemas-microsoft-com:vml" xmlns:w10="urn:schemas-microsoft-com:office:word" xmlns:a="http://schemas.openxmlformats.org/drawingml/2006/main" xmlns:pic="http://schemas.openxmlformats.org/drawingml/2006/picture" xmlns:wp="http://schemas.openxmlformats.org/drawingml/2006/wordprocessingDrawing">
   <w:body>
-    <w:bookmarkStart w:id="41" w:name="Xad89226ec27011cac3cbb2b15a1e4653c453aef"/>
+    <w:bookmarkStart w:id="42" w:name="Xad89226ec27011cac3cbb2b15a1e4653c453aef"/>
     <w:p>
       <w:pPr>
         <w:pStyle w:val="Heading1"/>
@@ -42,7 +42,13 @@
         <w:t xml:space="preserve">Date:</w:t>
       </w:r>
       <w:r>
-        <w:t xml:space="preserve"> 11 October 2026 </w:t>
+        <w:t xml:space="preserve"> </w:t>
+      </w:r>
+      <w:r>
+        <w:t xml:space="preserve">11 October 2026</w:t>
+      </w:r>
+      <w:r>
+        <w:t xml:space="preserve"> </w:t>
       </w:r>
       <w:r>
         <w:rPr>
@@ -52,7 +58,10 @@
         <w:t xml:space="preserve">Status:</w:t>
       </w:r>
       <w:r>
-        <w:t xml:space="preserve"> working copy for testing (UAT). The stable v0.8 file stays as it is; don’t overwrite it.</w:t>
+        <w:t xml:space="preserve"> </w:t>
+      </w:r>
+      <w:r>
+        <w:t xml:space="preserve">working copy for testing (UAT). The stable v0.8 file stays as it is; don’t overwrite it.</w:t>
       </w:r>
     </w:p>
     <w:p>
@@ -271,7 +280,10 @@
               <w:t xml:space="preserve">docs/v0.9_Install_and_User_Guide</w:t>
             </w:r>
             <w:r>
-              <w:t xml:space="preserve"> (.docx and .md)</w:t>
+              <w:t xml:space="preserve"> </w:t>
+            </w:r>
+            <w:r>
+              <w:t xml:space="preserve">(.docx and .md)</w:t>
             </w:r>
           </w:p>
         </w:tc>
@@ -312,7 +324,7 @@
               <w:jc w:val="left"/>
             </w:pPr>
             <w:r>
-              <w:t xml:space="preserve">The 16 acceptance tests, with expected figures.</w:t>
+              <w:t xml:space="preserve">The 18 acceptance tests, with expected figures.</w:t>
             </w:r>
           </w:p>
         </w:tc>
@@ -390,13 +402,28 @@
               <w:t xml:space="preserve">CLAUDE.md</w:t>
             </w:r>
             <w:r>
-              <w:t xml:space="preserve">, </w:t>
+              <w:t xml:space="preserve">,</w:t>
+            </w:r>
+            <w:r>
+              <w:t xml:space="preserve"> </w:t>
             </w:r>
             <w:r>
               <w:rPr>
                 <w:rStyle w:val="VerbatimChar"/>
               </w:rPr>
               <w:t xml:space="preserve">handovers/</w:t>
+            </w:r>
+            <w:r>
+              <w:t xml:space="preserve">,</w:t>
+            </w:r>
+            <w:r>
+              <w:t xml:space="preserve"> </w:t>
+            </w:r>
+            <w:r>
+              <w:rPr>
+                <w:rStyle w:val="VerbatimChar"/>
+              </w:rPr>
+              <w:t xml:space="preserve">docs/PROJECT_REFERENCE.md</w:t>
             </w:r>
           </w:p>
         </w:tc>
@@ -433,7 +460,10 @@
         <w:pStyle w:val="Compact"/>
       </w:pPr>
       <w:r>
-        <w:t xml:space="preserve">Use </w:t>
+        <w:t xml:space="preserve">Use</w:t>
+      </w:r>
+      <w:r>
+        <w:t xml:space="preserve"> </w:t>
       </w:r>
       <w:r>
         <w:rPr>
@@ -443,7 +473,10 @@
         <w:t xml:space="preserve">desktop Excel for Windows</w:t>
       </w:r>
       <w:r>
-        <w:t xml:space="preserve"> (Microsoft 365). The macros don’t run in Excel for the web or in Excel for Mac.</w:t>
+        <w:t xml:space="preserve"> </w:t>
+      </w:r>
+      <w:r>
+        <w:t xml:space="preserve">(Microsoft 365). The macros don’t run in Excel for the web or in Excel for Mac.</w:t>
       </w:r>
     </w:p>
     <w:p>
@@ -474,7 +507,10 @@
         <w:t xml:space="preserve">Don’t</w:t>
       </w:r>
       <w:r>
-        <w:t xml:space="preserve"> open or save the workbook in LibreOffice, Google Sheets, Excel for the web, or Excel on a phone or tablet. Saving it there can remove the Power Query connections.</w:t>
+        <w:t xml:space="preserve"> </w:t>
+      </w:r>
+      <w:r>
+        <w:t xml:space="preserve">open or save the workbook in LibreOffice, Google Sheets, Excel for the web, or Excel on a phone or tablet. Saving it there can remove the Power Query connections.</w:t>
       </w:r>
     </w:p>
     <w:p>
@@ -486,7 +522,10 @@
         <w:pStyle w:val="Compact"/>
       </w:pPr>
       <w:r>
-        <w:t xml:space="preserve">Check the file first: its SHA-256 is in </w:t>
+        <w:t xml:space="preserve">Check the file first: its SHA-256 is in</w:t>
+      </w:r>
+      <w:r>
+        <w:t xml:space="preserve"> </w:t>
       </w:r>
       <w:r>
         <w:rPr>
@@ -495,7 +534,13 @@
         <w:t xml:space="preserve">README_FIRST.txt</w:t>
       </w:r>
       <w:r>
-        <w:t xml:space="preserve"> (PowerShell: </w:t>
+        <w:t xml:space="preserve"> </w:t>
+      </w:r>
+      <w:r>
+        <w:t xml:space="preserve">(PowerShell:</w:t>
+      </w:r>
+      <w:r>
+        <w:t xml:space="preserve"> </w:t>
       </w:r>
       <w:r>
         <w:rPr>
@@ -523,7 +568,10 @@
         <w:t xml:space="preserve">If Excel says it found a problem and offers to repair the file, click No and report it.</w:t>
       </w:r>
       <w:r>
-        <w:t xml:space="preserve"> Don’t save a repaired copy.</w:t>
+        <w:t xml:space="preserve"> </w:t>
+      </w:r>
+      <w:r>
+        <w:t xml:space="preserve">Don’t save a repaired copy.</w:t>
       </w:r>
     </w:p>
     <w:p>
@@ -535,7 +583,10 @@
         <w:pStyle w:val="Compact"/>
       </w:pPr>
       <w:r>
-        <w:t xml:space="preserve">Work on a </w:t>
+        <w:t xml:space="preserve">Work on a</w:t>
+      </w:r>
+      <w:r>
+        <w:t xml:space="preserve"> </w:t>
       </w:r>
       <w:r>
         <w:rPr>
@@ -545,7 +596,10 @@
         <w:t xml:space="preserve">local copy</w:t>
       </w:r>
       <w:r>
-        <w:t xml:space="preserve"> first, for example in Documents. Move it to SharePoint only after testing.</w:t>
+        <w:t xml:space="preserve"> </w:t>
+      </w:r>
+      <w:r>
+        <w:t xml:space="preserve">first, for example in Documents. Move it to SharePoint only after testing.</w:t>
       </w:r>
     </w:p>
     <w:bookmarkEnd w:id="21"/>
@@ -597,7 +651,10 @@
         <w:pStyle w:val="Compact"/>
       </w:pPr>
       <w:r>
-        <w:t xml:space="preserve">Right-click </w:t>
+        <w:t xml:space="preserve">Right-click</w:t>
+      </w:r>
+      <w:r>
+        <w:t xml:space="preserve"> </w:t>
       </w:r>
       <w:r>
         <w:rPr>
@@ -606,7 +663,13 @@
         <w:t xml:space="preserve">..._v0.9_working.xlsm</w:t>
       </w:r>
       <w:r>
-        <w:t xml:space="preserve"> and choose </w:t>
+        <w:t xml:space="preserve"> </w:t>
+      </w:r>
+      <w:r>
+        <w:t xml:space="preserve">and choose</w:t>
+      </w:r>
+      <w:r>
+        <w:t xml:space="preserve"> </w:t>
       </w:r>
       <w:r>
         <w:rPr>
@@ -628,17 +691,37 @@
         <w:pStyle w:val="Compact"/>
       </w:pPr>
       <w:r>
-        <w:t xml:space="preserve">If you see </w:t>
-      </w:r>
-      <w:r>
-        <w:rPr>
-          <w:bCs/>
-          <w:b/>
-        </w:rPr>
-        <w:t xml:space="preserve">“This file came from another computer…”</w:t>
-      </w:r>
-      <w:r>
-        <w:t xml:space="preserve">, tick </w:t>
+        <w:t xml:space="preserve">If you see</w:t>
+      </w:r>
+      <w:r>
+        <w:t xml:space="preserve"> </w:t>
+      </w:r>
+      <w:r>
+        <w:rPr>
+          <w:bCs/>
+          <w:b/>
+        </w:rPr>
+        <w:t xml:space="preserve">“</w:t>
+      </w:r>
+      <w:r>
+        <w:rPr>
+          <w:bCs/>
+          <w:b/>
+        </w:rPr>
+        <w:t xml:space="preserve">This file came from another computer…</w:t>
+      </w:r>
+      <w:r>
+        <w:rPr>
+          <w:bCs/>
+          <w:b/>
+        </w:rPr>
+        <w:t xml:space="preserve">”</w:t>
+      </w:r>
+      <w:r>
+        <w:t xml:space="preserve">, tick</w:t>
+      </w:r>
+      <w:r>
+        <w:t xml:space="preserve"> </w:t>
       </w:r>
       <w:r>
         <w:rPr>
@@ -648,7 +731,13 @@
         <w:t xml:space="preserve">Unblock</w:t>
       </w:r>
       <w:r>
-        <w:t xml:space="preserve"> and click </w:t>
+        <w:t xml:space="preserve"> </w:t>
+      </w:r>
+      <w:r>
+        <w:t xml:space="preserve">and click</w:t>
+      </w:r>
+      <w:r>
+        <w:t xml:space="preserve"> </w:t>
       </w:r>
       <w:r>
         <w:rPr>
@@ -680,7 +769,10 @@
         <w:pStyle w:val="Compact"/>
       </w:pPr>
       <w:r>
-        <w:t xml:space="preserve">Double-click the </w:t>
+        <w:t xml:space="preserve">Double-click the</w:t>
+      </w:r>
+      <w:r>
+        <w:t xml:space="preserve"> </w:t>
       </w:r>
       <w:r>
         <w:rPr>
@@ -689,7 +781,10 @@
         <w:t xml:space="preserve">.xlsm</w:t>
       </w:r>
       <w:r>
-        <w:t xml:space="preserve"> to open it in desktop Excel.</w:t>
+        <w:t xml:space="preserve"> </w:t>
+      </w:r>
+      <w:r>
+        <w:t xml:space="preserve">to open it in desktop Excel.</w:t>
       </w:r>
     </w:p>
     <w:p>
@@ -701,7 +796,10 @@
         <w:pStyle w:val="Compact"/>
       </w:pPr>
       <w:r>
-        <w:t xml:space="preserve">If a yellow bar says </w:t>
+        <w:t xml:space="preserve">If a yellow bar says</w:t>
+      </w:r>
+      <w:r>
+        <w:t xml:space="preserve"> </w:t>
       </w:r>
       <w:r>
         <w:rPr>
@@ -745,7 +843,10 @@
         <w:pStyle w:val="Compact"/>
       </w:pPr>
       <w:r>
-        <w:t xml:space="preserve">Press </w:t>
+        <w:t xml:space="preserve">Press</w:t>
+      </w:r>
+      <w:r>
+        <w:t xml:space="preserve"> </w:t>
       </w:r>
       <w:r>
         <w:rPr>
@@ -767,7 +868,10 @@
         <w:pStyle w:val="Compact"/>
       </w:pPr>
       <w:r>
-        <w:t xml:space="preserve">If you can’t see the </w:t>
+        <w:t xml:space="preserve">If you can’t see the</w:t>
+      </w:r>
+      <w:r>
+        <w:t xml:space="preserve"> </w:t>
       </w:r>
       <w:r>
         <w:rPr>
@@ -777,7 +881,13 @@
         <w:t xml:space="preserve">Project</w:t>
       </w:r>
       <w:r>
-        <w:t xml:space="preserve"> pane on the left, press </w:t>
+        <w:t xml:space="preserve"> </w:t>
+      </w:r>
+      <w:r>
+        <w:t xml:space="preserve">pane on the left, press</w:t>
+      </w:r>
+      <w:r>
+        <w:t xml:space="preserve"> </w:t>
       </w:r>
       <w:r>
         <w:rPr>
@@ -809,7 +919,10 @@
         <w:pStyle w:val="Compact"/>
       </w:pPr>
       <w:r>
-        <w:t xml:space="preserve">Click </w:t>
+        <w:t xml:space="preserve">Click</w:t>
+      </w:r>
+      <w:r>
+        <w:t xml:space="preserve"> </w:t>
       </w:r>
       <w:r>
         <w:rPr>
@@ -831,7 +944,10 @@
         <w:pStyle w:val="Compact"/>
       </w:pPr>
       <w:r>
-        <w:t xml:space="preserve">Go to the unzipped </w:t>
+        <w:t xml:space="preserve">Go to the unzipped</w:t>
+      </w:r>
+      <w:r>
+        <w:t xml:space="preserve"> </w:t>
       </w:r>
       <w:r>
         <w:rPr>
@@ -840,7 +956,13 @@
         <w:t xml:space="preserve">vba</w:t>
       </w:r>
       <w:r>
-        <w:t xml:space="preserve"> folder, choose </w:t>
+        <w:t xml:space="preserve"> </w:t>
+      </w:r>
+      <w:r>
+        <w:t xml:space="preserve">folder, choose</w:t>
+      </w:r>
+      <w:r>
+        <w:t xml:space="preserve"> </w:t>
       </w:r>
       <w:r>
         <w:rPr>
@@ -851,7 +973,13 @@
         <w:t xml:space="preserve">modTimeline.bas</w:t>
       </w:r>
       <w:r>
-        <w:t xml:space="preserve"> and click </w:t>
+        <w:t xml:space="preserve"> </w:t>
+      </w:r>
+      <w:r>
+        <w:t xml:space="preserve">and click</w:t>
+      </w:r>
+      <w:r>
+        <w:t xml:space="preserve"> </w:t>
       </w:r>
       <w:r>
         <w:rPr>
@@ -873,7 +1001,10 @@
         <w:pStyle w:val="Compact"/>
       </w:pPr>
       <w:r>
-        <w:t xml:space="preserve">Repeat for </w:t>
+        <w:t xml:space="preserve">Repeat for</w:t>
+      </w:r>
+      <w:r>
+        <w:t xml:space="preserve"> </w:t>
       </w:r>
       <w:r>
         <w:rPr>
@@ -884,7 +1015,13 @@
         <w:t xml:space="preserve">modStore.bas</w:t>
       </w:r>
       <w:r>
-        <w:t xml:space="preserve"> and </w:t>
+        <w:t xml:space="preserve"> </w:t>
+      </w:r>
+      <w:r>
+        <w:t xml:space="preserve">and</w:t>
+      </w:r>
+      <w:r>
+        <w:t xml:space="preserve"> </w:t>
       </w:r>
       <w:r>
         <w:rPr>
@@ -907,7 +1044,10 @@
         <w:pStyle w:val="Compact"/>
       </w:pPr>
       <w:r>
-        <w:t xml:space="preserve">In the Project pane, under </w:t>
+        <w:t xml:space="preserve">In the Project pane, under</w:t>
+      </w:r>
+      <w:r>
+        <w:t xml:space="preserve"> </w:t>
       </w:r>
       <w:r>
         <w:rPr>
@@ -917,7 +1057,10 @@
         <w:t xml:space="preserve">Modules</w:t>
       </w:r>
       <w:r>
-        <w:t xml:space="preserve">, you should now see </w:t>
+        <w:t xml:space="preserve">, you should now see</w:t>
+      </w:r>
+      <w:r>
+        <w:t xml:space="preserve"> </w:t>
       </w:r>
       <w:r>
         <w:rPr>
@@ -926,7 +1069,13 @@
         <w:t xml:space="preserve">Module1</w:t>
       </w:r>
       <w:r>
-        <w:t xml:space="preserve"> (already there), </w:t>
+        <w:t xml:space="preserve"> </w:t>
+      </w:r>
+      <w:r>
+        <w:t xml:space="preserve">(already there),</w:t>
+      </w:r>
+      <w:r>
+        <w:t xml:space="preserve"> </w:t>
       </w:r>
       <w:r>
         <w:rPr>
@@ -935,7 +1084,10 @@
         <w:t xml:space="preserve">modTimeline</w:t>
       </w:r>
       <w:r>
-        <w:t xml:space="preserve">, </w:t>
+        <w:t xml:space="preserve">,</w:t>
+      </w:r>
+      <w:r>
+        <w:t xml:space="preserve"> </w:t>
       </w:r>
       <w:r>
         <w:rPr>
@@ -944,7 +1096,13 @@
         <w:t xml:space="preserve">modStore</w:t>
       </w:r>
       <w:r>
-        <w:t xml:space="preserve"> and </w:t>
+        <w:t xml:space="preserve"> </w:t>
+      </w:r>
+      <w:r>
+        <w:t xml:space="preserve">and</w:t>
+      </w:r>
+      <w:r>
+        <w:t xml:space="preserve"> </w:t>
       </w:r>
       <w:r>
         <w:rPr>
@@ -961,7 +1119,10 @@
         <w:pStyle w:val="BlockText"/>
       </w:pPr>
       <w:r>
-        <w:t xml:space="preserve">Don’t double-click the </w:t>
+        <w:t xml:space="preserve">Don’t double-click the</w:t>
+      </w:r>
+      <w:r>
+        <w:t xml:space="preserve"> </w:t>
       </w:r>
       <w:r>
         <w:rPr>
@@ -970,7 +1131,13 @@
         <w:t xml:space="preserve">.bas</w:t>
       </w:r>
       <w:r>
-        <w:t xml:space="preserve"> files in Windows, and don’t copy and paste them. Use </w:t>
+        <w:t xml:space="preserve"> </w:t>
+      </w:r>
+      <w:r>
+        <w:t xml:space="preserve">files in Windows, and don’t copy and paste them. Use</w:t>
+      </w:r>
+      <w:r>
+        <w:t xml:space="preserve"> </w:t>
       </w:r>
       <w:r>
         <w:rPr>
@@ -1002,7 +1169,10 @@
         <w:pStyle w:val="Compact"/>
       </w:pPr>
       <w:r>
-        <w:t xml:space="preserve">In the Project pane, open </w:t>
+        <w:t xml:space="preserve">In the Project pane, open</w:t>
+      </w:r>
+      <w:r>
+        <w:t xml:space="preserve"> </w:t>
       </w:r>
       <w:r>
         <w:rPr>
@@ -1012,7 +1182,13 @@
         <w:t xml:space="preserve">Microsoft Excel Objects</w:t>
       </w:r>
       <w:r>
-        <w:t xml:space="preserve"> and double-click </w:t>
+        <w:t xml:space="preserve"> </w:t>
+      </w:r>
+      <w:r>
+        <w:t xml:space="preserve">and double-click</w:t>
+      </w:r>
+      <w:r>
+        <w:t xml:space="preserve"> </w:t>
       </w:r>
       <w:r>
         <w:rPr>
@@ -1034,7 +1210,10 @@
         <w:pStyle w:val="Compact"/>
       </w:pPr>
       <w:r>
-        <w:t xml:space="preserve">Open </w:t>
+        <w:t xml:space="preserve">Open</w:t>
+      </w:r>
+      <w:r>
+        <w:t xml:space="preserve"> </w:t>
       </w:r>
       <w:r>
         <w:rPr>
@@ -1043,7 +1222,13 @@
         <w:t xml:space="preserve">vba/ThisWorkbook_code.txt</w:t>
       </w:r>
       <w:r>
-        <w:t xml:space="preserve"> in Notepad. Copy the three lines from </w:t>
+        <w:t xml:space="preserve"> </w:t>
+      </w:r>
+      <w:r>
+        <w:t xml:space="preserve">in Notepad. Copy the three lines from</w:t>
+      </w:r>
+      <w:r>
+        <w:t xml:space="preserve"> </w:t>
       </w:r>
       <w:r>
         <w:rPr>
@@ -1052,7 +1237,13 @@
         <w:t xml:space="preserve">Private Sub Workbook_Open()</w:t>
       </w:r>
       <w:r>
-        <w:t xml:space="preserve"> to </w:t>
+        <w:t xml:space="preserve"> </w:t>
+      </w:r>
+      <w:r>
+        <w:t xml:space="preserve">to</w:t>
+      </w:r>
+      <w:r>
+        <w:t xml:space="preserve"> </w:t>
       </w:r>
       <w:r>
         <w:rPr>
@@ -1103,7 +1294,10 @@
         <w:pStyle w:val="Compact"/>
       </w:pPr>
       <w:r>
-        <w:t xml:space="preserve">In the VBA editor, click </w:t>
+        <w:t xml:space="preserve">In the VBA editor, click</w:t>
+      </w:r>
+      <w:r>
+        <w:t xml:space="preserve"> </w:t>
       </w:r>
       <w:r>
         <w:rPr>
@@ -1178,7 +1372,10 @@
         <w:pStyle w:val="Compact"/>
       </w:pPr>
       <w:r>
-        <w:t xml:space="preserve">In Excel, press </w:t>
+        <w:t xml:space="preserve">In Excel, press</w:t>
+      </w:r>
+      <w:r>
+        <w:t xml:space="preserve"> </w:t>
       </w:r>
       <w:r>
         <w:rPr>
@@ -1188,7 +1385,10 @@
         <w:t xml:space="preserve">Alt + F8</w:t>
       </w:r>
       <w:r>
-        <w:t xml:space="preserve">, choose </w:t>
+        <w:t xml:space="preserve">, choose</w:t>
+      </w:r>
+      <w:r>
+        <w:t xml:space="preserve"> </w:t>
       </w:r>
       <w:r>
         <w:rPr>
@@ -1199,7 +1399,13 @@
         <w:t xml:space="preserve">Setup_Dashboard_v09</w:t>
       </w:r>
       <w:r>
-        <w:t xml:space="preserve"> and click </w:t>
+        <w:t xml:space="preserve"> </w:t>
+      </w:r>
+      <w:r>
+        <w:t xml:space="preserve">and click</w:t>
+      </w:r>
+      <w:r>
+        <w:t xml:space="preserve"> </w:t>
       </w:r>
       <w:r>
         <w:rPr>
@@ -1221,14 +1427,31 @@
         <w:pStyle w:val="Compact"/>
       </w:pPr>
       <w:r>
-        <w:t xml:space="preserve">You should see </w:t>
-      </w:r>
-      <w:r>
-        <w:rPr>
-          <w:bCs/>
-          <w:b/>
-        </w:rPr>
-        <w:t xml:space="preserve">“Setup complete.”</w:t>
+        <w:t xml:space="preserve">You should see</w:t>
+      </w:r>
+      <w:r>
+        <w:t xml:space="preserve"> </w:t>
+      </w:r>
+      <w:r>
+        <w:rPr>
+          <w:bCs/>
+          <w:b/>
+        </w:rPr>
+        <w:t xml:space="preserve">“</w:t>
+      </w:r>
+      <w:r>
+        <w:rPr>
+          <w:bCs/>
+          <w:b/>
+        </w:rPr>
+        <w:t xml:space="preserve">Setup complete.</w:t>
+      </w:r>
+      <w:r>
+        <w:rPr>
+          <w:bCs/>
+          <w:b/>
+        </w:rPr>
+        <w:t xml:space="preserve">”</w:t>
       </w:r>
     </w:p>
     <w:p>
@@ -1240,7 +1463,10 @@
         <w:pStyle w:val="Compact"/>
       </w:pPr>
       <w:r>
-        <w:t xml:space="preserve">Four buttons now sit on </w:t>
+        <w:t xml:space="preserve">Four buttons now sit on</w:t>
+      </w:r>
+      <w:r>
+        <w:t xml:space="preserve"> </w:t>
       </w:r>
       <w:r>
         <w:rPr>
@@ -1249,7 +1475,13 @@
         <w:t xml:space="preserve">Main_Dashboard</w:t>
       </w:r>
       <w:r>
-        <w:t xml:space="preserve"> at E8:F11: </w:t>
+        <w:t xml:space="preserve"> </w:t>
+      </w:r>
+      <w:r>
+        <w:t xml:space="preserve">at E8:F11:</w:t>
+      </w:r>
+      <w:r>
+        <w:t xml:space="preserve"> </w:t>
       </w:r>
       <w:r>
         <w:rPr>
@@ -1259,7 +1491,10 @@
         <w:t xml:space="preserve">Load Project</w:t>
       </w:r>
       <w:r>
-        <w:t xml:space="preserve">, </w:t>
+        <w:t xml:space="preserve">,</w:t>
+      </w:r>
+      <w:r>
+        <w:t xml:space="preserve"> </w:t>
       </w:r>
       <w:r>
         <w:rPr>
@@ -1269,7 +1504,10 @@
         <w:t xml:space="preserve">Save Projections</w:t>
       </w:r>
       <w:r>
-        <w:t xml:space="preserve">, </w:t>
+        <w:t xml:space="preserve">,</w:t>
+      </w:r>
+      <w:r>
+        <w:t xml:space="preserve"> </w:t>
       </w:r>
       <w:r>
         <w:rPr>
@@ -1279,7 +1517,13 @@
         <w:t xml:space="preserve">Re-assign unmatched</w:t>
       </w:r>
       <w:r>
-        <w:t xml:space="preserve"> and </w:t>
+        <w:t xml:space="preserve"> </w:t>
+      </w:r>
+      <w:r>
+        <w:t xml:space="preserve">and</w:t>
+      </w:r>
+      <w:r>
+        <w:t xml:space="preserve"> </w:t>
       </w:r>
       <w:r>
         <w:rPr>
@@ -1311,7 +1555,10 @@
         <w:pStyle w:val="Compact"/>
       </w:pPr>
       <w:r>
-        <w:t xml:space="preserve">Click </w:t>
+        <w:t xml:space="preserve">Click</w:t>
+      </w:r>
+      <w:r>
+        <w:t xml:space="preserve"> </w:t>
       </w:r>
       <w:r>
         <w:rPr>
@@ -1321,7 +1568,10 @@
         <w:t xml:space="preserve">File → Save</w:t>
       </w:r>
       <w:r>
-        <w:t xml:space="preserve">. Keep the </w:t>
+        <w:t xml:space="preserve">. Keep the</w:t>
+      </w:r>
+      <w:r>
+        <w:t xml:space="preserve"> </w:t>
       </w:r>
       <w:r>
         <w:rPr>
@@ -1331,7 +1581,13 @@
         <w:t xml:space="preserve">.xlsm</w:t>
       </w:r>
       <w:r>
-        <w:t xml:space="preserve"> format; if Excel asks about the macro-free format, choose </w:t>
+        <w:t xml:space="preserve"> </w:t>
+      </w:r>
+      <w:r>
+        <w:t xml:space="preserve">format; if Excel asks about the macro-free format, choose</w:t>
+      </w:r>
+      <w:r>
+        <w:t xml:space="preserve"> </w:t>
       </w:r>
       <w:r>
         <w:rPr>
@@ -1366,7 +1622,7 @@
     </w:p>
     <w:bookmarkEnd w:id="29"/>
     <w:bookmarkEnd w:id="30"/>
-    <w:bookmarkStart w:id="37" w:name="using-the-dashboard"/>
+    <w:bookmarkStart w:id="38" w:name="using-the-dashboard"/>
     <w:p>
       <w:pPr>
         <w:pStyle w:val="Heading2"/>
@@ -1393,7 +1649,10 @@
         <w:pStyle w:val="Compact"/>
       </w:pPr>
       <w:r>
-        <w:t xml:space="preserve">On </w:t>
+        <w:t xml:space="preserve">On</w:t>
+      </w:r>
+      <w:r>
+        <w:t xml:space="preserve"> </w:t>
       </w:r>
       <w:r>
         <w:rPr>
@@ -1414,7 +1673,10 @@
         <w:pStyle w:val="Compact"/>
       </w:pPr>
       <w:r>
-        <w:t xml:space="preserve">set </w:t>
+        <w:t xml:space="preserve">set</w:t>
+      </w:r>
+      <w:r>
+        <w:t xml:space="preserve"> </w:t>
       </w:r>
       <w:r>
         <w:rPr>
@@ -1424,7 +1686,13 @@
         <w:t xml:space="preserve">C6</w:t>
       </w:r>
       <w:r>
-        <w:t xml:space="preserve"> to </w:t>
+        <w:t xml:space="preserve"> </w:t>
+      </w:r>
+      <w:r>
+        <w:t xml:space="preserve">to</w:t>
+      </w:r>
+      <w:r>
+        <w:t xml:space="preserve"> </w:t>
       </w:r>
       <w:r>
         <w:rPr>
@@ -1434,7 +1702,13 @@
         <w:t xml:space="preserve">Financial Year</w:t>
       </w:r>
       <w:r>
-        <w:t xml:space="preserve"> or </w:t>
+        <w:t xml:space="preserve"> </w:t>
+      </w:r>
+      <w:r>
+        <w:t xml:space="preserve">or</w:t>
+      </w:r>
+      <w:r>
+        <w:t xml:space="preserve"> </w:t>
       </w:r>
       <w:r>
         <w:rPr>
@@ -1456,7 +1730,10 @@
         <w:pStyle w:val="Compact"/>
       </w:pPr>
       <w:r>
-        <w:t xml:space="preserve">pick the </w:t>
+        <w:t xml:space="preserve">pick the</w:t>
+      </w:r>
+      <w:r>
+        <w:t xml:space="preserve"> </w:t>
       </w:r>
       <w:r>
         <w:rPr>
@@ -1466,7 +1743,13 @@
         <w:t xml:space="preserve">Source Project</w:t>
       </w:r>
       <w:r>
-        <w:t xml:space="preserve"> in </w:t>
+        <w:t xml:space="preserve"> </w:t>
+      </w:r>
+      <w:r>
+        <w:t xml:space="preserve">in</w:t>
+      </w:r>
+      <w:r>
+        <w:t xml:space="preserve"> </w:t>
       </w:r>
       <w:r>
         <w:rPr>
@@ -1488,7 +1771,10 @@
         <w:pStyle w:val="Compact"/>
       </w:pPr>
       <w:r>
-        <w:t xml:space="preserve">pick the </w:t>
+        <w:t xml:space="preserve">pick the</w:t>
+      </w:r>
+      <w:r>
+        <w:t xml:space="preserve"> </w:t>
       </w:r>
       <w:r>
         <w:rPr>
@@ -1498,7 +1784,13 @@
         <w:t xml:space="preserve">Main IO</w:t>
       </w:r>
       <w:r>
-        <w:t xml:space="preserve"> in </w:t>
+        <w:t xml:space="preserve"> </w:t>
+      </w:r>
+      <w:r>
+        <w:t xml:space="preserve">in</w:t>
+      </w:r>
+      <w:r>
+        <w:t xml:space="preserve"> </w:t>
       </w:r>
       <w:r>
         <w:rPr>
@@ -1520,7 +1812,10 @@
         <w:pStyle w:val="Compact"/>
       </w:pPr>
       <w:r>
-        <w:t xml:space="preserve">Check that </w:t>
+        <w:t xml:space="preserve">Check that</w:t>
+      </w:r>
+      <w:r>
+        <w:t xml:space="preserve"> </w:t>
       </w:r>
       <w:r>
         <w:rPr>
@@ -1530,7 +1825,13 @@
         <w:t xml:space="preserve">G6</w:t>
       </w:r>
       <w:r>
-        <w:t xml:space="preserve"> says </w:t>
+        <w:t xml:space="preserve"> </w:t>
+      </w:r>
+      <w:r>
+        <w:t xml:space="preserve">says</w:t>
+      </w:r>
+      <w:r>
+        <w:t xml:space="preserve"> </w:t>
       </w:r>
       <w:r>
         <w:rPr>
@@ -1552,7 +1853,10 @@
         <w:pStyle w:val="Compact"/>
       </w:pPr>
       <w:r>
-        <w:t xml:space="preserve">Click </w:t>
+        <w:t xml:space="preserve">Click</w:t>
+      </w:r>
+      <w:r>
+        <w:t xml:space="preserve"> </w:t>
       </w:r>
       <w:r>
         <w:rPr>
@@ -1581,7 +1885,37 @@
         <w:t xml:space="preserve">E7</w:t>
       </w:r>
       <w:r>
-        <w:t xml:space="preserve"> shows “Dashboard loaded by  at ”. The KPI cards (Budget, Actual to Date, Projected Total, Utilisation) now fill in.</w:t>
+        <w:t xml:space="preserve"> </w:t>
+      </w:r>
+      <w:r>
+        <w:t xml:space="preserve">shows</w:t>
+      </w:r>
+      <w:r>
+        <w:t xml:space="preserve"> </w:t>
+      </w:r>
+      <w:r>
+        <w:t xml:space="preserve">“</w:t>
+      </w:r>
+      <w:r>
+        <w:t xml:space="preserve">Dashboard loaded by</w:t>
+      </w:r>
+      <w:r>
+        <w:t xml:space="preserve"> </w:t>
+      </w:r>
+      <w:r>
+        <w:t xml:space="preserve"> </w:t>
+      </w:r>
+      <w:r>
+        <w:t xml:space="preserve">at</w:t>
+      </w:r>
+      <w:r>
+        <w:t xml:space="preserve"> </w:t>
+      </w:r>
+      <w:r>
+        <w:t xml:space="preserve">”</w:t>
+      </w:r>
+      <w:r>
+        <w:t xml:space="preserve">. The KPI cards (Budget, Actual to Date, Projected Total, Utilisation) now fill in.</w:t>
       </w:r>
     </w:p>
     <w:bookmarkEnd w:id="31"/>
@@ -1631,7 +1965,10 @@
         <w:pStyle w:val="Compact"/>
       </w:pPr>
       <w:r>
-        <w:t xml:space="preserve">then each month, with a </w:t>
+        <w:t xml:space="preserve">then each month, with a</w:t>
+      </w:r>
+      <w:r>
+        <w:t xml:space="preserve"> </w:t>
       </w:r>
       <w:r>
         <w:rPr>
@@ -1641,7 +1978,10 @@
         <w:t xml:space="preserve">quarter total</w:t>
       </w:r>
       <w:r>
-        <w:t xml:space="preserve"> after each quarter;</w:t>
+        <w:t xml:space="preserve"> </w:t>
+      </w:r>
+      <w:r>
+        <w:t xml:space="preserve">after each quarter;</w:t>
       </w:r>
     </w:p>
     <w:p>
@@ -1653,7 +1993,10 @@
         <w:pStyle w:val="Compact"/>
       </w:pPr>
       <w:r>
-        <w:t xml:space="preserve">then the </w:t>
+        <w:t xml:space="preserve">then the</w:t>
+      </w:r>
+      <w:r>
+        <w:t xml:space="preserve"> </w:t>
       </w:r>
       <w:r>
         <w:rPr>
@@ -1663,7 +2006,13 @@
         <w:t xml:space="preserve">FY totals</w:t>
       </w:r>
       <w:r>
-        <w:t xml:space="preserve"> (or CY totals), then </w:t>
+        <w:t xml:space="preserve"> </w:t>
+      </w:r>
+      <w:r>
+        <w:t xml:space="preserve">(or CY totals), then</w:t>
+      </w:r>
+      <w:r>
+        <w:t xml:space="preserve"> </w:t>
       </w:r>
       <w:r>
         <w:rPr>
@@ -1673,6 +2022,19 @@
         <w:t xml:space="preserve">Project Total</w:t>
       </w:r>
       <w:r>
+        <w:t xml:space="preserve">, then</w:t>
+      </w:r>
+      <w:r>
+        <w:t xml:space="preserve"> </w:t>
+      </w:r>
+      <w:r>
+        <w:rPr>
+          <w:bCs/>
+          <w:b/>
+        </w:rPr>
+        <w:t xml:space="preserve">Remarks</w:t>
+      </w:r>
+      <w:r>
         <w:t xml:space="preserve">.</w:t>
       </w:r>
     </w:p>
@@ -1689,10 +2051,70 @@
           <w:bCs/>
           <w:b/>
         </w:rPr>
+        <w:t xml:space="preserve">Collapse the top section:</w:t>
+      </w:r>
+      <w:r>
+        <w:t xml:space="preserve"> </w:t>
+      </w:r>
+      <w:r>
+        <w:t xml:space="preserve">use the</w:t>
+      </w:r>
+      <w:r>
+        <w:t xml:space="preserve"> </w:t>
+      </w:r>
+      <w:r>
+        <w:rPr>
+          <w:bCs/>
+          <w:b/>
+        </w:rPr>
+        <w:t xml:space="preserve">−</w:t>
+      </w:r>
+      <w:r>
+        <w:t xml:space="preserve"> </w:t>
+      </w:r>
+      <w:r>
+        <w:t xml:space="preserve">/</w:t>
+      </w:r>
+      <w:r>
+        <w:t xml:space="preserve"> </w:t>
+      </w:r>
+      <w:r>
+        <w:rPr>
+          <w:bCs/>
+          <w:b/>
+        </w:rPr>
+        <w:t xml:space="preserve">+</w:t>
+      </w:r>
+      <w:r>
+        <w:t xml:space="preserve"> </w:t>
+      </w:r>
+      <w:r>
+        <w:t xml:space="preserve">beside row 1 (left of the row numbers) to hide or show rows 2–19 (selector, KPI cards, buttons) and give the timeline more room. Load Project sets this up every time and leaves it expanded. Your frozen panes are kept.</w:t>
+      </w:r>
+    </w:p>
+    <w:p>
+      <w:pPr>
+        <w:numPr>
+          <w:ilvl w:val="0"/>
+          <w:numId w:val="1012"/>
+        </w:numPr>
+        <w:pStyle w:val="Compact"/>
+      </w:pPr>
+      <w:r>
+        <w:rPr>
+          <w:bCs/>
+          <w:b/>
+        </w:rPr>
         <w:t xml:space="preserve">Collapse a quarter:</w:t>
       </w:r>
       <w:r>
-        <w:t xml:space="preserve"> use the </w:t>
+        <w:t xml:space="preserve"> </w:t>
+      </w:r>
+      <w:r>
+        <w:t xml:space="preserve">use the</w:t>
+      </w:r>
+      <w:r>
+        <w:t xml:space="preserve"> </w:t>
       </w:r>
       <w:r>
         <w:rPr>
@@ -1702,7 +2124,13 @@
         <w:t xml:space="preserve">−</w:t>
       </w:r>
       <w:r>
-        <w:t xml:space="preserve"> / </w:t>
+        <w:t xml:space="preserve"> </w:t>
+      </w:r>
+      <w:r>
+        <w:t xml:space="preserve">/</w:t>
+      </w:r>
+      <w:r>
+        <w:t xml:space="preserve"> </w:t>
       </w:r>
       <w:r>
         <w:rPr>
@@ -1712,7 +2140,13 @@
         <w:t xml:space="preserve">+</w:t>
       </w:r>
       <w:r>
-        <w:t xml:space="preserve"> above the column letters. You can also use the </w:t>
+        <w:t xml:space="preserve"> </w:t>
+      </w:r>
+      <w:r>
+        <w:t xml:space="preserve">above the column letters. You can also use the</w:t>
+      </w:r>
+      <w:r>
+        <w:t xml:space="preserve"> </w:t>
       </w:r>
       <w:r>
         <w:rPr>
@@ -1722,7 +2156,13 @@
         <w:t xml:space="preserve">1</w:t>
       </w:r>
       <w:r>
-        <w:t xml:space="preserve"> / </w:t>
+        <w:t xml:space="preserve"> </w:t>
+      </w:r>
+      <w:r>
+        <w:t xml:space="preserve">/</w:t>
+      </w:r>
+      <w:r>
+        <w:t xml:space="preserve"> </w:t>
       </w:r>
       <w:r>
         <w:rPr>
@@ -1732,7 +2172,10 @@
         <w:t xml:space="preserve">2</w:t>
       </w:r>
       <w:r>
-        <w:t xml:space="preserve"> buttons at the top left to collapse or expand every quarter.</w:t>
+        <w:t xml:space="preserve"> </w:t>
+      </w:r>
+      <w:r>
+        <w:t xml:space="preserve">buttons at the top left to collapse or expand every quarter.</w:t>
       </w:r>
     </w:p>
     <w:p>
@@ -1751,7 +2194,13 @@
         <w:t xml:space="preserve">Blocks:</w:t>
       </w:r>
       <w:r>
-        <w:t xml:space="preserve"> MP, OM, EQ, CO and OTHER. Each block ends with </w:t>
+        <w:t xml:space="preserve"> </w:t>
+      </w:r>
+      <w:r>
+        <w:t xml:space="preserve">MP, OM, EQ, CO and OTHER. Each block ends with</w:t>
+      </w:r>
+      <w:r>
+        <w:t xml:space="preserve"> </w:t>
       </w:r>
       <w:r>
         <w:rPr>
@@ -1761,7 +2210,10 @@
         <w:t xml:space="preserve">Projected</w:t>
       </w:r>
       <w:r>
-        <w:t xml:space="preserve">, </w:t>
+        <w:t xml:space="preserve">,</w:t>
+      </w:r>
+      <w:r>
+        <w:t xml:space="preserve"> </w:t>
       </w:r>
       <w:r>
         <w:rPr>
@@ -1771,7 +2223,10 @@
         <w:t xml:space="preserve">Actual</w:t>
       </w:r>
       <w:r>
-        <w:t xml:space="preserve">, </w:t>
+        <w:t xml:space="preserve">,</w:t>
+      </w:r>
+      <w:r>
+        <w:t xml:space="preserve"> </w:t>
       </w:r>
       <w:r>
         <w:rPr>
@@ -1781,7 +2236,13 @@
         <w:t xml:space="preserve">Variance ($)</w:t>
       </w:r>
       <w:r>
-        <w:t xml:space="preserve"> and </w:t>
+        <w:t xml:space="preserve"> </w:t>
+      </w:r>
+      <w:r>
+        <w:t xml:space="preserve">and</w:t>
+      </w:r>
+      <w:r>
+        <w:t xml:space="preserve"> </w:t>
       </w:r>
       <w:r>
         <w:rPr>
@@ -1791,7 +2252,10 @@
         <w:t xml:space="preserve">Variance (%)</w:t>
       </w:r>
       <w:r>
-        <w:t xml:space="preserve">. The </w:t>
+        <w:t xml:space="preserve">. The</w:t>
+      </w:r>
+      <w:r>
+        <w:t xml:space="preserve"> </w:t>
       </w:r>
       <w:r>
         <w:rPr>
@@ -1801,7 +2265,10 @@
         <w:t xml:space="preserve">PROJECT TOTAL</w:t>
       </w:r>
       <w:r>
-        <w:t xml:space="preserve"> rows are at the bottom.</w:t>
+        <w:t xml:space="preserve"> </w:t>
+      </w:r>
+      <w:r>
+        <w:t xml:space="preserve">rows are at the bottom.</w:t>
       </w:r>
     </w:p>
     <w:p>
@@ -1820,7 +2287,13 @@
         <w:t xml:space="preserve">Variance</w:t>
       </w:r>
       <w:r>
-        <w:t xml:space="preserve"> = Actual − Projected; a positive figure means overspend. It’s shown only up to the </w:t>
+        <w:t xml:space="preserve"> </w:t>
+      </w:r>
+      <w:r>
+        <w:t xml:space="preserve">= Actual − Projected; a positive figure means overspend. It’s shown only up to the</w:t>
+      </w:r>
+      <w:r>
+        <w:t xml:space="preserve"> </w:t>
       </w:r>
       <w:r>
         <w:rPr>
@@ -1830,7 +2303,10 @@
         <w:t xml:space="preserve">Latest SOA Month</w:t>
       </w:r>
       <w:r>
-        <w:t xml:space="preserve"> (C9), so future plans don’t look like underspend.</w:t>
+        <w:t xml:space="preserve"> </w:t>
+      </w:r>
+      <w:r>
+        <w:t xml:space="preserve">(C9), so future plans don’t look like underspend.</w:t>
       </w:r>
     </w:p>
     <w:p>
@@ -1849,7 +2325,10 @@
         <w:t xml:space="preserve">Grey MP rows,</w:t>
       </w:r>
       <w:r>
-        <w:t xml:space="preserve"> e.g. </w:t>
+        <w:t xml:space="preserve"> </w:t>
+      </w:r>
+      <w:r>
+        <w:t xml:space="preserve">e.g. </w:t>
       </w:r>
       <w:r>
         <w:rPr>
@@ -1858,7 +2337,10 @@
         <w:t xml:space="preserve">RA (Projected)</w:t>
       </w:r>
       <w:r>
-        <w:t xml:space="preserve">, are manpower projections (FTE × rate). They come from the manpower sheet and </w:t>
+        <w:t xml:space="preserve">, are manpower projections (FTE × rate). They come from the manpower sheet and</w:t>
+      </w:r>
+      <w:r>
+        <w:t xml:space="preserve"> </w:t>
       </w:r>
       <w:r>
         <w:rPr>
@@ -1890,7 +2372,10 @@
         <w:pStyle w:val="Compact"/>
       </w:pPr>
       <w:r>
-        <w:t xml:space="preserve">Type monthly amounts in the </w:t>
+        <w:t xml:space="preserve">Type monthly amounts in the</w:t>
+      </w:r>
+      <w:r>
+        <w:t xml:space="preserve"> </w:t>
       </w:r>
       <w:r>
         <w:rPr>
@@ -1912,7 +2397,10 @@
         <w:pStyle w:val="Compact"/>
       </w:pPr>
       <w:r>
-        <w:t xml:space="preserve">A </w:t>
+        <w:t xml:space="preserve">A</w:t>
+      </w:r>
+      <w:r>
+        <w:t xml:space="preserve"> </w:t>
       </w:r>
       <w:r>
         <w:rPr>
@@ -1922,7 +2410,13 @@
         <w:t xml:space="preserve">blank</w:t>
       </w:r>
       <w:r>
-        <w:t xml:space="preserve"> cell means no projection. </w:t>
+        <w:t xml:space="preserve"> </w:t>
+      </w:r>
+      <w:r>
+        <w:t xml:space="preserve">cell means no projection.</w:t>
+      </w:r>
+      <w:r>
+        <w:t xml:space="preserve"> </w:t>
       </w:r>
       <w:r>
         <w:rPr>
@@ -1932,7 +2426,10 @@
         <w:t xml:space="preserve">0</w:t>
       </w:r>
       <w:r>
-        <w:t xml:space="preserve"> is saved as 0.</w:t>
+        <w:t xml:space="preserve"> </w:t>
+      </w:r>
+      <w:r>
+        <w:t xml:space="preserve">is saved as 0.</w:t>
       </w:r>
     </w:p>
     <w:p>
@@ -1948,12 +2445,75 @@
       </w:r>
     </w:p>
     <w:bookmarkEnd w:id="33"/>
-    <w:bookmarkStart w:id="34" w:name="save"/>
+    <w:bookmarkStart w:id="34" w:name="remarks"/>
     <w:p>
       <w:pPr>
         <w:pStyle w:val="Heading3"/>
       </w:pPr>
       <w:r>
+        <w:t xml:space="preserve">Remarks</w:t>
+      </w:r>
+    </w:p>
+    <w:p>
+      <w:pPr>
+        <w:numPr>
+          <w:ilvl w:val="0"/>
+          <w:numId w:val="1015"/>
+        </w:numPr>
+        <w:pStyle w:val="Compact"/>
+      </w:pPr>
+      <w:r>
+        <w:t xml:space="preserve">Type a note in the yellow</w:t>
+      </w:r>
+      <w:r>
+        <w:t xml:space="preserve"> </w:t>
+      </w:r>
+      <w:r>
+        <w:rPr>
+          <w:bCs/>
+          <w:b/>
+        </w:rPr>
+        <w:t xml:space="preserve">Remarks</w:t>
+      </w:r>
+      <w:r>
+        <w:t xml:space="preserve"> </w:t>
+      </w:r>
+      <w:r>
+        <w:t xml:space="preserve">cell at the end of any line row, after Project Total. Long remarks wrap and the row grows.</w:t>
+      </w:r>
+    </w:p>
+    <w:p>
+      <w:pPr>
+        <w:numPr>
+          <w:ilvl w:val="0"/>
+          <w:numId w:val="1015"/>
+        </w:numPr>
+        <w:pStyle w:val="Compact"/>
+      </w:pPr>
+      <w:r>
+        <w:t xml:space="preserve">Remarks are saved with</w:t>
+      </w:r>
+      <w:r>
+        <w:t xml:space="preserve"> </w:t>
+      </w:r>
+      <w:r>
+        <w:rPr>
+          <w:bCs/>
+          <w:b/>
+        </w:rPr>
+        <w:t xml:space="preserve">Save Projections</w:t>
+      </w:r>
+      <w:r>
+        <w:t xml:space="preserve">, separately for each project, and come back when you load the project again. An edited remark counts as an unsaved change.</w:t>
+      </w:r>
+    </w:p>
+    <w:bookmarkEnd w:id="34"/>
+    <w:bookmarkStart w:id="35" w:name="save"/>
+    <w:p>
+      <w:pPr>
+        <w:pStyle w:val="Heading3"/>
+      </w:pPr>
+      <w:r>
         <w:t xml:space="preserve">Save</w:t>
       </w:r>
     </w:p>
@@ -1961,12 +2521,15 @@
       <w:pPr>
         <w:numPr>
           <w:ilvl w:val="0"/>
-          <w:numId w:val="1015"/>
-        </w:numPr>
-        <w:pStyle w:val="Compact"/>
-      </w:pPr>
-      <w:r>
-        <w:t xml:space="preserve">Click </w:t>
+          <w:numId w:val="1016"/>
+        </w:numPr>
+        <w:pStyle w:val="Compact"/>
+      </w:pPr>
+      <w:r>
+        <w:t xml:space="preserve">Click</w:t>
+      </w:r>
+      <w:r>
+        <w:t xml:space="preserve"> </w:t>
       </w:r>
       <w:r>
         <w:rPr>
@@ -1976,26 +2539,43 @@
         <w:t xml:space="preserve">Save Projections</w:t>
       </w:r>
       <w:r>
-        <w:t xml:space="preserve">. Only this project’s saved amounts are replaced.</w:t>
-      </w:r>
-    </w:p>
-    <w:p>
-      <w:pPr>
-        <w:numPr>
-          <w:ilvl w:val="0"/>
-          <w:numId w:val="1015"/>
-        </w:numPr>
-        <w:pStyle w:val="Compact"/>
-      </w:pPr>
-      <w:r>
-        <w:t xml:space="preserve">If you switch project with unsaved changes, Excel asks </w:t>
-      </w:r>
-      <w:r>
-        <w:rPr>
-          <w:bCs/>
-          <w:b/>
-        </w:rPr>
-        <w:t xml:space="preserve">“Save changes to … first?”</w:t>
+        <w:t xml:space="preserve">. Only this project’s saved amounts and remarks are replaced.</w:t>
+      </w:r>
+    </w:p>
+    <w:p>
+      <w:pPr>
+        <w:numPr>
+          <w:ilvl w:val="0"/>
+          <w:numId w:val="1016"/>
+        </w:numPr>
+        <w:pStyle w:val="Compact"/>
+      </w:pPr>
+      <w:r>
+        <w:t xml:space="preserve">If you switch project with unsaved changes, Excel asks</w:t>
+      </w:r>
+      <w:r>
+        <w:t xml:space="preserve"> </w:t>
+      </w:r>
+      <w:r>
+        <w:rPr>
+          <w:bCs/>
+          <w:b/>
+        </w:rPr>
+        <w:t xml:space="preserve">“</w:t>
+      </w:r>
+      <w:r>
+        <w:rPr>
+          <w:bCs/>
+          <w:b/>
+        </w:rPr>
+        <w:t xml:space="preserve">Save changes to … first?</w:t>
+      </w:r>
+      <w:r>
+        <w:rPr>
+          <w:bCs/>
+          <w:b/>
+        </w:rPr>
+        <w:t xml:space="preserve">”</w:t>
       </w:r>
       <w:r>
         <w:t xml:space="preserve">:</w:t>
@@ -2005,209 +2585,605 @@
       <w:pPr>
         <w:numPr>
           <w:ilvl w:val="1"/>
+          <w:numId w:val="1017"/>
+        </w:numPr>
+        <w:pStyle w:val="Compact"/>
+      </w:pPr>
+      <w:r>
+        <w:rPr>
+          <w:bCs/>
+          <w:b/>
+        </w:rPr>
+        <w:t xml:space="preserve">Yes</w:t>
+      </w:r>
+      <w:r>
+        <w:t xml:space="preserve"> </w:t>
+      </w:r>
+      <w:r>
+        <w:t xml:space="preserve">saves;</w:t>
+      </w:r>
+    </w:p>
+    <w:p>
+      <w:pPr>
+        <w:numPr>
+          <w:ilvl w:val="1"/>
+          <w:numId w:val="1017"/>
+        </w:numPr>
+        <w:pStyle w:val="Compact"/>
+      </w:pPr>
+      <w:r>
+        <w:rPr>
+          <w:bCs/>
+          <w:b/>
+        </w:rPr>
+        <w:t xml:space="preserve">No</w:t>
+      </w:r>
+      <w:r>
+        <w:t xml:space="preserve"> </w:t>
+      </w:r>
+      <w:r>
+        <w:t xml:space="preserve">discards the changes;</w:t>
+      </w:r>
+    </w:p>
+    <w:p>
+      <w:pPr>
+        <w:numPr>
+          <w:ilvl w:val="1"/>
+          <w:numId w:val="1017"/>
+        </w:numPr>
+        <w:pStyle w:val="Compact"/>
+      </w:pPr>
+      <w:r>
+        <w:rPr>
+          <w:bCs/>
+          <w:b/>
+        </w:rPr>
+        <w:t xml:space="preserve">Cancel</w:t>
+      </w:r>
+      <w:r>
+        <w:t xml:space="preserve"> </w:t>
+      </w:r>
+      <w:r>
+        <w:t xml:space="preserve">stays on the current project.</w:t>
+      </w:r>
+    </w:p>
+    <w:p>
+      <w:pPr>
+        <w:numPr>
+          <w:ilvl w:val="0"/>
           <w:numId w:val="1016"/>
         </w:numPr>
         <w:pStyle w:val="Compact"/>
       </w:pPr>
       <w:r>
-        <w:rPr>
-          <w:bCs/>
-          <w:b/>
-        </w:rPr>
-        <w:t xml:space="preserve">Yes</w:t>
-      </w:r>
-      <w:r>
-        <w:t xml:space="preserve"> saves;</w:t>
+        <w:t xml:space="preserve">If someone else saved this project after you loaded it, you’re asked whether to</w:t>
+      </w:r>
+      <w:r>
+        <w:t xml:space="preserve"> </w:t>
+      </w:r>
+      <w:r>
+        <w:rPr>
+          <w:bCs/>
+          <w:b/>
+        </w:rPr>
+        <w:t xml:space="preserve">overwrite</w:t>
+      </w:r>
+      <w:r>
+        <w:t xml:space="preserve"> </w:t>
+      </w:r>
+      <w:r>
+        <w:t xml:space="preserve">their save.</w:t>
+      </w:r>
+    </w:p>
+    <w:p>
+      <w:pPr>
+        <w:numPr>
+          <w:ilvl w:val="0"/>
+          <w:numId w:val="1016"/>
+        </w:numPr>
+        <w:pStyle w:val="Compact"/>
+      </w:pPr>
+      <w:r>
+        <w:t xml:space="preserve">If you changed E6/F6 without clicking Load Project, saving is blocked with</w:t>
+      </w:r>
+      <w:r>
+        <w:t xml:space="preserve"> </w:t>
+      </w:r>
+      <w:r>
+        <w:rPr>
+          <w:bCs/>
+          <w:b/>
+        </w:rPr>
+        <w:t xml:space="preserve">“</w:t>
+      </w:r>
+      <w:r>
+        <w:rPr>
+          <w:bCs/>
+          <w:b/>
+        </w:rPr>
+        <w:t xml:space="preserve">Selection changed — reload first</w:t>
+      </w:r>
+      <w:r>
+        <w:rPr>
+          <w:bCs/>
+          <w:b/>
+        </w:rPr>
+        <w:t xml:space="preserve">”</w:t>
+      </w:r>
+      <w:r>
+        <w:t xml:space="preserve">.</w:t>
+      </w:r>
+    </w:p>
+    <w:bookmarkEnd w:id="35"/>
+    <w:bookmarkStart w:id="36" w:name="unmatched-rows"/>
+    <w:p>
+      <w:pPr>
+        <w:pStyle w:val="Heading3"/>
+      </w:pPr>
+      <w:r>
+        <w:t xml:space="preserve">Unmatched rows</w:t>
+      </w:r>
+    </w:p>
+    <w:p>
+      <w:pPr>
+        <w:pStyle w:val="FirstParagraph"/>
+      </w:pPr>
+      <w:r>
+        <w:t xml:space="preserve">Italic rows starting</w:t>
+      </w:r>
+      <w:r>
+        <w:t xml:space="preserve"> </w:t>
+      </w:r>
+      <w:r>
+        <w:rPr>
+          <w:bCs/>
+          <w:b/>
+        </w:rPr>
+        <w:t xml:space="preserve">“</w:t>
+      </w:r>
+      <w:r>
+        <w:rPr>
+          <w:bCs/>
+          <w:b/>
+        </w:rPr>
+        <w:t xml:space="preserve">Unmatched:</w:t>
+      </w:r>
+      <w:r>
+        <w:rPr>
+          <w:bCs/>
+          <w:b/>
+        </w:rPr>
+        <w:t xml:space="preserve">”</w:t>
+      </w:r>
+      <w:r>
+        <w:t xml:space="preserve"> </w:t>
+      </w:r>
+      <w:r>
+        <w:t xml:space="preserve">hold saved amounts, or a saved remark, that no longer fit the grid. This happens when:</w:t>
+      </w:r>
+      <w:r>
+        <w:t xml:space="preserve"> </w:t>
+      </w:r>
+      <w:r>
+        <w:t xml:space="preserve">- a budget line was renamed or removed in SOA;</w:t>
+      </w:r>
+      <w:r>
+        <w:t xml:space="preserve"> </w:t>
+      </w:r>
+      <w:r>
+        <w:t xml:space="preserve">- a line now nets to $0; or</w:t>
+      </w:r>
+      <w:r>
+        <w:t xml:space="preserve"> </w:t>
+      </w:r>
+      <w:r>
+        <w:t xml:space="preserve">- a month falls outside the project dates.</w:t>
+      </w:r>
+    </w:p>
+    <w:p>
+      <w:pPr>
+        <w:pStyle w:val="BodyText"/>
+      </w:pPr>
+      <w:r>
+        <w:t xml:space="preserve">These amounts still</w:t>
+      </w:r>
+      <w:r>
+        <w:t xml:space="preserve"> </w:t>
+      </w:r>
+      <w:r>
+        <w:rPr>
+          <w:bCs/>
+          <w:b/>
+        </w:rPr>
+        <w:t xml:space="preserve">count in the totals</w:t>
+      </w:r>
+      <w:r>
+        <w:t xml:space="preserve">. A line’s remark follows it to its Unmatched row; a row that holds only a remark says</w:t>
+      </w:r>
+      <w:r>
+        <w:t xml:space="preserve"> </w:t>
+      </w:r>
+      <w:r>
+        <w:t xml:space="preserve">“</w:t>
+      </w:r>
+      <w:r>
+        <w:t xml:space="preserve">remark only</w:t>
+      </w:r>
+      <w:r>
+        <w:t xml:space="preserve">”</w:t>
+      </w:r>
+      <w:r>
+        <w:t xml:space="preserve">.</w:t>
+      </w:r>
+      <w:r>
+        <w:t xml:space="preserve"> </w:t>
+      </w:r>
+      <w:r>
+        <w:t xml:space="preserve">-</w:t>
+      </w:r>
+      <w:r>
+        <w:t xml:space="preserve"> </w:t>
+      </w:r>
+      <w:r>
+        <w:rPr>
+          <w:bCs/>
+          <w:b/>
+        </w:rPr>
+        <w:t xml:space="preserve">Re-assign:</w:t>
+      </w:r>
+      <w:r>
+        <w:t xml:space="preserve"> </w:t>
+      </w:r>
+      <w:r>
+        <w:t xml:space="preserve">click a cell in the Unmatched row, click</w:t>
+      </w:r>
+      <w:r>
+        <w:t xml:space="preserve"> </w:t>
+      </w:r>
+      <w:r>
+        <w:rPr>
+          <w:bCs/>
+          <w:b/>
+        </w:rPr>
+        <w:t xml:space="preserve">Re-assign unmatched</w:t>
+      </w:r>
+      <w:r>
+        <w:t xml:space="preserve">, then click any cell in the budget line that should get the amounts. The remark moves too and is added after any remark already on that line.</w:t>
+      </w:r>
+      <w:r>
+        <w:t xml:space="preserve"> </w:t>
+      </w:r>
+      <w:r>
+        <w:t xml:space="preserve">-</w:t>
+      </w:r>
+      <w:r>
+        <w:t xml:space="preserve"> </w:t>
+      </w:r>
+      <w:r>
+        <w:rPr>
+          <w:bCs/>
+          <w:b/>
+        </w:rPr>
+        <w:t xml:space="preserve">Delete:</w:t>
+      </w:r>
+      <w:r>
+        <w:t xml:space="preserve"> </w:t>
+      </w:r>
+      <w:r>
+        <w:t xml:space="preserve">click a cell in the Unmatched row, then click</w:t>
+      </w:r>
+      <w:r>
+        <w:t xml:space="preserve"> </w:t>
+      </w:r>
+      <w:r>
+        <w:rPr>
+          <w:bCs/>
+          <w:b/>
+        </w:rPr>
+        <w:t xml:space="preserve">Delete unmatched</w:t>
+      </w:r>
+      <w:r>
+        <w:t xml:space="preserve"> </w:t>
+      </w:r>
+      <w:r>
+        <w:t xml:space="preserve">and confirm. The remark is deleted too.</w:t>
+      </w:r>
+      <w:r>
+        <w:t xml:space="preserve"> </w:t>
+      </w:r>
+      <w:r>
+        <w:t xml:space="preserve">- In the</w:t>
+      </w:r>
+      <w:r>
+        <w:t xml:space="preserve"> </w:t>
+      </w:r>
+      <w:r>
+        <w:rPr>
+          <w:bCs/>
+          <w:b/>
+        </w:rPr>
+        <w:t xml:space="preserve">MP</w:t>
+      </w:r>
+      <w:r>
+        <w:t xml:space="preserve"> </w:t>
+      </w:r>
+      <w:r>
+        <w:t xml:space="preserve">block there are no typed lines, so an Unmatched row there can only be deleted. Copy its remark first if you still need it.</w:t>
+      </w:r>
+    </w:p>
+    <w:bookmarkEnd w:id="36"/>
+    <w:bookmarkStart w:id="37" w:name="X123e25bff91fc87ad52e6c819a310f4f949830c"/>
+    <w:p>
+      <w:pPr>
+        <w:pStyle w:val="Heading3"/>
+      </w:pPr>
+      <w:r>
+        <w:t xml:space="preserve">Charge a manpower line to another category (admin)</w:t>
+      </w:r>
+    </w:p>
+    <w:p>
+      <w:pPr>
+        <w:numPr>
+          <w:ilvl w:val="0"/>
+          <w:numId w:val="1018"/>
+        </w:numPr>
+        <w:pStyle w:val="Compact"/>
+      </w:pPr>
+      <w:r>
+        <w:t xml:space="preserve">On the</w:t>
+      </w:r>
+      <w:r>
+        <w:t xml:space="preserve"> </w:t>
+      </w:r>
+      <w:r>
+        <w:rPr>
+          <w:bCs/>
+          <w:b/>
+        </w:rPr>
+        <w:t xml:space="preserve">Dashboard_Settings</w:t>
+      </w:r>
+      <w:r>
+        <w:t xml:space="preserve"> </w:t>
+      </w:r>
+      <w:r>
+        <w:t xml:space="preserve">sheet, add a row to the table with:</w:t>
       </w:r>
     </w:p>
     <w:p>
       <w:pPr>
         <w:numPr>
           <w:ilvl w:val="1"/>
-          <w:numId w:val="1016"/>
-        </w:numPr>
-        <w:pStyle w:val="Compact"/>
-      </w:pPr>
-      <w:r>
-        <w:rPr>
-          <w:bCs/>
-          <w:b/>
-        </w:rPr>
-        <w:t xml:space="preserve">No</w:t>
-      </w:r>
-      <w:r>
-        <w:t xml:space="preserve"> discards the changes;</w:t>
+          <w:numId w:val="1019"/>
+        </w:numPr>
+        <w:pStyle w:val="Compact"/>
+      </w:pPr>
+      <w:r>
+        <w:t xml:space="preserve">Source Project, Main IO;</w:t>
       </w:r>
     </w:p>
     <w:p>
       <w:pPr>
         <w:numPr>
           <w:ilvl w:val="1"/>
-          <w:numId w:val="1016"/>
-        </w:numPr>
-        <w:pStyle w:val="Compact"/>
-      </w:pPr>
-      <w:r>
-        <w:rPr>
-          <w:bCs/>
-          <w:b/>
-        </w:rPr>
-        <w:t xml:space="preserve">Cancel</w:t>
-      </w:r>
-      <w:r>
-        <w:t xml:space="preserve"> stays on the current project.</w:t>
-      </w:r>
-    </w:p>
-    <w:p>
-      <w:pPr>
-        <w:numPr>
-          <w:ilvl w:val="0"/>
-          <w:numId w:val="1015"/>
-        </w:numPr>
-        <w:pStyle w:val="Compact"/>
-      </w:pPr>
-      <w:r>
-        <w:t xml:space="preserve">If someone else saved this project after you loaded it, you’re asked whether to </w:t>
-      </w:r>
-      <w:r>
-        <w:rPr>
-          <w:bCs/>
-          <w:b/>
-        </w:rPr>
-        <w:t xml:space="preserve">overwrite</w:t>
-      </w:r>
-      <w:r>
-        <w:t xml:space="preserve"> their save.</w:t>
-      </w:r>
-    </w:p>
-    <w:p>
-      <w:pPr>
-        <w:numPr>
-          <w:ilvl w:val="0"/>
-          <w:numId w:val="1015"/>
-        </w:numPr>
-        <w:pStyle w:val="Compact"/>
-      </w:pPr>
-      <w:r>
-        <w:t xml:space="preserve">If you changed E6/F6 without clicking Load Project, saving is blocked with </w:t>
-      </w:r>
-      <w:r>
-        <w:rPr>
-          <w:bCs/>
-          <w:b/>
-        </w:rPr>
-        <w:t xml:space="preserve">“Selection changed — reload first”</w:t>
-      </w:r>
-      <w:r>
-        <w:t xml:space="preserve">.</w:t>
-      </w:r>
-    </w:p>
-    <w:bookmarkEnd w:id="34"/>
-    <w:bookmarkStart w:id="35" w:name="unmatched-rows"/>
-    <w:p>
-      <w:pPr>
-        <w:pStyle w:val="Heading3"/>
-      </w:pPr>
-      <w:r>
-        <w:t xml:space="preserve">Unmatched rows</w:t>
-      </w:r>
-    </w:p>
-    <w:p>
-      <w:pPr>
-        <w:pStyle w:val="FirstParagraph"/>
-      </w:pPr>
-      <w:r>
-        <w:t xml:space="preserve">Italic rows starting </w:t>
-      </w:r>
-      <w:r>
-        <w:rPr>
-          <w:bCs/>
-          <w:b/>
-        </w:rPr>
-        <w:t xml:space="preserve">“Unmatched:”</w:t>
-      </w:r>
-      <w:r>
-        <w:t xml:space="preserve"> hold saved amounts that no longer fit the grid. This happens when: - a budget line was renamed or removed in SOA; - a line now nets to $0; or - a month falls outside the project dates.</w:t>
-      </w:r>
-    </w:p>
-    <w:p>
-      <w:pPr>
-        <w:pStyle w:val="BodyText"/>
-      </w:pPr>
-      <w:r>
-        <w:t xml:space="preserve">These amounts still </w:t>
-      </w:r>
-      <w:r>
-        <w:rPr>
-          <w:bCs/>
-          <w:b/>
-        </w:rPr>
-        <w:t xml:space="preserve">count in the totals</w:t>
-      </w:r>
-      <w:r>
-        <w:t xml:space="preserve">. - </w:t>
-      </w:r>
-      <w:r>
-        <w:rPr>
-          <w:bCs/>
-          <w:b/>
-        </w:rPr>
-        <w:t xml:space="preserve">Re-assign:</w:t>
-      </w:r>
-      <w:r>
-        <w:t xml:space="preserve"> click a cell in the Unmatched row, click </w:t>
-      </w:r>
-      <w:r>
-        <w:rPr>
-          <w:bCs/>
-          <w:b/>
-        </w:rPr>
-        <w:t xml:space="preserve">Re-assign unmatched</w:t>
-      </w:r>
-      <w:r>
-        <w:t xml:space="preserve">, then click any cell in the budget line that should get the amounts. - </w:t>
-      </w:r>
-      <w:r>
-        <w:rPr>
-          <w:bCs/>
-          <w:b/>
-        </w:rPr>
-        <w:t xml:space="preserve">Delete:</w:t>
-      </w:r>
-      <w:r>
-        <w:t xml:space="preserve"> click a cell in the Unmatched row, then click </w:t>
-      </w:r>
-      <w:r>
-        <w:rPr>
-          <w:bCs/>
-          <w:b/>
-        </w:rPr>
-        <w:t xml:space="preserve">Delete unmatched</w:t>
-      </w:r>
-      <w:r>
-        <w:t xml:space="preserve"> and confirm.</w:t>
-      </w:r>
-    </w:p>
-    <w:bookmarkEnd w:id="35"/>
-    <w:bookmarkStart w:id="36" w:name="X123e25bff91fc87ad52e6c819a310f4f949830c"/>
-    <w:p>
-      <w:pPr>
-        <w:pStyle w:val="Heading3"/>
-      </w:pPr>
-      <w:r>
-        <w:t xml:space="preserve">Charge a manpower line to another category (admin)</w:t>
-      </w:r>
-    </w:p>
-    <w:p>
-      <w:pPr>
-        <w:numPr>
-          <w:ilvl w:val="0"/>
-          <w:numId w:val="1017"/>
-        </w:numPr>
-        <w:pStyle w:val="Compact"/>
-      </w:pPr>
-      <w:r>
-        <w:t xml:space="preserve">On the </w:t>
+          <w:numId w:val="1019"/>
+        </w:numPr>
+        <w:pStyle w:val="Compact"/>
+      </w:pPr>
+      <w:r>
+        <w:t xml:space="preserve">Rate Category, e.g. </w:t>
+      </w:r>
+      <w:r>
+        <w:rPr>
+          <w:rStyle w:val="VerbatimChar"/>
+        </w:rPr>
+        <w:t xml:space="preserve">AHS</w:t>
+      </w:r>
+      <w:r>
+        <w:t xml:space="preserve">;</w:t>
+      </w:r>
+    </w:p>
+    <w:p>
+      <w:pPr>
+        <w:numPr>
+          <w:ilvl w:val="1"/>
+          <w:numId w:val="1019"/>
+        </w:numPr>
+        <w:pStyle w:val="Compact"/>
+      </w:pPr>
+      <w:r>
+        <w:t xml:space="preserve">the manpower IO Code, e.g. </w:t>
+      </w:r>
+      <w:r>
+        <w:rPr>
+          <w:rStyle w:val="VerbatimChar"/>
+        </w:rPr>
+        <w:t xml:space="preserve">TF25HIP136MP</w:t>
+      </w:r>
+      <w:r>
+        <w:t xml:space="preserve">;</w:t>
+      </w:r>
+    </w:p>
+    <w:p>
+      <w:pPr>
+        <w:numPr>
+          <w:ilvl w:val="1"/>
+          <w:numId w:val="1019"/>
+        </w:numPr>
+        <w:pStyle w:val="Compact"/>
+      </w:pPr>
+      <w:r>
+        <w:rPr>
+          <w:bCs/>
+          <w:b/>
+        </w:rPr>
+        <w:t xml:space="preserve">Charge To</w:t>
+      </w:r>
+      <w:r>
+        <w:t xml:space="preserve"> </w:t>
+      </w:r>
+      <w:r>
+        <w:t xml:space="preserve">(MP, OM, EQ, CO or OTHER).</w:t>
+      </w:r>
+    </w:p>
+    <w:p>
+      <w:pPr>
+        <w:numPr>
+          <w:ilvl w:val="0"/>
+          <w:numId w:val="1018"/>
+        </w:numPr>
+        <w:pStyle w:val="Compact"/>
+      </w:pPr>
+      <w:r>
+        <w:t xml:space="preserve">The next Load moves that line into that block as a locked row.</w:t>
+      </w:r>
+    </w:p>
+    <w:bookmarkEnd w:id="37"/>
+    <w:bookmarkEnd w:id="38"/>
+    <w:bookmarkStart w:id="39" w:name="what-changed-from-v0.8"/>
+    <w:p>
+      <w:pPr>
+        <w:pStyle w:val="Heading2"/>
+      </w:pPr>
+      <w:r>
+        <w:t xml:space="preserve">5. What changed from v0.8</w:t>
+      </w:r>
+    </w:p>
+    <w:p>
+      <w:pPr>
+        <w:numPr>
+          <w:ilvl w:val="0"/>
+          <w:numId w:val="1020"/>
+        </w:numPr>
+        <w:pStyle w:val="Compact"/>
+      </w:pPr>
+      <w:r>
+        <w:t xml:space="preserve">The old fixed timeline, the Manual Projection table, the Patient Reimbursement table and the C5 Project Display Name selector are retired.</w:t>
+      </w:r>
+    </w:p>
+    <w:p>
+      <w:pPr>
+        <w:numPr>
+          <w:ilvl w:val="1"/>
+          <w:numId w:val="1021"/>
+        </w:numPr>
+        <w:pStyle w:val="Compact"/>
+      </w:pPr>
+      <w:r>
+        <w:t xml:space="preserve">A full copy of the v0.8 dashboard is kept on a hidden sheet,</w:t>
+      </w:r>
+      <w:r>
+        <w:t xml:space="preserve"> </w:t>
+      </w:r>
+      <w:r>
+        <w:rPr>
+          <w:bCs/>
+          <w:b/>
+        </w:rPr>
+        <w:t xml:space="preserve">Legacy_Timeline</w:t>
+      </w:r>
+      <w:r>
+        <w:t xml:space="preserve">, for comparison during testing. To view it: right-click any sheet tab →</w:t>
+      </w:r>
+      <w:r>
+        <w:t xml:space="preserve"> </w:t>
+      </w:r>
+      <w:r>
+        <w:rPr>
+          <w:bCs/>
+          <w:b/>
+        </w:rPr>
+        <w:t xml:space="preserve">Unhide</w:t>
+      </w:r>
+      <w:r>
+        <w:t xml:space="preserve"> </w:t>
+      </w:r>
+      <w:r>
+        <w:t xml:space="preserve">→ Legacy_Timeline.</w:t>
+      </w:r>
+    </w:p>
+    <w:p>
+      <w:pPr>
+        <w:numPr>
+          <w:ilvl w:val="0"/>
+          <w:numId w:val="1020"/>
+        </w:numPr>
+        <w:pStyle w:val="Compact"/>
+      </w:pPr>
+      <w:r>
+        <w:t xml:space="preserve">The KPI cards now read the new timeline totals.</w:t>
+      </w:r>
+    </w:p>
+    <w:p>
+      <w:pPr>
+        <w:numPr>
+          <w:ilvl w:val="0"/>
+          <w:numId w:val="1020"/>
+        </w:numPr>
+        <w:pStyle w:val="Compact"/>
+      </w:pPr>
+      <w:r>
+        <w:t xml:space="preserve">The manpower table and sheet keep their v0.8 names,</w:t>
+      </w:r>
+      <w:r>
+        <w:t xml:space="preserve"> </w:t>
+      </w:r>
+      <w:r>
+        <w:rPr>
+          <w:rStyle w:val="VerbatimChar"/>
+          <w:bCs/>
+          <w:b/>
+        </w:rPr>
+        <w:t xml:space="preserve">qManpower_SelectedTest</w:t>
+      </w:r>
+      <w:r>
+        <w:t xml:space="preserve"> </w:t>
+      </w:r>
+      <w:r>
+        <w:t xml:space="preserve">/</w:t>
+      </w:r>
+      <w:r>
+        <w:t xml:space="preserve"> </w:t>
+      </w:r>
+      <w:r>
+        <w:rPr>
+          <w:rStyle w:val="VerbatimChar"/>
+          <w:bCs/>
+          <w:b/>
+        </w:rPr>
+        <w:t xml:space="preserve">PQManpower_SelectedTest</w:t>
+      </w:r>
+      <w:r>
+        <w:t xml:space="preserve">. If you want them renamed to match the other selected-test tables, do it in Excel (Table Design → Table Name; right-click the sheet tab → Rename), never by editing the file, and ask for the VBA constant</w:t>
+      </w:r>
+      <w:r>
+        <w:t xml:space="preserve"> </w:t>
+      </w:r>
+      <w:r>
+        <w:rPr>
+          <w:rStyle w:val="VerbatimChar"/>
+        </w:rPr>
+        <w:t xml:space="preserve">MANPOWER_TABLE</w:t>
+      </w:r>
+      <w:r>
+        <w:t xml:space="preserve"> </w:t>
+      </w:r>
+      <w:r>
+        <w:t xml:space="preserve">to be updated.</w:t>
+      </w:r>
+    </w:p>
+    <w:p>
+      <w:pPr>
+        <w:numPr>
+          <w:ilvl w:val="0"/>
+          <w:numId w:val="1020"/>
+        </w:numPr>
+        <w:pStyle w:val="Compact"/>
+      </w:pPr>
+      <w:r>
+        <w:t xml:space="preserve">New sheets:</w:t>
+      </w:r>
+      <w:r>
+        <w:t xml:space="preserve"> </w:t>
       </w:r>
       <w:r>
         <w:rPr>
@@ -2217,250 +3193,36 @@
         <w:t xml:space="preserve">Dashboard_Settings</w:t>
       </w:r>
       <w:r>
-        <w:t xml:space="preserve"> sheet, add a row to the table with:</w:t>
-      </w:r>
-    </w:p>
-    <w:p>
-      <w:pPr>
-        <w:numPr>
-          <w:ilvl w:val="1"/>
-          <w:numId w:val="1018"/>
-        </w:numPr>
-        <w:pStyle w:val="Compact"/>
-      </w:pPr>
-      <w:r>
-        <w:t xml:space="preserve">Source Project, Main IO;</w:t>
-      </w:r>
-    </w:p>
-    <w:p>
-      <w:pPr>
-        <w:numPr>
-          <w:ilvl w:val="1"/>
-          <w:numId w:val="1018"/>
-        </w:numPr>
-        <w:pStyle w:val="Compact"/>
-      </w:pPr>
-      <w:r>
-        <w:t xml:space="preserve">Rate Category, e.g. </w:t>
-      </w:r>
-      <w:r>
-        <w:rPr>
-          <w:rStyle w:val="VerbatimChar"/>
-        </w:rPr>
-        <w:t xml:space="preserve">AHS</w:t>
-      </w:r>
-      <w:r>
-        <w:t xml:space="preserve">;</w:t>
-      </w:r>
-    </w:p>
-    <w:p>
-      <w:pPr>
-        <w:numPr>
-          <w:ilvl w:val="1"/>
-          <w:numId w:val="1018"/>
-        </w:numPr>
-        <w:pStyle w:val="Compact"/>
-      </w:pPr>
-      <w:r>
-        <w:t xml:space="preserve">the manpower IO Code, e.g. </w:t>
-      </w:r>
-      <w:r>
-        <w:rPr>
-          <w:rStyle w:val="VerbatimChar"/>
-        </w:rPr>
-        <w:t xml:space="preserve">TF25HIP136MP</w:t>
-      </w:r>
-      <w:r>
-        <w:t xml:space="preserve">;</w:t>
-      </w:r>
-    </w:p>
-    <w:p>
-      <w:pPr>
-        <w:numPr>
-          <w:ilvl w:val="1"/>
-          <w:numId w:val="1018"/>
-        </w:numPr>
-        <w:pStyle w:val="Compact"/>
-      </w:pPr>
-      <w:r>
-        <w:rPr>
-          <w:bCs/>
-          <w:b/>
-        </w:rPr>
-        <w:t xml:space="preserve">Charge To</w:t>
-      </w:r>
-      <w:r>
-        <w:t xml:space="preserve"> (MP, OM, EQ, CO or OTHER).</w:t>
-      </w:r>
-    </w:p>
-    <w:p>
-      <w:pPr>
-        <w:numPr>
-          <w:ilvl w:val="0"/>
-          <w:numId w:val="1017"/>
-        </w:numPr>
-        <w:pStyle w:val="Compact"/>
-      </w:pPr>
-      <w:r>
-        <w:t xml:space="preserve">The next Load moves that line into that block as a locked row.</w:t>
-      </w:r>
-    </w:p>
-    <w:bookmarkEnd w:id="36"/>
-    <w:bookmarkEnd w:id="37"/>
-    <w:bookmarkStart w:id="38" w:name="what-changed-from-v0.8"/>
-    <w:p>
-      <w:pPr>
-        <w:pStyle w:val="Heading2"/>
-      </w:pPr>
-      <w:r>
-        <w:t xml:space="preserve">5. What changed from v0.8</w:t>
-      </w:r>
-    </w:p>
-    <w:p>
-      <w:pPr>
-        <w:numPr>
-          <w:ilvl w:val="0"/>
-          <w:numId w:val="1019"/>
-        </w:numPr>
-        <w:pStyle w:val="Compact"/>
-      </w:pPr>
-      <w:r>
-        <w:t xml:space="preserve">The old fixed timeline, the Manual Projection table, the Patient Reimbursement table and the C5 Project Display Name selector are retired.</w:t>
-      </w:r>
-    </w:p>
-    <w:p>
-      <w:pPr>
-        <w:numPr>
-          <w:ilvl w:val="1"/>
+        <w:t xml:space="preserve">, and the hidden</w:t>
+      </w:r>
+      <w:r>
+        <w:t xml:space="preserve"> </w:t>
+      </w:r>
+      <w:r>
+        <w:rPr>
+          <w:bCs/>
+          <w:b/>
+        </w:rPr>
+        <w:t xml:space="preserve">ProjectionStore</w:t>
+      </w:r>
+      <w:r>
+        <w:t xml:space="preserve">, which holds the saved projections and remarks.</w:t>
+      </w:r>
+    </w:p>
+    <w:p>
+      <w:pPr>
+        <w:numPr>
+          <w:ilvl w:val="0"/>
           <w:numId w:val="1020"/>
         </w:numPr>
         <w:pStyle w:val="Compact"/>
       </w:pPr>
       <w:r>
-        <w:t xml:space="preserve">A full copy of the v0.8 dashboard is kept on a hidden sheet, </w:t>
-      </w:r>
-      <w:r>
-        <w:rPr>
-          <w:bCs/>
-          <w:b/>
-        </w:rPr>
-        <w:t xml:space="preserve">Legacy_Timeline</w:t>
-      </w:r>
-      <w:r>
-        <w:t xml:space="preserve">, for comparison during testing. To view it: right-click any sheet tab → </w:t>
-      </w:r>
-      <w:r>
-        <w:rPr>
-          <w:bCs/>
-          <w:b/>
-        </w:rPr>
-        <w:t xml:space="preserve">Unhide</w:t>
-      </w:r>
-      <w:r>
-        <w:t xml:space="preserve"> → Legacy_Timeline.</w:t>
-      </w:r>
-    </w:p>
-    <w:p>
-      <w:pPr>
-        <w:numPr>
-          <w:ilvl w:val="0"/>
-          <w:numId w:val="1019"/>
-        </w:numPr>
-        <w:pStyle w:val="Compact"/>
-      </w:pPr>
-      <w:r>
-        <w:t xml:space="preserve">The KPI cards now read the new timeline totals.</w:t>
-      </w:r>
-    </w:p>
-    <w:p>
-      <w:pPr>
-        <w:numPr>
-          <w:ilvl w:val="0"/>
-          <w:numId w:val="1019"/>
-        </w:numPr>
-        <w:pStyle w:val="Compact"/>
-      </w:pPr>
-      <w:r>
-        <w:t xml:space="preserve">The manpower table and sheet keep their v0.8 names, </w:t>
-      </w:r>
-      <w:r>
-        <w:rPr>
-          <w:rStyle w:val="VerbatimChar"/>
-          <w:bCs/>
-          <w:b/>
-        </w:rPr>
-        <w:t xml:space="preserve">qManpower_SelectedTest</w:t>
-      </w:r>
-      <w:r>
-        <w:t xml:space="preserve"> / </w:t>
-      </w:r>
-      <w:r>
-        <w:rPr>
-          <w:rStyle w:val="VerbatimChar"/>
-          <w:bCs/>
-          <w:b/>
-        </w:rPr>
-        <w:t xml:space="preserve">PQManpower_SelectedTest</w:t>
-      </w:r>
-      <w:r>
-        <w:t xml:space="preserve">. If you want them renamed to match the other selected-test tables, do it in Excel (Table Design → Table Name; right-click the sheet tab → Rename), never by editing the file, and ask for the VBA constant </w:t>
-      </w:r>
-      <w:r>
-        <w:rPr>
-          <w:rStyle w:val="VerbatimChar"/>
-        </w:rPr>
-        <w:t xml:space="preserve">MANPOWER_TABLE</w:t>
-      </w:r>
-      <w:r>
-        <w:t xml:space="preserve"> to be updated.</w:t>
-      </w:r>
-    </w:p>
-    <w:p>
-      <w:pPr>
-        <w:numPr>
-          <w:ilvl w:val="0"/>
-          <w:numId w:val="1019"/>
-        </w:numPr>
-        <w:pStyle w:val="Compact"/>
-      </w:pPr>
-      <w:r>
-        <w:t xml:space="preserve">New sheets: </w:t>
-      </w:r>
-      <w:r>
-        <w:rPr>
-          <w:bCs/>
-          <w:b/>
-        </w:rPr>
-        <w:t xml:space="preserve">Dashboard_Settings</w:t>
-      </w:r>
-      <w:r>
-        <w:t xml:space="preserve">, and the hidden </w:t>
-      </w:r>
-      <w:r>
-        <w:rPr>
-          <w:bCs/>
-          <w:b/>
-        </w:rPr>
-        <w:t xml:space="preserve">ProjectionStore</w:t>
-      </w:r>
-      <w:r>
-        <w:t xml:space="preserve">, which holds the saved projections.</w:t>
-      </w:r>
-    </w:p>
-    <w:p>
-      <w:pPr>
-        <w:numPr>
-          <w:ilvl w:val="0"/>
-          <w:numId w:val="1019"/>
-        </w:numPr>
-        <w:pStyle w:val="Compact"/>
-      </w:pPr>
-      <w:r>
         <w:t xml:space="preserve">No Power Query query or connection was changed.</w:t>
       </w:r>
     </w:p>
-    <w:bookmarkEnd w:id="38"/>
-    <w:bookmarkStart w:id="39" w:name="troubleshooting"/>
+    <w:bookmarkEnd w:id="39"/>
+    <w:bookmarkStart w:id="40" w:name="troubleshooting"/>
     <w:p>
       <w:pPr>
         <w:pStyle w:val="Heading2"/>
@@ -2544,7 +3306,13 @@
               <w:jc w:val="left"/>
             </w:pPr>
             <w:r>
-              <w:t xml:space="preserve">“Setup Status is …”</w:t>
+              <w:t xml:space="preserve">“</w:t>
+            </w:r>
+            <w:r>
+              <w:t xml:space="preserve">Setup Status is …</w:t>
+            </w:r>
+            <w:r>
+              <w:t xml:space="preserve">”</w:t>
             </w:r>
           </w:p>
         </w:tc>
@@ -2570,7 +3338,13 @@
               <w:jc w:val="left"/>
             </w:pPr>
             <w:r>
-              <w:t xml:space="preserve">“Refreshing … failed”</w:t>
+              <w:t xml:space="preserve">“</w:t>
+            </w:r>
+            <w:r>
+              <w:t xml:space="preserve">Refreshing … failed</w:t>
+            </w:r>
+            <w:r>
+              <w:t xml:space="preserve">”</w:t>
             </w:r>
           </w:p>
         </w:tc>
@@ -2596,7 +3370,13 @@
               <w:jc w:val="left"/>
             </w:pPr>
             <w:r>
-              <w:t xml:space="preserve">“… shows X, not Y”</w:t>
+              <w:t xml:space="preserve">“</w:t>
+            </w:r>
+            <w:r>
+              <w:t xml:space="preserve">… shows X, not Y</w:t>
+            </w:r>
+            <w:r>
+              <w:t xml:space="preserve">”</w:t>
             </w:r>
           </w:p>
         </w:tc>
@@ -2692,8 +3472,8 @@
         </w:tc>
       </w:tr>
     </w:tbl>
-    <w:bookmarkEnd w:id="39"/>
-    <w:bookmarkStart w:id="40" w:name="testing"/>
+    <w:bookmarkEnd w:id="40"/>
+    <w:bookmarkStart w:id="41" w:name="testing"/>
     <w:p>
       <w:pPr>
         <w:pStyle w:val="Heading2"/>
@@ -2707,7 +3487,10 @@
         <w:pStyle w:val="FirstParagraph"/>
       </w:pPr>
       <w:r>
-        <w:t xml:space="preserve">Work through </w:t>
+        <w:t xml:space="preserve">Work through</w:t>
+      </w:r>
+      <w:r>
+        <w:t xml:space="preserve"> </w:t>
       </w:r>
       <w:r>
         <w:rPr>
@@ -2716,11 +3499,32 @@
         <w:t xml:space="preserve">tests/UAT_test_script.md</w:t>
       </w:r>
       <w:r>
-        <w:t xml:space="preserve"> (tests 1–16). Send me: - each test number with Pass or Fail; - a screenshot and the message for any failure; - the saved workbook, so I can confirm Power Query is untouched (test 13).</w:t>
-      </w:r>
-    </w:p>
-    <w:bookmarkEnd w:id="40"/>
+        <w:t xml:space="preserve"> </w:t>
+      </w:r>
+      <w:r>
+        <w:t xml:space="preserve">(tests 1–18). Send me:</w:t>
+      </w:r>
+      <w:r>
+        <w:t xml:space="preserve"> </w:t>
+      </w:r>
+      <w:r>
+        <w:t xml:space="preserve">- each test number with Pass or Fail;</w:t>
+      </w:r>
+      <w:r>
+        <w:t xml:space="preserve"> </w:t>
+      </w:r>
+      <w:r>
+        <w:t xml:space="preserve">- a screenshot and the message for any failure;</w:t>
+      </w:r>
+      <w:r>
+        <w:t xml:space="preserve"> </w:t>
+      </w:r>
+      <w:r>
+        <w:t xml:space="preserve">- the saved workbook, so I can confirm Power Query is untouched (test 13).</w:t>
+      </w:r>
+    </w:p>
     <w:bookmarkEnd w:id="41"/>
+    <w:bookmarkEnd w:id="42"/>
     <w:sectPr/>
   </w:body>
 </w:document>
@@ -3292,6 +4096,9 @@
     <w:abstractNumId w:val="991"/>
   </w:num>
   <w:num w:numId="1020">
+    <w:abstractNumId w:val="991"/>
+  </w:num>
+  <w:num w:numId="1021">
     <w:abstractNumId w:val="991"/>
   </w:num>
 </w:numbering>

</xml_diff>

<commit_message>
Release zip without workbook; record decisions (future Actual blank, tDCS OT/RA rectified, width item closed)
- release/CashFlow_v0.9_package.zip: no workbook for now; current modules
  (row-5 selector), docs, tests and handovers; new README_FIRST.
- Spec 14.2 / PROJECT_REFERENCE 7: keep future Actual/Variance blank
  (reconfirmed 12 Oct). Incident: tDCS OT vs RA rectified in the source.
- Install guide md/docx, build log, handover, index and CLAUDE.md updated.

Co-Authored-By: Claude Opus 5.5 <noreply@anthropic.com>
Claude-Session: https://claude.ai/code/session_017h8ADiUSHW7ex1hhB7iQGv
</commit_message>
<xml_diff>
--- a/docs/v0.9_Install_and_User_Guide.docx
+++ b/docs/v0.9_Install_and_User_Guide.docx
@@ -130,9 +130,10 @@
             </w:pPr>
             <w:r>
               <w:rPr>
-                <w:rStyle w:val="VerbatimChar"/>
+                <w:iCs/>
+                <w:i/>
               </w:rPr>
-              <w:t xml:space="preserve">Clinical_Research_Cash_Flow_SharePoint_PQ_Ready_v0.9_working.xlsm</w:t>
+              <w:t xml:space="preserve">(no workbook for now)</w:t>
             </w:r>
           </w:p>
         </w:tc>
@@ -144,7 +145,7 @@
               <w:jc w:val="left"/>
             </w:pPr>
             <w:r>
-              <w:t xml:space="preserve">The v0.9 workbook. The sheets and tables are ready; the macros still need importing (section 3).</w:t>
+              <w:t xml:space="preserve">The package no longer includes a workbook (12 Oct 2026). Import the modules below into your own v0.9_working copy, the one with the selector in row 5. Steps 2–8 of section 3 still apply.</w:t>
             </w:r>
           </w:p>
         </w:tc>
@@ -353,7 +354,7 @@
               <w:jc w:val="left"/>
             </w:pPr>
             <w:r>
-              <w:t xml:space="preserve">The approved design (v1.0.2).</w:t>
+              <w:t xml:space="preserve">The approved design (v1.0.7).</w:t>
             </w:r>
           </w:p>
         </w:tc>
@@ -511,45 +512,6 @@
       </w:r>
       <w:r>
         <w:t xml:space="preserve">open or save the workbook in LibreOffice, Google Sheets, Excel for the web, or Excel on a phone or tablet. Saving it there can remove the Power Query connections.</w:t>
-      </w:r>
-    </w:p>
-    <w:p>
-      <w:pPr>
-        <w:numPr>
-          <w:ilvl w:val="0"/>
-          <w:numId w:val="1001"/>
-        </w:numPr>
-        <w:pStyle w:val="Compact"/>
-      </w:pPr>
-      <w:r>
-        <w:t xml:space="preserve">Check the file first: its SHA-256 is in</w:t>
-      </w:r>
-      <w:r>
-        <w:t xml:space="preserve"> </w:t>
-      </w:r>
-      <w:r>
-        <w:rPr>
-          <w:rStyle w:val="VerbatimChar"/>
-        </w:rPr>
-        <w:t xml:space="preserve">README_FIRST.txt</w:t>
-      </w:r>
-      <w:r>
-        <w:t xml:space="preserve"> </w:t>
-      </w:r>
-      <w:r>
-        <w:t xml:space="preserve">(PowerShell:</w:t>
-      </w:r>
-      <w:r>
-        <w:t xml:space="preserve"> </w:t>
-      </w:r>
-      <w:r>
-        <w:rPr>
-          <w:rStyle w:val="VerbatimChar"/>
-        </w:rPr>
-        <w:t xml:space="preserve">Get-FileHash &lt;file&gt;</w:t>
-      </w:r>
-      <w:r>
-        <w:t xml:space="preserve">).</w:t>
       </w:r>
     </w:p>
     <w:p>

</xml_diff>

<commit_message>
Release zip without workbook; record decisions (future Actual blank, tDCS OT/RA rectified, width item closed) (#18)
- release/CashFlow_v0.9_package.zip: no workbook for now; current modules
  (row-5 selector), docs, tests and handovers; new README_FIRST.
- Spec 14.2 / PROJECT_REFERENCE 7: keep future Actual/Variance blank
  (reconfirmed 12 Oct). Incident: tDCS OT vs RA rectified in the source.
- Install guide md/docx, build log, handover, index and CLAUDE.md updated.


Claude-Session: https://claude.ai/code/session_017h8ADiUSHW7ex1hhB7iQGv

Co-authored-by: Claude <noreply@anthropic.com>
</commit_message>
<xml_diff>
--- a/docs/v0.9_Install_and_User_Guide.docx
+++ b/docs/v0.9_Install_and_User_Guide.docx
@@ -130,9 +130,10 @@
             </w:pPr>
             <w:r>
               <w:rPr>
-                <w:rStyle w:val="VerbatimChar"/>
+                <w:iCs/>
+                <w:i/>
               </w:rPr>
-              <w:t xml:space="preserve">Clinical_Research_Cash_Flow_SharePoint_PQ_Ready_v0.9_working.xlsm</w:t>
+              <w:t xml:space="preserve">(no workbook for now)</w:t>
             </w:r>
           </w:p>
         </w:tc>
@@ -144,7 +145,7 @@
               <w:jc w:val="left"/>
             </w:pPr>
             <w:r>
-              <w:t xml:space="preserve">The v0.9 workbook. The sheets and tables are ready; the macros still need importing (section 3).</w:t>
+              <w:t xml:space="preserve">The package no longer includes a workbook (12 Oct 2026). Import the modules below into your own v0.9_working copy, the one with the selector in row 5. Steps 2–8 of section 3 still apply.</w:t>
             </w:r>
           </w:p>
         </w:tc>
@@ -353,7 +354,7 @@
               <w:jc w:val="left"/>
             </w:pPr>
             <w:r>
-              <w:t xml:space="preserve">The approved design (v1.0.2).</w:t>
+              <w:t xml:space="preserve">The approved design (v1.0.7).</w:t>
             </w:r>
           </w:p>
         </w:tc>
@@ -511,45 +512,6 @@
       </w:r>
       <w:r>
         <w:t xml:space="preserve">open or save the workbook in LibreOffice, Google Sheets, Excel for the web, or Excel on a phone or tablet. Saving it there can remove the Power Query connections.</w:t>
-      </w:r>
-    </w:p>
-    <w:p>
-      <w:pPr>
-        <w:numPr>
-          <w:ilvl w:val="0"/>
-          <w:numId w:val="1001"/>
-        </w:numPr>
-        <w:pStyle w:val="Compact"/>
-      </w:pPr>
-      <w:r>
-        <w:t xml:space="preserve">Check the file first: its SHA-256 is in</w:t>
-      </w:r>
-      <w:r>
-        <w:t xml:space="preserve"> </w:t>
-      </w:r>
-      <w:r>
-        <w:rPr>
-          <w:rStyle w:val="VerbatimChar"/>
-        </w:rPr>
-        <w:t xml:space="preserve">README_FIRST.txt</w:t>
-      </w:r>
-      <w:r>
-        <w:t xml:space="preserve"> </w:t>
-      </w:r>
-      <w:r>
-        <w:t xml:space="preserve">(PowerShell:</w:t>
-      </w:r>
-      <w:r>
-        <w:t xml:space="preserve"> </w:t>
-      </w:r>
-      <w:r>
-        <w:rPr>
-          <w:rStyle w:val="VerbatimChar"/>
-        </w:rPr>
-        <w:t xml:space="preserve">Get-FileHash &lt;file&gt;</w:t>
-      </w:r>
-      <w:r>
-        <w:t xml:space="preserve">).</w:t>
       </w:r>
     </w:p>
     <w:p>

</xml_diff>